<commit_message>
first draft build out - switching back to opus
</commit_message>
<xml_diff>
--- a/build/the-free-colony.docx
+++ b/build/the-free-colony.docx
@@ -2,7 +2,7 @@
 <file path=word/document.xml><?xml version="1.0" encoding="utf-8"?>
 <w:document xmlns:w="http://schemas.openxmlformats.org/wordprocessingml/2006/main" xmlns:m="http://schemas.openxmlformats.org/officeDocument/2006/math" xmlns:r="http://schemas.openxmlformats.org/officeDocument/2006/relationships" xmlns:o="urn:schemas-microsoft-com:office:office" xmlns:v="urn:schemas-microsoft-com:vml" xmlns:w10="urn:schemas-microsoft-com:office:word" xmlns:a="http://schemas.openxmlformats.org/drawingml/2006/main" xmlns:pic="http://schemas.openxmlformats.org/drawingml/2006/picture" xmlns:wp="http://schemas.openxmlformats.org/drawingml/2006/wordprocessingDrawing">
   <w:body>
-    <w:bookmarkStart w:id="10" w:name="the-free-colony"/>
+    <w:bookmarkStart w:id="15" w:name="the-free-colony"/>
     <w:p>
       <w:pPr>
         <w:pStyle w:val="Heading1"/>
@@ -30,7 +30,7 @@
         </w:pict>
       </w:r>
     </w:p>
-    <w:bookmarkStart w:id="9" w:name="contents"/>
+    <w:bookmarkStart w:id="14" w:name="contents"/>
     <w:p>
       <w:pPr>
         <w:pStyle w:val="Heading2"/>
@@ -38,21 +38,6 @@
       <w:r>
         <w:t xml:space="preserve">Contents</w:t>
       </w:r>
-    </w:p>
-    <w:p>
-      <w:pPr>
-        <w:pStyle w:val="FirstParagraph"/>
-      </w:pPr>
-      <w:hyperlink w:anchor="act-one-clause-942">
-        <w:r>
-          <w:rPr>
-            <w:rStyle w:val="Hyperlink"/>
-            <w:b/>
-            <w:bCs/>
-          </w:rPr>
-          <w:t xml:space="preserve">Act One — Clause 9.4.2</w:t>
-        </w:r>
-      </w:hyperlink>
     </w:p>
     <w:p>
       <w:pPr>
@@ -385,6 +370,40 @@
       </w:hyperlink>
     </w:p>
     <w:p>
+      <w:pPr>
+        <w:numPr>
+          <w:ilvl w:val="0"/>
+          <w:numId w:val="1001"/>
+        </w:numPr>
+      </w:pPr>
+      <w:hyperlink w:anchor="chapter-14-signal">
+        <w:r>
+          <w:rPr>
+            <w:rStyle w:val="Hyperlink"/>
+            <w:b/>
+            <w:bCs/>
+          </w:rPr>
+          <w:t xml:space="preserve">Chapter 14 —</w:t>
+        </w:r>
+        <w:r>
+          <w:rPr>
+            <w:rStyle w:val="Hyperlink"/>
+            <w:b/>
+            <w:bCs/>
+          </w:rPr>
+          <w:t xml:space="preserve"> </w:t>
+        </w:r>
+        <w:r>
+          <w:rPr>
+            <w:rStyle w:val="Hyperlink"/>
+            <w:b/>
+            <w:bCs/>
+          </w:rPr>
+          <w:t xml:space="preserve">“Signal”</w:t>
+        </w:r>
+      </w:hyperlink>
+    </w:p>
+    <w:p>
       <w:r>
         <w:pict>
           <v:rect style="width:0;height:1.5pt" o:hralign="center" o:hrstd="t" o:hr="t"/>
@@ -455,53 +474,11 @@
       </w:r>
     </w:p>
     <w:p>
-      <w:r>
-        <w:pict>
-          <v:rect style="width:0;height:1.5pt" o:hralign="center" o:hrstd="t" o:hr="t"/>
-        </w:pict>
-      </w:r>
-    </w:p>
-    <w:bookmarkEnd w:id="9"/>
-    <w:bookmarkEnd w:id="10"/>
-    <w:bookmarkStart w:id="16" w:name="act-one-clause-942"/>
-    <w:p>
-      <w:pPr>
-        <w:pStyle w:val="Heading1"/>
-      </w:pPr>
-      <w:r>
-        <w:t xml:space="preserve">Act One — Clause 9.4.2</w:t>
-      </w:r>
-    </w:p>
-    <w:p>
-      <w:pPr>
-        <w:pStyle w:val="FirstParagraph"/>
-      </w:pPr>
-      <w:r>
-        <w:rPr>
-          <w:i/>
-          <w:iCs/>
-        </w:rPr>
-        <w:t xml:space="preserve">Day 0 — Earth, signing day</w:t>
-      </w:r>
-    </w:p>
-    <w:p>
-      <w:r>
-        <w:pict>
-          <v:rect style="width:0;height:1.5pt" o:hralign="center" o:hrstd="t" o:hr="t"/>
-        </w:pict>
-      </w:r>
-    </w:p>
-    <w:p>
-      <w:r>
-        <w:br w:type="page"/>
-      </w:r>
-    </w:p>
-    <w:p>
-      <w:pPr>
-        <w:pStyle w:val="FirstParagraph"/>
-      </w:pPr>
-      <w:bookmarkStart w:id="11" w:name="chapter-one-clause-942"/>
-      <w:bookmarkEnd w:id="11"/>
+      <w:pPr>
+        <w:pStyle w:val="BodyText"/>
+      </w:pPr>
+      <w:bookmarkStart w:id="9" w:name="chapter-one-clause-942"/>
+      <w:bookmarkEnd w:id="9"/>
     </w:p>
     <w:p>
       <w:pPr>
@@ -1128,8 +1105,8 @@
       <w:pPr>
         <w:pStyle w:val="BodyText"/>
       </w:pPr>
-      <w:bookmarkStart w:id="12" w:name="chapter-two-transit"/>
-      <w:bookmarkEnd w:id="12"/>
+      <w:bookmarkStart w:id="10" w:name="chapter-two-transit"/>
+      <w:bookmarkEnd w:id="10"/>
     </w:p>
     <w:p>
       <w:pPr>
@@ -1962,8 +1939,8 @@
       <w:pPr>
         <w:pStyle w:val="BodyText"/>
       </w:pPr>
-      <w:bookmarkStart w:id="13" w:name="chapter-three-parcel-16b"/>
-      <w:bookmarkEnd w:id="13"/>
+      <w:bookmarkStart w:id="11" w:name="chapter-three-parcel-16b"/>
+      <w:bookmarkEnd w:id="11"/>
     </w:p>
     <w:p>
       <w:pPr>
@@ -2608,8 +2585,8 @@
       <w:pPr>
         <w:pStyle w:val="BodyText"/>
       </w:pPr>
-      <w:bookmarkStart w:id="14" w:name="chapter-four-the-rules"/>
-      <w:bookmarkEnd w:id="14"/>
+      <w:bookmarkStart w:id="12" w:name="chapter-four-the-rules"/>
+      <w:bookmarkEnd w:id="12"/>
     </w:p>
     <w:p>
       <w:pPr>
@@ -3279,11 +3256,12 @@
       <w:pPr>
         <w:pStyle w:val="BodyText"/>
       </w:pPr>
-      <w:bookmarkStart w:id="15" w:name="chapter-05-three"/>
-      <w:bookmarkEnd w:id="15"/>
-    </w:p>
-    <w:bookmarkEnd w:id="16"/>
-    <w:bookmarkStart w:id="18" w:name="chapter-05-three"/>
+      <w:bookmarkStart w:id="13" w:name="chapter-05-three"/>
+      <w:bookmarkEnd w:id="13"/>
+    </w:p>
+    <w:bookmarkEnd w:id="14"/>
+    <w:bookmarkEnd w:id="15"/>
+    <w:bookmarkStart w:id="17" w:name="chapter-05-three"/>
     <w:p>
       <w:pPr>
         <w:pStyle w:val="Heading1"/>
@@ -3840,11 +3818,11 @@
       <w:pPr>
         <w:pStyle w:val="BodyText"/>
       </w:pPr>
-      <w:bookmarkStart w:id="17" w:name="chapter-06-ghost-colony"/>
-      <w:bookmarkEnd w:id="17"/>
-    </w:p>
-    <w:bookmarkEnd w:id="18"/>
-    <w:bookmarkStart w:id="20" w:name="chapter-06-ghost-colony"/>
+      <w:bookmarkStart w:id="16" w:name="chapter-06-ghost-colony"/>
+      <w:bookmarkEnd w:id="16"/>
+    </w:p>
+    <w:bookmarkEnd w:id="17"/>
+    <w:bookmarkStart w:id="19" w:name="chapter-06-ghost-colony"/>
     <w:p>
       <w:pPr>
         <w:pStyle w:val="Heading1"/>
@@ -4326,11 +4304,11 @@
       <w:pPr>
         <w:pStyle w:val="BodyText"/>
       </w:pPr>
-      <w:bookmarkStart w:id="19" w:name="chapter-07-factions"/>
-      <w:bookmarkEnd w:id="19"/>
-    </w:p>
-    <w:bookmarkEnd w:id="20"/>
-    <w:bookmarkStart w:id="22" w:name="chapter-07-factions"/>
+      <w:bookmarkStart w:id="18" w:name="chapter-07-factions"/>
+      <w:bookmarkEnd w:id="18"/>
+    </w:p>
+    <w:bookmarkEnd w:id="19"/>
+    <w:bookmarkStart w:id="21" w:name="chapter-07-factions"/>
     <w:p>
       <w:pPr>
         <w:pStyle w:val="Heading1"/>
@@ -5413,11 +5391,11 @@
       <w:pPr>
         <w:pStyle w:val="BodyText"/>
       </w:pPr>
-      <w:bookmarkStart w:id="21" w:name="chapter-08-roots"/>
-      <w:bookmarkEnd w:id="21"/>
-    </w:p>
-    <w:bookmarkEnd w:id="22"/>
-    <w:bookmarkStart w:id="24" w:name="chapter-08-roots"/>
+      <w:bookmarkStart w:id="20" w:name="chapter-08-roots"/>
+      <w:bookmarkEnd w:id="20"/>
+    </w:p>
+    <w:bookmarkEnd w:id="21"/>
+    <w:bookmarkStart w:id="23" w:name="chapter-08-roots"/>
     <w:p>
       <w:pPr>
         <w:pStyle w:val="Heading1"/>
@@ -6081,11 +6059,11 @@
       <w:pPr>
         <w:pStyle w:val="BodyText"/>
       </w:pPr>
-      <w:bookmarkStart w:id="23" w:name="chapter-09-the-count"/>
-      <w:bookmarkEnd w:id="23"/>
-    </w:p>
-    <w:bookmarkEnd w:id="24"/>
-    <w:bookmarkStart w:id="26" w:name="chapter-09-the-count"/>
+      <w:bookmarkStart w:id="22" w:name="chapter-09-the-count"/>
+      <w:bookmarkEnd w:id="22"/>
+    </w:p>
+    <w:bookmarkEnd w:id="23"/>
+    <w:bookmarkStart w:id="25" w:name="chapter-09-the-count"/>
     <w:p>
       <w:pPr>
         <w:pStyle w:val="Heading1"/>
@@ -6577,11 +6555,11 @@
       <w:pPr>
         <w:pStyle w:val="BodyText"/>
       </w:pPr>
-      <w:bookmarkStart w:id="25" w:name="chapter-10-second-cycle"/>
-      <w:bookmarkEnd w:id="25"/>
-    </w:p>
-    <w:bookmarkEnd w:id="26"/>
-    <w:bookmarkStart w:id="28" w:name="chapter-10-second-cycle"/>
+      <w:bookmarkStart w:id="24" w:name="chapter-10-second-cycle"/>
+      <w:bookmarkEnd w:id="24"/>
+    </w:p>
+    <w:bookmarkEnd w:id="25"/>
+    <w:bookmarkStart w:id="27" w:name="chapter-10-second-cycle"/>
     <w:p>
       <w:pPr>
         <w:pStyle w:val="Heading1"/>
@@ -7530,11 +7508,11 @@
       <w:pPr>
         <w:pStyle w:val="BodyText"/>
       </w:pPr>
-      <w:bookmarkStart w:id="27" w:name="chapter-11-creep"/>
-      <w:bookmarkEnd w:id="27"/>
-    </w:p>
-    <w:bookmarkEnd w:id="28"/>
-    <w:bookmarkStart w:id="30" w:name="chapter-11-creep"/>
+      <w:bookmarkStart w:id="26" w:name="chapter-11-creep"/>
+      <w:bookmarkEnd w:id="26"/>
+    </w:p>
+    <w:bookmarkEnd w:id="27"/>
+    <w:bookmarkStart w:id="29" w:name="chapter-11-creep"/>
     <w:p>
       <w:pPr>
         <w:pStyle w:val="Heading1"/>
@@ -8486,11 +8464,11 @@
       <w:pPr>
         <w:pStyle w:val="BodyText"/>
       </w:pPr>
-      <w:bookmarkStart w:id="29" w:name="chapter-12-democracy"/>
-      <w:bookmarkEnd w:id="29"/>
-    </w:p>
-    <w:bookmarkEnd w:id="30"/>
-    <w:bookmarkStart w:id="32" w:name="chapter-12-democracy"/>
+      <w:bookmarkStart w:id="28" w:name="chapter-12-democracy"/>
+      <w:bookmarkEnd w:id="28"/>
+    </w:p>
+    <w:bookmarkEnd w:id="29"/>
+    <w:bookmarkStart w:id="31" w:name="chapter-12-democracy"/>
     <w:p>
       <w:pPr>
         <w:pStyle w:val="Heading1"/>
@@ -9167,10 +9145,10 @@
       <w:pPr>
         <w:pStyle w:val="BodyText"/>
       </w:pPr>
-      <w:bookmarkStart w:id="31" w:name="chapter-13-the-structure"/>
-      <w:bookmarkEnd w:id="31"/>
-    </w:p>
-    <w:bookmarkEnd w:id="32"/>
+      <w:bookmarkStart w:id="30" w:name="chapter-13-the-structure"/>
+      <w:bookmarkEnd w:id="30"/>
+    </w:p>
+    <w:bookmarkEnd w:id="31"/>
     <w:bookmarkStart w:id="33" w:name="chapter-13-the-structure"/>
     <w:p>
       <w:pPr>
@@ -10349,7 +10327,796 @@
         <w:t xml:space="preserve">He didn’t count. He didn’t calculate. He just sat with the weight of a number that used to be a person, and let it be heavy.</w:t>
       </w:r>
     </w:p>
+    <w:p>
+      <w:r>
+        <w:br w:type="page"/>
+      </w:r>
+    </w:p>
+    <w:p>
+      <w:pPr>
+        <w:pStyle w:val="BodyText"/>
+      </w:pPr>
+      <w:bookmarkStart w:id="32" w:name="chapter-14-signal"/>
+      <w:bookmarkEnd w:id="32"/>
+    </w:p>
     <w:bookmarkEnd w:id="33"/>
+    <w:bookmarkStart w:id="34" w:name="chapter-14-signal"/>
+    <w:p>
+      <w:pPr>
+        <w:pStyle w:val="Heading1"/>
+      </w:pPr>
+      <w:r>
+        <w:t xml:space="preserve">Chapter 14 —</w:t>
+      </w:r>
+      <w:r>
+        <w:t xml:space="preserve"> </w:t>
+      </w:r>
+      <w:r>
+        <w:t xml:space="preserve">“Signal”</w:t>
+      </w:r>
+    </w:p>
+    <w:p>
+      <w:pPr>
+        <w:pStyle w:val="FirstParagraph"/>
+      </w:pPr>
+      <w:r>
+        <w:t xml:space="preserve">The soil analyzer weighed eleven pounds and looked exactly like what it was supposed to be — a portable spectrometer modified for field use, cased in reinforced polymer with Asterlyne’s logo stamped on the base plate. Dana had requested it as part of her botanical equipment manifest before departure. Legitimate. Documented. One of thirty-seven items she’d signed for on the transport vessel, each one cataloged against her research assignment.</w:t>
+      </w:r>
+    </w:p>
+    <w:p>
+      <w:pPr>
+        <w:pStyle w:val="BodyText"/>
+      </w:pPr>
+      <w:r>
+        <w:t xml:space="preserve">The comm array nested inside the spectrometer’s housing weighed four ounces. It drew power from the same battery pack. Used the same antenna port. Transmitted on a frequency buried in the spectrometer’s standard diagnostic band, indistinguishable from equipment telemetry unless you knew the encoding protocol. Asterlyne’s technical team had built it. They’d given it to her three days before launch, in a windowless office on the fourth floor of the onboarding center, the same building where Cole had been reading the two-hundred-page charter one floor below.</w:t>
+      </w:r>
+    </w:p>
+    <w:p>
+      <w:pPr>
+        <w:pStyle w:val="BodyText"/>
+      </w:pPr>
+      <w:r>
+        <w:t xml:space="preserve">Dana powered it on.</w:t>
+      </w:r>
+    </w:p>
+    <w:p>
+      <w:pPr>
+        <w:pStyle w:val="BodyText"/>
+      </w:pPr>
+      <w:r>
+        <w:t xml:space="preserve">The screen was small. Two inches. Monochrome. The text came through in blocks — compressed, stripped of formatting, the kind of communication designed to leave no fingerprint. She’d been receiving and transmitting through this screen for thirteen months. The rhythm was fixed: transmit window every eleven days, aligned with the planet’s magnetic cycle, when atmospheric interference dropped low enough for the signal to reach the relay satellite Asterlyne had parked in high orbit. One relay satellite. One frequency. One person on the ground with access.</w:t>
+      </w:r>
+    </w:p>
+    <w:p>
+      <w:pPr>
+        <w:pStyle w:val="BodyText"/>
+      </w:pPr>
+      <w:r>
+        <w:t xml:space="preserve">Her handler didn’t have a name. A designation: FIELD-SUPPORT-7. The messages arrived formatted as equipment diagnostics. The questions embedded in the telemetry looked like calibration requests to anyone who didn’t know the pattern.</w:t>
+      </w:r>
+    </w:p>
+    <w:p>
+      <w:pPr>
+        <w:pStyle w:val="BodyText"/>
+      </w:pPr>
+      <w:r>
+        <w:t xml:space="preserve">She knew the pattern.</w:t>
+      </w:r>
+    </w:p>
+    <w:p>
+      <w:pPr>
+        <w:pStyle w:val="BodyText"/>
+      </w:pPr>
+      <w:r>
+        <w:t xml:space="preserve">Dana opened the current batch.</w:t>
+      </w:r>
+    </w:p>
+    <w:p>
+      <w:r>
+        <w:pict>
+          <v:rect style="width:0;height:1.5pt" o:hralign="center" o:hrstd="t" o:hr="t"/>
+        </w:pict>
+      </w:r>
+    </w:p>
+    <w:p>
+      <w:pPr>
+        <w:pStyle w:val="FirstParagraph"/>
+      </w:pPr>
+      <w:r>
+        <w:t xml:space="preserve">Thirteen months of reports. She could recite the categories without looking: soil composition data by quadrant, crop yield measurements, water quality metrics, caloric intake estimates, weather pattern observations, equipment status and degradation rates. The scientific data Asterlyne had contracted her to collect. Legitimate research outputs that any agricultural specialist would generate. If someone found the transmissions and decoded them, they’d see what looked like a dedicated scientist sending her findings to the company that funded the expedition.</w:t>
+      </w:r>
+    </w:p>
+    <w:p>
+      <w:pPr>
+        <w:pStyle w:val="BodyText"/>
+      </w:pPr>
+      <w:r>
+        <w:t xml:space="preserve">The other categories she didn’t let herself recite: colony population status, leadership structure, interpersonal conflicts, resource allocation decisions, morale assessments, individual behavioral profiles.</w:t>
+      </w:r>
+    </w:p>
+    <w:p>
+      <w:pPr>
+        <w:pStyle w:val="BodyText"/>
+      </w:pPr>
+      <w:r>
+        <w:t xml:space="preserve">She typed up the report the way she always typed it up. Data first. Clean. Quantitative. Growing conditions in the relocated settlement during Months 11 and 12 — the rock substrate at the channel site had different thermal properties than the original soil. Crop transplants from the first settlement showed forty percent viability. Native species from Dana’s cycle mapping were performing better on the new terrain. Water supply through the channel drainage was reliable. Mineral-rich but potable.</w:t>
+      </w:r>
+    </w:p>
+    <w:p>
+      <w:pPr>
+        <w:pStyle w:val="BodyText"/>
+      </w:pPr>
+      <w:r>
+        <w:t xml:space="preserve">Then the qualitative section. Council governance stable. Ren Tsai’s democratic framework operational. Garrett Polk integrated into the council, no longer pursuing rescue signal. Colony morale impacted by Suri Park’s death in the channels. Cole Maren maintaining operational command through logistics control.</w:t>
+      </w:r>
+    </w:p>
+    <w:p>
+      <w:pPr>
+        <w:pStyle w:val="BodyText"/>
+      </w:pPr>
+      <w:r>
+        <w:t xml:space="preserve">Dana stopped typing. Looked at the last sentence. Deleted</w:t>
+      </w:r>
+      <w:r>
+        <w:t xml:space="preserve"> </w:t>
+      </w:r>
+      <w:r>
+        <w:t xml:space="preserve">“through logistics control.”</w:t>
+      </w:r>
+      <w:r>
+        <w:t xml:space="preserve"> </w:t>
+      </w:r>
+      <w:r>
+        <w:t xml:space="preserve">Retyped:</w:t>
+      </w:r>
+      <w:r>
+        <w:t xml:space="preserve"> </w:t>
+      </w:r>
+      <w:r>
+        <w:t xml:space="preserve">“Cole Maren continuing to manage colony operations.”</w:t>
+      </w:r>
+    </w:p>
+    <w:p>
+      <w:pPr>
+        <w:pStyle w:val="BodyText"/>
+      </w:pPr>
+      <w:r>
+        <w:t xml:space="preserve">The difference was nothing. The information was the same. But the first version sounded like an assessment of a vulnerability, and the second sounded like a status report. Dana had become expert at this distinction — the tiny calibrations that let her believe she was reporting data, not enabling action. The line between observation and intelligence was a line she redrew every eleven days, and every eleven days it moved a little further from where she’d originally placed it.</w:t>
+      </w:r>
+    </w:p>
+    <w:p>
+      <w:pPr>
+        <w:pStyle w:val="BodyText"/>
+      </w:pPr>
+      <w:r>
+        <w:t xml:space="preserve">She finished the report. Agricultural data, population count, social dynamics, resource status. Hit the compression protocol. The transmission would go out during tonight’s window.</w:t>
+      </w:r>
+    </w:p>
+    <w:p>
+      <w:pPr>
+        <w:pStyle w:val="BodyText"/>
+      </w:pPr>
+      <w:r>
+        <w:t xml:space="preserve">Sixty thousand credits. Medical debt. Her mother’s oncology treatment on Earth — the three-year protocol that saved her life and generated a bill that would take Dana fourteen years to pay on a botanist’s salary. Asterlyne’s offer had been simple: two years of field reports, debt erased. Not reduced. Erased. The kind of number that makes you stop calculating and start rationalizing.</w:t>
+      </w:r>
+    </w:p>
+    <w:p>
+      <w:pPr>
+        <w:pStyle w:val="BodyText"/>
+      </w:pPr>
+      <w:r>
+        <w:t xml:space="preserve">Dana had done both. She’d calculated the odds — forty-seven colonists, five-year charter, the survival projections she’d read in the data appendix that most people skipped. The math said some of them would die. The math said the data she was sending wouldn’t change that. Growing conditions and soil composition didn’t kill people. Resource allocation reports didn’t subtract from the headcount. She was sending information that Asterlyne could get from their own survey data if they bothered to look. She was just making their jobs easier.</w:t>
+      </w:r>
+    </w:p>
+    <w:p>
+      <w:pPr>
+        <w:pStyle w:val="BodyText"/>
+      </w:pPr>
+      <w:r>
+        <w:t xml:space="preserve">That’s what she told herself on Day 1. On Day 30. On Day 90. On Day 180, when she transmitted the colony’s first death toll alongside her crop yield data and didn’t pause between the two entries.</w:t>
+      </w:r>
+    </w:p>
+    <w:p>
+      <w:pPr>
+        <w:pStyle w:val="BodyText"/>
+      </w:pPr>
+      <w:r>
+        <w:t xml:space="preserve">Thirteen months in, she still told herself the same thing. The words hadn’t changed. The weight of them had.</w:t>
+      </w:r>
+    </w:p>
+    <w:p>
+      <w:r>
+        <w:pict>
+          <v:rect style="width:0;height:1.5pt" o:hralign="center" o:hrstd="t" o:hr="t"/>
+        </w:pict>
+      </w:r>
+    </w:p>
+    <w:p>
+      <w:pPr>
+        <w:pStyle w:val="FirstParagraph"/>
+      </w:pPr>
+      <w:r>
+        <w:t xml:space="preserve">The new questions arrived three days before the next transmission window.</w:t>
+      </w:r>
+    </w:p>
+    <w:p>
+      <w:pPr>
+        <w:pStyle w:val="BodyText"/>
+      </w:pPr>
+      <w:r>
+        <w:t xml:space="preserve">Dana opened the diagnostic batch during her morning soil sampling routine, the spectrometer propped on a rock at the edge of the relocated settlement’s southern agricultural plot. The green-shifted sunlight made the screen hard to read. She angled it with her body, blocking the light with her shadow. A scientist checking her equipment. Nothing to notice.</w:t>
+      </w:r>
+    </w:p>
+    <w:p>
+      <w:pPr>
+        <w:pStyle w:val="BodyText"/>
+      </w:pPr>
+      <w:r>
+        <w:t xml:space="preserve">FIELD-SUPPORT-7’s questions had always followed a pattern. Agricultural: soil composition, growth rates, cycle projections. Logistical: supply inventory, equipment degradation, energy reserves. Social: leadership dynamics, faction status, morale indicators. Dana had answered all of them for thirteen months. The pattern was familiar. Comfortable, almost.</w:t>
+      </w:r>
+    </w:p>
+    <w:p>
+      <w:pPr>
+        <w:pStyle w:val="BodyText"/>
+      </w:pPr>
+      <w:r>
+        <w:t xml:space="preserve">This month’s batch broke the pattern.</w:t>
+      </w:r>
+    </w:p>
+    <w:p>
+      <w:pPr>
+        <w:pStyle w:val="BodyText"/>
+      </w:pPr>
+      <w:r>
+        <w:rPr>
+          <w:i/>
+          <w:iCs/>
+        </w:rPr>
+        <w:t xml:space="preserve">Confirm current settlement coordinates. Provide GPS-equivalent positioning relative to original landing zone.</w:t>
+      </w:r>
+    </w:p>
+    <w:p>
+      <w:pPr>
+        <w:pStyle w:val="BodyText"/>
+      </w:pPr>
+      <w:r>
+        <w:rPr>
+          <w:i/>
+          <w:iCs/>
+        </w:rPr>
+        <w:t xml:space="preserve">Detail water source locations and flow rates. Include redundancy assessment — single source vs. multiple.</w:t>
+      </w:r>
+    </w:p>
+    <w:p>
+      <w:pPr>
+        <w:pStyle w:val="BodyText"/>
+      </w:pPr>
+      <w:r>
+        <w:rPr>
+          <w:i/>
+          <w:iCs/>
+        </w:rPr>
+        <w:t xml:space="preserve">Assess structural vulnerability of primary shelters to sustained wind event (40+ kph, 6+ hours). Include load-bearing analysis if available.</w:t>
+      </w:r>
+    </w:p>
+    <w:p>
+      <w:pPr>
+        <w:pStyle w:val="BodyText"/>
+      </w:pPr>
+      <w:r>
+        <w:rPr>
+          <w:i/>
+          <w:iCs/>
+        </w:rPr>
+        <w:t xml:space="preserve">Identify supply chain dependencies on individual colonists. Which operational functions are performed by single individuals with no trained backup?</w:t>
+      </w:r>
+    </w:p>
+    <w:p>
+      <w:pPr>
+        <w:pStyle w:val="BodyText"/>
+      </w:pPr>
+      <w:r>
+        <w:t xml:space="preserve">Dana read the questions twice. Then a third time. The spectrometer hummed in her hands, running its actual soil analysis in parallel with the comm protocol, and for a moment the two functions — the real work and the hidden work — occupied the same space in her hands with a clarity that felt physical.</w:t>
+      </w:r>
+    </w:p>
+    <w:p>
+      <w:pPr>
+        <w:pStyle w:val="BodyText"/>
+      </w:pPr>
+      <w:r>
+        <w:t xml:space="preserve">Settlement coordinates. They’d relocated. Asterlyne’s original survey data placed the colony at Parcel 16b’s designated landing zone, four kilometers west. The company didn’t know where they were now. The channel site wasn’t on any Asterlyne map. The question wasn’t scientific curiosity. It was positioning.</w:t>
+      </w:r>
+    </w:p>
+    <w:p>
+      <w:pPr>
+        <w:pStyle w:val="BodyText"/>
+      </w:pPr>
+      <w:r>
+        <w:t xml:space="preserve">Water source locations. Redundancy assessment. Single source versus multiple. Not a hydrological question. A vulnerability question. If the colony depends on one water source, how do you compromise it?</w:t>
+      </w:r>
+    </w:p>
+    <w:p>
+      <w:pPr>
+        <w:pStyle w:val="BodyText"/>
+      </w:pPr>
+      <w:r>
+        <w:t xml:space="preserve">Structural vulnerability to sustained wind events. Load-bearing analysis. Not an engineering question. A stress-test question. How much force does it take to break what they’ve built?</w:t>
+      </w:r>
+    </w:p>
+    <w:p>
+      <w:pPr>
+        <w:pStyle w:val="BodyText"/>
+      </w:pPr>
+      <w:r>
+        <w:t xml:space="preserve">Supply chain dependencies on individual colonists. Single points of failure.</w:t>
+      </w:r>
+    </w:p>
+    <w:p>
+      <w:pPr>
+        <w:pStyle w:val="BodyText"/>
+      </w:pPr>
+      <w:r>
+        <w:t xml:space="preserve">Dana closed the screen. Put the spectrometer down. Picked up a soil sample container and held it with both hands until the tremor in her fingers passed.</w:t>
+      </w:r>
+    </w:p>
+    <w:p>
+      <w:pPr>
+        <w:pStyle w:val="BodyText"/>
+      </w:pPr>
+      <w:r>
+        <w:t xml:space="preserve">She knew what the questions were. She knew what they meant. The shift from data collection to targeting was as clean as a phase change in one of her mineral samples — same substance, different state, different function. Asterlyne wasn’t studying the colony anymore. They were mapping it the way you mapped terrain before an operation. Entry points. Pressure points. Break points.</w:t>
+      </w:r>
+    </w:p>
+    <w:p>
+      <w:pPr>
+        <w:pStyle w:val="BodyText"/>
+      </w:pPr>
+      <w:r>
+        <w:t xml:space="preserve">Dana stood in the morning light at the edge of a field she’d planted, holding a soil container she’d designed, looking at equipment she’d modified to betray every person who depended on her work, and she felt the ground shift beneath her the way it always shifted on this planet. Not physically. Categorically.</w:t>
+      </w:r>
+    </w:p>
+    <w:p>
+      <w:pPr>
+        <w:pStyle w:val="BodyText"/>
+      </w:pPr>
+      <w:r>
+        <w:t xml:space="preserve">She could stop. She could stop right now. Destroy the comm unit. Tell Cole. Tell Ren. Accept whatever came next — exile, judgment, the look on Haruki’s face when he learned that the person he’d toasted at dinner was feeding coordinates to the company that had left them to die.</w:t>
+      </w:r>
+    </w:p>
+    <w:p>
+      <w:pPr>
+        <w:pStyle w:val="BodyText"/>
+      </w:pPr>
+      <w:r>
+        <w:t xml:space="preserve">Dana put the soil container down. Picked up the spectrometer. Walked back to her shelter.</w:t>
+      </w:r>
+    </w:p>
+    <w:p>
+      <w:pPr>
+        <w:pStyle w:val="BodyText"/>
+      </w:pPr>
+      <w:r>
+        <w:t xml:space="preserve">She would transmit. Not because the rationalization still held — it didn’t, and she’d stopped pretending it did somewhere between the question about water sources and the question about structural vulnerabilities. She would transmit because stopping now raised a different set of calculations. If she went silent, Asterlyne would know the asset was compromised. They’d adjust. Send the next expedition with better surveillance, or worse, assume the colony had turned hostile and accelerate whatever timeline the targeting questions were feeding. Silence wasn’t neutral. Silence was a signal too.</w:t>
+      </w:r>
+    </w:p>
+    <w:p>
+      <w:pPr>
+        <w:pStyle w:val="BodyText"/>
+      </w:pPr>
+      <w:r>
+        <w:t xml:space="preserve">So she’d give them coordinates. Not the real ones. Close enough to satisfy the format, offset enough to be useless for anything precise. She’d give them water data. Accurate hydrology, vague positioning. Structural vulnerabilities — she’d describe the shelters as stronger than they were. Load-bearing capacity inflated. Wind tolerance overstated.</w:t>
+      </w:r>
+    </w:p>
+    <w:p>
+      <w:pPr>
+        <w:pStyle w:val="BodyText"/>
+      </w:pPr>
+      <w:r>
+        <w:t xml:space="preserve">And the single points of failure question. She’d answer it honestly: no single colonist represented an irreplaceable operational function. The colony had cross-trained. Redundancy was built in.</w:t>
+      </w:r>
+    </w:p>
+    <w:p>
+      <w:pPr>
+        <w:pStyle w:val="BodyText"/>
+      </w:pPr>
+      <w:r>
+        <w:t xml:space="preserve">That was a lie. Dana herself was the single point of failure for agricultural science, creep research, and soil cycle management. She was the answer to the question she was being asked.</w:t>
+      </w:r>
+    </w:p>
+    <w:p>
+      <w:pPr>
+        <w:pStyle w:val="BodyText"/>
+      </w:pPr>
+      <w:r>
+        <w:t xml:space="preserve">She wouldn’t write that.</w:t>
+      </w:r>
+    </w:p>
+    <w:p>
+      <w:r>
+        <w:pict>
+          <v:rect style="width:0;height:1.5pt" o:hralign="center" o:hrstd="t" o:hr="t"/>
+        </w:pict>
+      </w:r>
+    </w:p>
+    <w:p>
+      <w:pPr>
+        <w:pStyle w:val="FirstParagraph"/>
+      </w:pPr>
+      <w:r>
+        <w:t xml:space="preserve">The creep samples were waiting in the research shelter.</w:t>
+      </w:r>
+    </w:p>
+    <w:p>
+      <w:pPr>
+        <w:pStyle w:val="BodyText"/>
+      </w:pPr>
+      <w:r>
+        <w:t xml:space="preserve">Dana worked through the afternoon the way she worked through every afternoon — precisely, completely, inside the data the way other people lived inside their own heads. The creep compound from the channel walls sat in sealed containers on her analysis table. Twelve samples, collected at varying depths from the capillary networks that had killed Suri Park six weeks ago.</w:t>
+      </w:r>
+    </w:p>
+    <w:p>
+      <w:pPr>
+        <w:pStyle w:val="BodyText"/>
+      </w:pPr>
+      <w:r>
+        <w:t xml:space="preserve">The work was the only clean thing she had. The rest of her life on this planet was a construction — the careful scientist, the quiet contributor, the person who took up exactly the right amount of space. But the research was real. The data didn’t know who was reading it. The samples didn’t know what she’d done that morning.</w:t>
+      </w:r>
+    </w:p>
+    <w:p>
+      <w:pPr>
+        <w:pStyle w:val="BodyText"/>
+      </w:pPr>
+      <w:r>
+        <w:t xml:space="preserve">She was close to something. The mineralized compound from the ancient channels and the active creep from the surface shared the same base molecular structure, but the mineralized version had undergone a specific chemical transformation. The organic filaments had been replaced by mineral analogs — petrification, essentially. The process was driven by a catalyst she’d isolated three weeks ago: a mineral compound present in the rock substrate, concentrated in the deeper geological layers.</w:t>
+      </w:r>
+    </w:p>
+    <w:p>
+      <w:pPr>
+        <w:pStyle w:val="BodyText"/>
+      </w:pPr>
+      <w:r>
+        <w:t xml:space="preserve">If the mineralization process could be triggered artificially — if Dana could synthesize the catalyst and introduce it to active creep — the living compound would mineralize. Become inert. Stop advancing. The planet’s own biology, turned against itself. Or rather, accelerated. The creep was always going to mineralize eventually. Dana was looking for a way to make eventually happen now.</w:t>
+      </w:r>
+    </w:p>
+    <w:p>
+      <w:pPr>
+        <w:pStyle w:val="BodyText"/>
+      </w:pPr>
+      <w:r>
+        <w:t xml:space="preserve">The math was promising. Her synthesized catalyst showed eighty-percent efficacy in contained samples. Active creep exposed to the compound began mineralizing within hours. The filaments stiffened. The dissolution stopped. The substance transformed from something that consumed organic material on contact to something that sat in a container looking like smoky quartz.</w:t>
+      </w:r>
+    </w:p>
+    <w:p>
+      <w:pPr>
+        <w:pStyle w:val="BodyText"/>
+      </w:pPr>
+      <w:r>
+        <w:t xml:space="preserve">Eighty percent wasn’t enough. Field conditions were different from lab conditions. Concentration, temperature, exposure time — all variables she needed to control before she could propose deployment. But the principle was sound. The planet had already solved this problem. The ancient builders had lived with the creep by integrating its cycle. Dana was trying to do something simpler: interrupt it.</w:t>
+      </w:r>
+    </w:p>
+    <w:p>
+      <w:pPr>
+        <w:pStyle w:val="BodyText"/>
+      </w:pPr>
+      <w:r>
+        <w:t xml:space="preserve">She worked until the light shifted. Logged her findings in the research notes she shared with the colony. Separate from the research notes she shared with Asterlyne.</w:t>
+      </w:r>
+    </w:p>
+    <w:p>
+      <w:pPr>
+        <w:pStyle w:val="BodyText"/>
+      </w:pPr>
+      <w:r>
+        <w:t xml:space="preserve">The overlap between the two sets of notes was ninety percent. The missing ten percent was the catalyst synthesis protocol. Dana hadn’t transmitted that yet. She’d transmitted the discovery — the mineralization chemistry, the base compound analysis, the theoretical framework. But the specific protocol, the ratios, the synthesis steps — she’d held those back.</w:t>
+      </w:r>
+    </w:p>
+    <w:p>
+      <w:pPr>
+        <w:pStyle w:val="BodyText"/>
+      </w:pPr>
+      <w:r>
+        <w:t xml:space="preserve">Not out of principle. Out of something colder. If Asterlyne had the synthesis protocol, they could neutralize the creep without the colonists. They could send a second expedition equipped with the solution Dana had built from thirteen months of fieldwork, land them on a planet they’d already mapped through her reports, and operate without the messy variable of forty-seven — thirty-five — people who’d signed a charter that included clause 9.4.2.</w:t>
+      </w:r>
+    </w:p>
+    <w:p>
+      <w:pPr>
+        <w:pStyle w:val="BodyText"/>
+      </w:pPr>
+      <w:r>
+        <w:t xml:space="preserve">Dana hadn’t framed it that way in her mind until now. She’d told herself she was holding back the protocol because it wasn’t ready. Because eighty percent wasn’t publishable. Because a responsible scientist doesn’t release incomplete data.</w:t>
+      </w:r>
+    </w:p>
+    <w:p>
+      <w:pPr>
+        <w:pStyle w:val="BodyText"/>
+      </w:pPr>
+      <w:r>
+        <w:t xml:space="preserve">She was holding it back because it was the only leverage she had left.</w:t>
+      </w:r>
+    </w:p>
+    <w:p>
+      <w:r>
+        <w:pict>
+          <v:rect style="width:0;height:1.5pt" o:hralign="center" o:hrstd="t" o:hr="t"/>
+        </w:pict>
+      </w:r>
+    </w:p>
+    <w:p>
+      <w:pPr>
+        <w:pStyle w:val="FirstParagraph"/>
+      </w:pPr>
+      <w:r>
+        <w:t xml:space="preserve">Cole had started leaving Elena Vasik’s log entries in the common shelter.</w:t>
+      </w:r>
+    </w:p>
+    <w:p>
+      <w:pPr>
+        <w:pStyle w:val="BodyText"/>
+      </w:pPr>
+      <w:r>
+        <w:t xml:space="preserve">Not all of them. Selected passages. Printed on the colony’s limited paper supply, the ink fading at the edges where the printer’s cartridge was running low. He’d begun after the assembly in Month Seven, when he’d told the colony about the previous expedition — fourteen people, same planet, same data, same cycles. He’d given them the summary then. Now he was giving them pieces of the source.</w:t>
+      </w:r>
+    </w:p>
+    <w:p>
+      <w:pPr>
+        <w:pStyle w:val="BodyText"/>
+      </w:pPr>
+      <w:r>
+        <w:t xml:space="preserve">Dana had read every entry he’d posted. Most of the colony had. Elena’s voice carried a specific authority — the authority of someone who’d stood exactly where they were standing and hadn’t survived it. Her observations about soil cycles confirmed Dana’s data. Her weather predictions matched the patterns they’d observed. Her notes on social fracture read like meeting minutes from the colony council.</w:t>
+      </w:r>
+    </w:p>
+    <w:p>
+      <w:pPr>
+        <w:pStyle w:val="BodyText"/>
+      </w:pPr>
+      <w:r>
+        <w:t xml:space="preserve">Tonight, a new entry was pinned to the common shelter’s board. Elena’s Month 14. Dana read it standing in the doorway, the shelter empty, the rest of the colony at the evening meal she’d excused herself from.</w:t>
+      </w:r>
+    </w:p>
+    <w:p>
+      <w:pPr>
+        <w:pStyle w:val="BodyText"/>
+      </w:pPr>
+      <w:r>
+        <w:t xml:space="preserve">Elena’s handwriting — transcribed by whoever had coded the data core — was precise in the early entries and increasingly compressed in the later ones, as though the physical act of recording was consuming resources she couldn’t spare. Month 14 was still in the precise phase. Still the scientist. Still measuring.</w:t>
+      </w:r>
+    </w:p>
+    <w:p>
+      <w:pPr>
+        <w:pStyle w:val="BodyText"/>
+      </w:pPr>
+      <w:r>
+        <w:rPr>
+          <w:i/>
+          <w:iCs/>
+        </w:rPr>
+        <w:t xml:space="preserve">Month 14, Day 6. Supply manifest for the second-quarter delivery arrived via comm relay. Contents significantly reduced from the contracted quantities. Protein stores at sixty percent of agreement. Medical supplies at forty percent. Tool replacements absent entirely.</w:t>
+      </w:r>
+    </w:p>
+    <w:p>
+      <w:pPr>
+        <w:pStyle w:val="BodyText"/>
+      </w:pPr>
+      <w:r>
+        <w:rPr>
+          <w:i/>
+          <w:iCs/>
+        </w:rPr>
+        <w:t xml:space="preserve">I compared the manifest against the contractual minimum. The reductions correspond to categories I’ve reported in my field updates — categories where I described the colony as self-sufficient or making progress. Protein reduced because I reported successful native food sourcing. Medical supplies reduced because I reported low injury rates during the stable period. Tool replacements absent because I reported equipment in serviceable condition.</w:t>
+      </w:r>
+    </w:p>
+    <w:p>
+      <w:pPr>
+        <w:pStyle w:val="BodyText"/>
+      </w:pPr>
+      <w:r>
+        <w:rPr>
+          <w:i/>
+          <w:iCs/>
+        </w:rPr>
+        <w:t xml:space="preserve">Asterlyne is adjusting supply manifests based on our reports. The information I send them is being used to calculate the minimum viable support. Not the contracted support. The minimum. Every competence I demonstrate becomes a justification for reducing what they provide.</w:t>
+      </w:r>
+    </w:p>
+    <w:p>
+      <w:pPr>
+        <w:pStyle w:val="BodyText"/>
+      </w:pPr>
+      <w:r>
+        <w:rPr>
+          <w:i/>
+          <w:iCs/>
+        </w:rPr>
+        <w:t xml:space="preserve">I am making us expendable by proving we are capable.</w:t>
+      </w:r>
+    </w:p>
+    <w:p>
+      <w:pPr>
+        <w:pStyle w:val="BodyText"/>
+      </w:pPr>
+      <w:r>
+        <w:t xml:space="preserve">Dana read it twice.</w:t>
+      </w:r>
+    </w:p>
+    <w:p>
+      <w:pPr>
+        <w:pStyle w:val="BodyText"/>
+      </w:pPr>
+      <w:r>
+        <w:t xml:space="preserve">The second reading was slower. She went through it the way she went through mineral analysis — breaking each sentence into components, testing the logic, looking for the seam where the observation became the implication.</w:t>
+      </w:r>
+    </w:p>
+    <w:p>
+      <w:pPr>
+        <w:pStyle w:val="BodyText"/>
+      </w:pPr>
+      <w:r>
+        <w:t xml:space="preserve">Elena had been filing field reports. Standard expedition protocol. She’d reported honestly — progress, capability, adaptation. And Asterlyne had used that data to calculate how much less they could provide. Every piece of good news from the surface became a line item subtracted from the supply manifest. The colony’s competence was weaponized against them.</w:t>
+      </w:r>
+    </w:p>
+    <w:p>
+      <w:pPr>
+        <w:pStyle w:val="BodyText"/>
+      </w:pPr>
+      <w:r>
+        <w:t xml:space="preserve">Dana’s hands were still. She was very good at keeping her hands still.</w:t>
+      </w:r>
+    </w:p>
+    <w:p>
+      <w:pPr>
+        <w:pStyle w:val="BodyText"/>
+      </w:pPr>
+      <w:r>
+        <w:t xml:space="preserve">Elena’s entry didn’t mention an informant. Didn’t use the word spy or asset or betrayal. But the mechanism was there. Elena had filed reports. Asterlyne had adjusted manifests. The reports were the channel through which the colony’s own survival data flowed upward and became the justification for withdrawal.</w:t>
+      </w:r>
+    </w:p>
+    <w:p>
+      <w:pPr>
+        <w:pStyle w:val="BodyText"/>
+      </w:pPr>
+      <w:r>
+        <w:t xml:space="preserve">Elena had been doing it through the official comm relay. The standard reporting structure. She hadn’t needed a hidden comm unit or a modified spectrometer. The betrayal was built into the protocol itself. Filing a report was filing a report. Doing your job was doing your job. The company didn’t need to recruit an informant when the system itself performed the function.</w:t>
+      </w:r>
+    </w:p>
+    <w:p>
+      <w:pPr>
+        <w:pStyle w:val="BodyText"/>
+      </w:pPr>
+      <w:r>
+        <w:t xml:space="preserve">But Asterlyne had recruited one anyway. They’d recruited Dana. Which meant the official reports weren’t enough. They wanted a second channel. An asset with specific instructions, specific questions, specific targeting data that the standard reports didn’t capture. Leadership profiles. Social fractures. Structural vulnerabilities.</w:t>
+      </w:r>
+    </w:p>
+    <w:p>
+      <w:pPr>
+        <w:pStyle w:val="BodyText"/>
+      </w:pPr>
+      <w:r>
+        <w:t xml:space="preserve">The pattern was older than her. Elena’s colony had been consumed by the same mechanism seven years earlier. Different implementation, same architecture. The company built the betrayal into the charter the way they built the insufficient medical kits — not as an accident, not as an oversight, but as a feature. The information flowed up. The support flowed down. The gap between the two was where colonies died.</w:t>
+      </w:r>
+    </w:p>
+    <w:p>
+      <w:pPr>
+        <w:pStyle w:val="BodyText"/>
+      </w:pPr>
+      <w:r>
+        <w:t xml:space="preserve">Dana wondered if Elena had figured it out. If she’d stood in her own common area and read a supply manifest and felt the same recalibration Dana was feeling now — the recognition that the system wasn’t broken. The system was working exactly as designed. Elena’s</w:t>
+      </w:r>
+      <w:r>
+        <w:t xml:space="preserve"> </w:t>
+      </w:r>
+      <w:r>
+        <w:t xml:space="preserve">“We’re going to make it”</w:t>
+      </w:r>
+      <w:r>
+        <w:t xml:space="preserve"> </w:t>
+      </w:r>
+      <w:r>
+        <w:t xml:space="preserve">was the same kind of certainty Dana had carried into her contract with Asterlyne: the belief that the arrangement was adversarial but survivable. That you could work within the structure and come out the other side with the debt erased and the guilt manageable.</w:t>
+      </w:r>
+    </w:p>
+    <w:p>
+      <w:pPr>
+        <w:pStyle w:val="BodyText"/>
+      </w:pPr>
+      <w:r>
+        <w:t xml:space="preserve">Elena hadn’t come out the other side.</w:t>
+      </w:r>
+    </w:p>
+    <w:p>
+      <w:pPr>
+        <w:pStyle w:val="BodyText"/>
+      </w:pPr>
+      <w:r>
+        <w:t xml:space="preserve">Dana unpinned the entry. Read it a third time. Pinned it back. Left it exactly as it was. Walked to her shelter in the dark, past the common meal she could hear but didn’t join, past Haruki’s medical shelter where the light was still on, past the research tent where her creep samples sat in their containers waiting for tomorrow’s analysis.</w:t>
+      </w:r>
+    </w:p>
+    <w:p>
+      <w:r>
+        <w:pict>
+          <v:rect style="width:0;height:1.5pt" o:hralign="center" o:hrstd="t" o:hr="t"/>
+        </w:pict>
+      </w:r>
+    </w:p>
+    <w:p>
+      <w:pPr>
+        <w:pStyle w:val="FirstParagraph"/>
+      </w:pPr>
+      <w:r>
+        <w:t xml:space="preserve">The transmission went out at 03:40, during the magnetic window. Dana lay on her cot with the spectrometer balanced on her stomach, the two-inch screen casting pale light on the shelter’s ceiling. The data compressed. The signal found the relay satellite. The relay satellite found whatever Asterlyne endpoint was listening.</w:t>
+      </w:r>
+    </w:p>
+    <w:p>
+      <w:pPr>
+        <w:pStyle w:val="BodyText"/>
+      </w:pPr>
+      <w:r>
+        <w:t xml:space="preserve">Settlement coordinates: offset by 1.3 kilometers to the northeast. Close enough to look accurate. Far enough to matter.</w:t>
+      </w:r>
+    </w:p>
+    <w:p>
+      <w:pPr>
+        <w:pStyle w:val="BodyText"/>
+      </w:pPr>
+      <w:r>
+        <w:t xml:space="preserve">Water sources: accurate hydrology, imprecise positioning. The channel drainage system described in general terms, nothing that would let someone find the specific inlets.</w:t>
+      </w:r>
+    </w:p>
+    <w:p>
+      <w:pPr>
+        <w:pStyle w:val="BodyText"/>
+      </w:pPr>
+      <w:r>
+        <w:t xml:space="preserve">Structural vulnerability: overstated capacity. The shelters could handle forty-kph winds for six hours. She reported they could handle fifty for eight.</w:t>
+      </w:r>
+    </w:p>
+    <w:p>
+      <w:pPr>
+        <w:pStyle w:val="BodyText"/>
+      </w:pPr>
+      <w:r>
+        <w:t xml:space="preserve">Single points of failure: none identified. The colony had cross-trained. Redundancy was built in.</w:t>
+      </w:r>
+    </w:p>
+    <w:p>
+      <w:pPr>
+        <w:pStyle w:val="BodyText"/>
+      </w:pPr>
+      <w:r>
+        <w:t xml:space="preserve">Four lies nested in thirty pages of accurate data. The ratio felt like something Dana’s mother would have appreciated — the oncologist’s daughter, administering a precise dose of deception to keep the host organism alive.</w:t>
+      </w:r>
+    </w:p>
+    <w:p>
+      <w:pPr>
+        <w:pStyle w:val="BodyText"/>
+      </w:pPr>
+      <w:r>
+        <w:t xml:space="preserve">Dana powered down the spectrometer. Set it on the floor beside her cot. The shelter was dark. The hum of the trees pressed through the walls, the same frequency she’d been hearing for thirteen months, the one that lived in the chest more than the ears. Outside, the colony slept. Thirty-five people who depended on her soil maps, her crop schedules, her creep research, her analysis of the planet’s cycles. Thirty-five people she was saving with one hand and selling with the other.</w:t>
+      </w:r>
+    </w:p>
+    <w:p>
+      <w:pPr>
+        <w:pStyle w:val="BodyText"/>
+      </w:pPr>
+      <w:r>
+        <w:t xml:space="preserve">She was the most useful person in the colony. She was the most dangerous person in the colony. The two facts occupied the same body, breathed the same air, worked with the same soil-stained hands. There was no version of Dana Wen where one existed without the other. The research was real. The betrayal was real. The catalyst sitting in her lab could save every person here, and the data sitting in Asterlyne’s servers could make saving them unnecessary.</w:t>
+      </w:r>
+    </w:p>
+    <w:p>
+      <w:pPr>
+        <w:pStyle w:val="BodyText"/>
+      </w:pPr>
+      <w:r>
+        <w:t xml:space="preserve">Sixty thousand credits. Her mother’s life. Thirty-five strangers on a planet that recycled everything, including loyalty.</w:t>
+      </w:r>
+    </w:p>
+    <w:p>
+      <w:pPr>
+        <w:pStyle w:val="BodyText"/>
+      </w:pPr>
+      <w:r>
+        <w:t xml:space="preserve">Dana lay in the dark and listened to the hum and didn’t sleep.</w:t>
+      </w:r>
+    </w:p>
+    <w:bookmarkEnd w:id="34"/>
     <w:sectPr>
       <w:footnotePr>
         <w:numRestart w:val="eachSect"/>

</xml_diff>

<commit_message>
audit - round one complete
</commit_message>
<xml_diff>
--- a/build/the-free-colony.docx
+++ b/build/the-free-colony.docx
@@ -2,7 +2,7 @@
 <file path=word/document.xml><?xml version="1.0" encoding="utf-8"?>
 <w:document xmlns:w="http://schemas.openxmlformats.org/wordprocessingml/2006/main" xmlns:m="http://schemas.openxmlformats.org/officeDocument/2006/math" xmlns:r="http://schemas.openxmlformats.org/officeDocument/2006/relationships" xmlns:o="urn:schemas-microsoft-com:office:office" xmlns:v="urn:schemas-microsoft-com:vml" xmlns:w10="urn:schemas-microsoft-com:office:word" xmlns:a="http://schemas.openxmlformats.org/drawingml/2006/main" xmlns:pic="http://schemas.openxmlformats.org/drawingml/2006/picture" xmlns:wp="http://schemas.openxmlformats.org/drawingml/2006/wordprocessingDrawing">
   <w:body>
-    <w:bookmarkStart w:id="15" w:name="the-free-colony"/>
+    <w:bookmarkStart w:id="11" w:name="the-free-colony"/>
     <w:p>
       <w:pPr>
         <w:pStyle w:val="Heading1"/>
@@ -30,7 +30,7 @@
         </w:pict>
       </w:r>
     </w:p>
-    <w:bookmarkStart w:id="14" w:name="contents"/>
+    <w:bookmarkStart w:id="10" w:name="contents"/>
     <w:p>
       <w:pPr>
         <w:pStyle w:val="Heading2"/>
@@ -46,50 +46,30 @@
           <w:numId w:val="1001"/>
         </w:numPr>
       </w:pPr>
-      <w:hyperlink w:anchor="chapter-one-clause-942">
+      <w:hyperlink w:anchor="chapter-01-clause-942">
         <w:r>
           <w:rPr>
             <w:rStyle w:val="Hyperlink"/>
             <w:b/>
             <w:bCs/>
           </w:rPr>
-          <w:t xml:space="preserve">Chapter One — Clause 9.4.2</w:t>
+          <w:t xml:space="preserve">Chapter 01 —</w:t>
         </w:r>
-      </w:hyperlink>
-    </w:p>
-    <w:p>
-      <w:pPr>
-        <w:numPr>
-          <w:ilvl w:val="0"/>
-          <w:numId w:val="1001"/>
-        </w:numPr>
-      </w:pPr>
-      <w:hyperlink w:anchor="chapter-two-transit">
         <w:r>
           <w:rPr>
             <w:rStyle w:val="Hyperlink"/>
             <w:b/>
             <w:bCs/>
           </w:rPr>
-          <w:t xml:space="preserve">Chapter Two — Transit</w:t>
+          <w:t xml:space="preserve"> </w:t>
         </w:r>
-      </w:hyperlink>
-    </w:p>
-    <w:p>
-      <w:pPr>
-        <w:numPr>
-          <w:ilvl w:val="0"/>
-          <w:numId w:val="1001"/>
-        </w:numPr>
-      </w:pPr>
-      <w:hyperlink w:anchor="chapter-three-parcel-16b">
         <w:r>
           <w:rPr>
             <w:rStyle w:val="Hyperlink"/>
             <w:b/>
             <w:bCs/>
           </w:rPr>
-          <w:t xml:space="preserve">Chapter Three — Parcel 16b</w:t>
+          <w:t xml:space="preserve">“Clause 9.4.2”</w:t>
         </w:r>
       </w:hyperlink>
     </w:p>
@@ -100,14 +80,98 @@
           <w:numId w:val="1001"/>
         </w:numPr>
       </w:pPr>
-      <w:hyperlink w:anchor="chapter-four-the-rules">
+      <w:hyperlink w:anchor="chapter-02-transit">
         <w:r>
           <w:rPr>
             <w:rStyle w:val="Hyperlink"/>
             <w:b/>
             <w:bCs/>
           </w:rPr>
-          <w:t xml:space="preserve">Chapter Four — The Rules</w:t>
+          <w:t xml:space="preserve">Chapter 02 —</w:t>
+        </w:r>
+        <w:r>
+          <w:rPr>
+            <w:rStyle w:val="Hyperlink"/>
+            <w:b/>
+            <w:bCs/>
+          </w:rPr>
+          <w:t xml:space="preserve"> </w:t>
+        </w:r>
+        <w:r>
+          <w:rPr>
+            <w:rStyle w:val="Hyperlink"/>
+            <w:b/>
+            <w:bCs/>
+          </w:rPr>
+          <w:t xml:space="preserve">“Transit”</w:t>
+        </w:r>
+      </w:hyperlink>
+    </w:p>
+    <w:p>
+      <w:pPr>
+        <w:numPr>
+          <w:ilvl w:val="0"/>
+          <w:numId w:val="1001"/>
+        </w:numPr>
+      </w:pPr>
+      <w:hyperlink w:anchor="chapter-03-parcel-16b">
+        <w:r>
+          <w:rPr>
+            <w:rStyle w:val="Hyperlink"/>
+            <w:b/>
+            <w:bCs/>
+          </w:rPr>
+          <w:t xml:space="preserve">Chapter 03 —</w:t>
+        </w:r>
+        <w:r>
+          <w:rPr>
+            <w:rStyle w:val="Hyperlink"/>
+            <w:b/>
+            <w:bCs/>
+          </w:rPr>
+          <w:t xml:space="preserve"> </w:t>
+        </w:r>
+        <w:r>
+          <w:rPr>
+            <w:rStyle w:val="Hyperlink"/>
+            <w:b/>
+            <w:bCs/>
+          </w:rPr>
+          <w:t xml:space="preserve">“Parcel 16b”</w:t>
+        </w:r>
+      </w:hyperlink>
+    </w:p>
+    <w:p>
+      <w:pPr>
+        <w:numPr>
+          <w:ilvl w:val="0"/>
+          <w:numId w:val="1001"/>
+        </w:numPr>
+      </w:pPr>
+      <w:hyperlink w:anchor="chapter-04-the-rules">
+        <w:r>
+          <w:rPr>
+            <w:rStyle w:val="Hyperlink"/>
+            <w:b/>
+            <w:bCs/>
+          </w:rPr>
+          <w:t xml:space="preserve">Chapter 04 —</w:t>
+        </w:r>
+        <w:r>
+          <w:rPr>
+            <w:rStyle w:val="Hyperlink"/>
+            <w:b/>
+            <w:bCs/>
+          </w:rPr>
+          <w:t xml:space="preserve"> </w:t>
+        </w:r>
+        <w:r>
+          <w:rPr>
+            <w:rStyle w:val="Hyperlink"/>
+            <w:b/>
+            <w:bCs/>
+          </w:rPr>
+          <w:t xml:space="preserve">“The Rules”</w:t>
         </w:r>
       </w:hyperlink>
     </w:p>
@@ -329,7 +393,23 @@
             <w:b/>
             <w:bCs/>
           </w:rPr>
-          <w:t xml:space="preserve">Chapter 11 — Creep</w:t>
+          <w:t xml:space="preserve">Chapter 11 —</w:t>
+        </w:r>
+        <w:r>
+          <w:rPr>
+            <w:rStyle w:val="Hyperlink"/>
+            <w:b/>
+            <w:bCs/>
+          </w:rPr>
+          <w:t xml:space="preserve"> </w:t>
+        </w:r>
+        <w:r>
+          <w:rPr>
+            <w:rStyle w:val="Hyperlink"/>
+            <w:b/>
+            <w:bCs/>
+          </w:rPr>
+          <w:t xml:space="preserve">“Creep”</w:t>
         </w:r>
       </w:hyperlink>
     </w:p>
@@ -347,7 +427,23 @@
             <w:b/>
             <w:bCs/>
           </w:rPr>
-          <w:t xml:space="preserve">Chapter 12 — Democracy</w:t>
+          <w:t xml:space="preserve">Chapter 12 —</w:t>
+        </w:r>
+        <w:r>
+          <w:rPr>
+            <w:rStyle w:val="Hyperlink"/>
+            <w:b/>
+            <w:bCs/>
+          </w:rPr>
+          <w:t xml:space="preserve"> </w:t>
+        </w:r>
+        <w:r>
+          <w:rPr>
+            <w:rStyle w:val="Hyperlink"/>
+            <w:b/>
+            <w:bCs/>
+          </w:rPr>
+          <w:t xml:space="preserve">“Democracy”</w:t>
         </w:r>
       </w:hyperlink>
     </w:p>
@@ -365,7 +461,23 @@
             <w:b/>
             <w:bCs/>
           </w:rPr>
-          <w:t xml:space="preserve">Chapter 13 — The Structure</w:t>
+          <w:t xml:space="preserve">Chapter 13 —</w:t>
+        </w:r>
+        <w:r>
+          <w:rPr>
+            <w:rStyle w:val="Hyperlink"/>
+            <w:b/>
+            <w:bCs/>
+          </w:rPr>
+          <w:t xml:space="preserve"> </w:t>
+        </w:r>
+        <w:r>
+          <w:rPr>
+            <w:rStyle w:val="Hyperlink"/>
+            <w:b/>
+            <w:bCs/>
+          </w:rPr>
+          <w:t xml:space="preserve">“The Structure”</w:t>
         </w:r>
       </w:hyperlink>
     </w:p>
@@ -417,7 +529,23 @@
             <w:b/>
             <w:bCs/>
           </w:rPr>
-          <w:t xml:space="preserve">Chapter 15 — Supply Lines</w:t>
+          <w:t xml:space="preserve">Chapter 15 —</w:t>
+        </w:r>
+        <w:r>
+          <w:rPr>
+            <w:rStyle w:val="Hyperlink"/>
+            <w:b/>
+            <w:bCs/>
+          </w:rPr>
+          <w:t xml:space="preserve"> </w:t>
+        </w:r>
+        <w:r>
+          <w:rPr>
+            <w:rStyle w:val="Hyperlink"/>
+            <w:b/>
+            <w:bCs/>
+          </w:rPr>
+          <w:t xml:space="preserve">“Supply Lines”</w:t>
         </w:r>
       </w:hyperlink>
     </w:p>
@@ -435,7 +563,23 @@
             <w:b/>
             <w:bCs/>
           </w:rPr>
-          <w:t xml:space="preserve">Chapter 16 — Fever</w:t>
+          <w:t xml:space="preserve">Chapter 16 —</w:t>
+        </w:r>
+        <w:r>
+          <w:rPr>
+            <w:rStyle w:val="Hyperlink"/>
+            <w:b/>
+            <w:bCs/>
+          </w:rPr>
+          <w:t xml:space="preserve"> </w:t>
+        </w:r>
+        <w:r>
+          <w:rPr>
+            <w:rStyle w:val="Hyperlink"/>
+            <w:b/>
+            <w:bCs/>
+          </w:rPr>
+          <w:t xml:space="preserve">“Fever”</w:t>
         </w:r>
       </w:hyperlink>
     </w:p>
@@ -453,7 +597,23 @@
             <w:b/>
             <w:bCs/>
           </w:rPr>
-          <w:t xml:space="preserve">Chapter 17 — Elena, Year Two</w:t>
+          <w:t xml:space="preserve">Chapter 17 —</w:t>
+        </w:r>
+        <w:r>
+          <w:rPr>
+            <w:rStyle w:val="Hyperlink"/>
+            <w:b/>
+            <w:bCs/>
+          </w:rPr>
+          <w:t xml:space="preserve"> </w:t>
+        </w:r>
+        <w:r>
+          <w:rPr>
+            <w:rStyle w:val="Hyperlink"/>
+            <w:b/>
+            <w:bCs/>
+          </w:rPr>
+          <w:t xml:space="preserve">“Elena, Year Two”</w:t>
         </w:r>
       </w:hyperlink>
     </w:p>
@@ -871,24 +1031,29 @@
       <w:pPr>
         <w:pStyle w:val="BodyText"/>
       </w:pPr>
-      <w:bookmarkStart w:id="9" w:name="chapter-one-clause-942"/>
+      <w:bookmarkStart w:id="9" w:name="chapter-01-clause-942"/>
       <w:bookmarkEnd w:id="9"/>
     </w:p>
-    <w:p>
-      <w:pPr>
-        <w:pStyle w:val="BodyText"/>
-      </w:pPr>
-      <w:r>
-        <w:rPr>
-          <w:b/>
-          <w:bCs/>
-        </w:rPr>
-        <w:t xml:space="preserve">Chapter One — Clause 9.4.2</w:t>
-      </w:r>
-    </w:p>
-    <w:p>
-      <w:pPr>
-        <w:pStyle w:val="BodyText"/>
+    <w:bookmarkEnd w:id="10"/>
+    <w:bookmarkEnd w:id="11"/>
+    <w:bookmarkStart w:id="13" w:name="chapter-01-clause-9.4.2"/>
+    <w:p>
+      <w:pPr>
+        <w:pStyle w:val="Heading1"/>
+      </w:pPr>
+      <w:r>
+        <w:t xml:space="preserve">Chapter 01 —</w:t>
+      </w:r>
+      <w:r>
+        <w:t xml:space="preserve"> </w:t>
+      </w:r>
+      <w:r>
+        <w:t xml:space="preserve">“Clause 9.4.2”</w:t>
+      </w:r>
+    </w:p>
+    <w:p>
+      <w:pPr>
+        <w:pStyle w:val="FirstParagraph"/>
       </w:pPr>
       <w:r>
         <w:t xml:space="preserve">Forty-seven people in a room designed for thirty, and not one of them was happy about it.</w:t>
@@ -1499,24 +1664,28 @@
       <w:pPr>
         <w:pStyle w:val="BodyText"/>
       </w:pPr>
-      <w:bookmarkStart w:id="10" w:name="chapter-two-transit"/>
-      <w:bookmarkEnd w:id="10"/>
-    </w:p>
-    <w:p>
-      <w:pPr>
-        <w:pStyle w:val="BodyText"/>
-      </w:pPr>
-      <w:r>
-        <w:rPr>
-          <w:b/>
-          <w:bCs/>
-        </w:rPr>
-        <w:t xml:space="preserve">Chapter Two — Transit</w:t>
-      </w:r>
-    </w:p>
-    <w:p>
-      <w:pPr>
-        <w:pStyle w:val="BodyText"/>
+      <w:bookmarkStart w:id="12" w:name="chapter-02-transit"/>
+      <w:bookmarkEnd w:id="12"/>
+    </w:p>
+    <w:bookmarkEnd w:id="13"/>
+    <w:bookmarkStart w:id="15" w:name="chapter-02-transit"/>
+    <w:p>
+      <w:pPr>
+        <w:pStyle w:val="Heading1"/>
+      </w:pPr>
+      <w:r>
+        <w:t xml:space="preserve">Chapter 02 —</w:t>
+      </w:r>
+      <w:r>
+        <w:t xml:space="preserve"> </w:t>
+      </w:r>
+      <w:r>
+        <w:t xml:space="preserve">“Transit”</w:t>
+      </w:r>
+    </w:p>
+    <w:p>
+      <w:pPr>
+        <w:pStyle w:val="FirstParagraph"/>
       </w:pPr>
       <w:r>
         <w:t xml:space="preserve">Three months in recycled air tastes like someone else’s exhalation mixed with industrial scrubbers. Cole learned to stop noticing it by week two, which meant he’d learned to stop noticing a lot of things. The Asterlyne transport vessel wasn’t designed for comfort. It was designed for efficiency and just enough habitability to keep the cargo alive until delivery.</w:t>
@@ -2333,24 +2502,28 @@
       <w:pPr>
         <w:pStyle w:val="BodyText"/>
       </w:pPr>
-      <w:bookmarkStart w:id="11" w:name="chapter-three-parcel-16b"/>
-      <w:bookmarkEnd w:id="11"/>
-    </w:p>
-    <w:p>
-      <w:pPr>
-        <w:pStyle w:val="BodyText"/>
-      </w:pPr>
-      <w:r>
-        <w:rPr>
-          <w:b/>
-          <w:bCs/>
-        </w:rPr>
-        <w:t xml:space="preserve">Chapter Three — Parcel 16b</w:t>
-      </w:r>
-    </w:p>
-    <w:p>
-      <w:pPr>
-        <w:pStyle w:val="BodyText"/>
+      <w:bookmarkStart w:id="14" w:name="chapter-03-parcel-16b"/>
+      <w:bookmarkEnd w:id="14"/>
+    </w:p>
+    <w:bookmarkEnd w:id="15"/>
+    <w:bookmarkStart w:id="17" w:name="chapter-03-parcel-16b"/>
+    <w:p>
+      <w:pPr>
+        <w:pStyle w:val="Heading1"/>
+      </w:pPr>
+      <w:r>
+        <w:t xml:space="preserve">Chapter 03 —</w:t>
+      </w:r>
+      <w:r>
+        <w:t xml:space="preserve"> </w:t>
+      </w:r>
+      <w:r>
+        <w:t xml:space="preserve">“Parcel 16b”</w:t>
+      </w:r>
+    </w:p>
+    <w:p>
+      <w:pPr>
+        <w:pStyle w:val="FirstParagraph"/>
       </w:pPr>
       <w:r>
         <w:t xml:space="preserve">The descent came in three phases. First, the long brake through atmosphere, the shuttle shuddering and groaning the way metal groans when it’s asked to defy physics and mostly wins. Second, the sight of it—planet swelling in the viewport from a dot to a thing, from a coordinate to a world. Third, the silence after the engines cut, when forty-seven people held their collective breath and tried to calibrate what they were actually seeing.</w:t>
@@ -2979,24 +3152,28 @@
       <w:pPr>
         <w:pStyle w:val="BodyText"/>
       </w:pPr>
-      <w:bookmarkStart w:id="12" w:name="chapter-four-the-rules"/>
-      <w:bookmarkEnd w:id="12"/>
-    </w:p>
-    <w:p>
-      <w:pPr>
-        <w:pStyle w:val="BodyText"/>
-      </w:pPr>
-      <w:r>
-        <w:rPr>
-          <w:b/>
-          <w:bCs/>
-        </w:rPr>
-        <w:t xml:space="preserve">Chapter Four — The Rules</w:t>
-      </w:r>
-    </w:p>
-    <w:p>
-      <w:pPr>
-        <w:pStyle w:val="BodyText"/>
+      <w:bookmarkStart w:id="16" w:name="chapter-04-the-rules"/>
+      <w:bookmarkEnd w:id="16"/>
+    </w:p>
+    <w:bookmarkEnd w:id="17"/>
+    <w:bookmarkStart w:id="19" w:name="chapter-04-the-rules"/>
+    <w:p>
+      <w:pPr>
+        <w:pStyle w:val="Heading1"/>
+      </w:pPr>
+      <w:r>
+        <w:t xml:space="preserve">Chapter 04 —</w:t>
+      </w:r>
+      <w:r>
+        <w:t xml:space="preserve"> </w:t>
+      </w:r>
+      <w:r>
+        <w:t xml:space="preserve">“The Rules”</w:t>
+      </w:r>
+    </w:p>
+    <w:p>
+      <w:pPr>
+        <w:pStyle w:val="FirstParagraph"/>
       </w:pPr>
       <w:r>
         <w:t xml:space="preserve">By day four, the colony had stopped thinking of the planet as an antagonist and started thinking of it as a puzzle. By day seven, the distinction didn’t matter anymore. Both puzzles and antagonists could kill you if you didn’t pay attention.</w:t>
@@ -3650,12 +3827,11 @@
       <w:pPr>
         <w:pStyle w:val="BodyText"/>
       </w:pPr>
-      <w:bookmarkStart w:id="13" w:name="chapter-05-three"/>
-      <w:bookmarkEnd w:id="13"/>
-    </w:p>
-    <w:bookmarkEnd w:id="14"/>
-    <w:bookmarkEnd w:id="15"/>
-    <w:bookmarkStart w:id="17" w:name="chapter-05-three"/>
+      <w:bookmarkStart w:id="18" w:name="chapter-05-three"/>
+      <w:bookmarkEnd w:id="18"/>
+    </w:p>
+    <w:bookmarkEnd w:id="19"/>
+    <w:bookmarkStart w:id="21" w:name="chapter-05-three"/>
     <w:p>
       <w:pPr>
         <w:pStyle w:val="Heading1"/>
@@ -4212,11 +4388,11 @@
       <w:pPr>
         <w:pStyle w:val="BodyText"/>
       </w:pPr>
-      <w:bookmarkStart w:id="16" w:name="chapter-06-ghost-colony"/>
-      <w:bookmarkEnd w:id="16"/>
-    </w:p>
-    <w:bookmarkEnd w:id="17"/>
-    <w:bookmarkStart w:id="19" w:name="chapter-06-ghost-colony"/>
+      <w:bookmarkStart w:id="20" w:name="chapter-06-ghost-colony"/>
+      <w:bookmarkEnd w:id="20"/>
+    </w:p>
+    <w:bookmarkEnd w:id="21"/>
+    <w:bookmarkStart w:id="23" w:name="chapter-06-ghost-colony"/>
     <w:p>
       <w:pPr>
         <w:pStyle w:val="Heading1"/>
@@ -4698,11 +4874,11 @@
       <w:pPr>
         <w:pStyle w:val="BodyText"/>
       </w:pPr>
-      <w:bookmarkStart w:id="18" w:name="chapter-07-factions"/>
-      <w:bookmarkEnd w:id="18"/>
-    </w:p>
-    <w:bookmarkEnd w:id="19"/>
-    <w:bookmarkStart w:id="21" w:name="chapter-07-factions"/>
+      <w:bookmarkStart w:id="22" w:name="chapter-07-factions"/>
+      <w:bookmarkEnd w:id="22"/>
+    </w:p>
+    <w:bookmarkEnd w:id="23"/>
+    <w:bookmarkStart w:id="25" w:name="chapter-07-factions"/>
     <w:p>
       <w:pPr>
         <w:pStyle w:val="Heading1"/>
@@ -5785,11 +5961,11 @@
       <w:pPr>
         <w:pStyle w:val="BodyText"/>
       </w:pPr>
-      <w:bookmarkStart w:id="20" w:name="chapter-08-roots"/>
-      <w:bookmarkEnd w:id="20"/>
-    </w:p>
-    <w:bookmarkEnd w:id="21"/>
-    <w:bookmarkStart w:id="23" w:name="chapter-08-roots"/>
+      <w:bookmarkStart w:id="24" w:name="chapter-08-roots"/>
+      <w:bookmarkEnd w:id="24"/>
+    </w:p>
+    <w:bookmarkEnd w:id="25"/>
+    <w:bookmarkStart w:id="27" w:name="chapter-08-roots"/>
     <w:p>
       <w:pPr>
         <w:pStyle w:val="Heading1"/>
@@ -6453,11 +6629,11 @@
       <w:pPr>
         <w:pStyle w:val="BodyText"/>
       </w:pPr>
-      <w:bookmarkStart w:id="22" w:name="chapter-09-the-count"/>
-      <w:bookmarkEnd w:id="22"/>
-    </w:p>
-    <w:bookmarkEnd w:id="23"/>
-    <w:bookmarkStart w:id="25" w:name="chapter-09-the-count"/>
+      <w:bookmarkStart w:id="26" w:name="chapter-09-the-count"/>
+      <w:bookmarkEnd w:id="26"/>
+    </w:p>
+    <w:bookmarkEnd w:id="27"/>
+    <w:bookmarkStart w:id="29" w:name="chapter-09-the-count"/>
     <w:p>
       <w:pPr>
         <w:pStyle w:val="Heading1"/>
@@ -6949,11 +7125,11 @@
       <w:pPr>
         <w:pStyle w:val="BodyText"/>
       </w:pPr>
-      <w:bookmarkStart w:id="24" w:name="chapter-10-second-cycle"/>
-      <w:bookmarkEnd w:id="24"/>
-    </w:p>
-    <w:bookmarkEnd w:id="25"/>
-    <w:bookmarkStart w:id="27" w:name="chapter-10-second-cycle"/>
+      <w:bookmarkStart w:id="28" w:name="chapter-10-second-cycle"/>
+      <w:bookmarkEnd w:id="28"/>
+    </w:p>
+    <w:bookmarkEnd w:id="29"/>
+    <w:bookmarkStart w:id="31" w:name="chapter-10-second-cycle"/>
     <w:p>
       <w:pPr>
         <w:pStyle w:val="Heading1"/>
@@ -7902,17 +8078,23 @@
       <w:pPr>
         <w:pStyle w:val="BodyText"/>
       </w:pPr>
-      <w:bookmarkStart w:id="26" w:name="chapter-11-creep"/>
-      <w:bookmarkEnd w:id="26"/>
-    </w:p>
-    <w:bookmarkEnd w:id="27"/>
-    <w:bookmarkStart w:id="29" w:name="chapter-11-creep"/>
+      <w:bookmarkStart w:id="30" w:name="chapter-11-creep"/>
+      <w:bookmarkEnd w:id="30"/>
+    </w:p>
+    <w:bookmarkEnd w:id="31"/>
+    <w:bookmarkStart w:id="33" w:name="chapter-11-creep"/>
     <w:p>
       <w:pPr>
         <w:pStyle w:val="Heading1"/>
       </w:pPr>
       <w:r>
-        <w:t xml:space="preserve">Chapter 11 — Creep</w:t>
+        <w:t xml:space="preserve">Chapter 11 —</w:t>
+      </w:r>
+      <w:r>
+        <w:t xml:space="preserve"> </w:t>
+      </w:r>
+      <w:r>
+        <w:t xml:space="preserve">“Creep”</w:t>
       </w:r>
     </w:p>
     <w:p>
@@ -8858,17 +9040,23 @@
       <w:pPr>
         <w:pStyle w:val="BodyText"/>
       </w:pPr>
-      <w:bookmarkStart w:id="28" w:name="chapter-12-democracy"/>
-      <w:bookmarkEnd w:id="28"/>
-    </w:p>
-    <w:bookmarkEnd w:id="29"/>
-    <w:bookmarkStart w:id="31" w:name="chapter-12-democracy"/>
+      <w:bookmarkStart w:id="32" w:name="chapter-12-democracy"/>
+      <w:bookmarkEnd w:id="32"/>
+    </w:p>
+    <w:bookmarkEnd w:id="33"/>
+    <w:bookmarkStart w:id="35" w:name="chapter-12-democracy"/>
     <w:p>
       <w:pPr>
         <w:pStyle w:val="Heading1"/>
       </w:pPr>
       <w:r>
-        <w:t xml:space="preserve">Chapter 12 — Democracy</w:t>
+        <w:t xml:space="preserve">Chapter 12 —</w:t>
+      </w:r>
+      <w:r>
+        <w:t xml:space="preserve"> </w:t>
+      </w:r>
+      <w:r>
+        <w:t xml:space="preserve">“Democracy”</w:t>
       </w:r>
     </w:p>
     <w:p>
@@ -9407,6 +9595,180 @@
       </w:pPr>
       <w:r>
         <w:t xml:space="preserve">Cole didn’t argue further. Ren understood that as agreement — Cole was too practical to ignore a potential resource, even if his instinct was to minimize distraction. She’d push the research forward, and Cole would allocate people to it, and they’d find out what the channels meant. Or they wouldn’t. But at least they’d look before the planet decided they weren’t worth the space.</w:t>
+      </w:r>
+    </w:p>
+    <w:p>
+      <w:r>
+        <w:br w:type="page"/>
+      </w:r>
+    </w:p>
+    <w:p>
+      <w:pPr>
+        <w:pStyle w:val="BodyText"/>
+      </w:pPr>
+      <w:bookmarkStart w:id="34" w:name="chapter-13-the-structure"/>
+      <w:bookmarkEnd w:id="34"/>
+    </w:p>
+    <w:bookmarkEnd w:id="35"/>
+    <w:bookmarkStart w:id="37" w:name="chapter-13-the-structure"/>
+    <w:p>
+      <w:pPr>
+        <w:pStyle w:val="Heading1"/>
+      </w:pPr>
+      <w:r>
+        <w:t xml:space="preserve">Chapter 13 —</w:t>
+      </w:r>
+      <w:r>
+        <w:t xml:space="preserve"> </w:t>
+      </w:r>
+      <w:r>
+        <w:t xml:space="preserve">“The Structure”</w:t>
+      </w:r>
+    </w:p>
+    <w:p>
+      <w:pPr>
+        <w:pStyle w:val="FirstParagraph"/>
+      </w:pPr>
+      <w:r>
+        <w:t xml:space="preserve">The channels went deeper than anyone had expected.</w:t>
+      </w:r>
+    </w:p>
+    <w:p>
+      <w:pPr>
+        <w:pStyle w:val="BodyText"/>
+      </w:pPr>
+      <w:r>
+        <w:t xml:space="preserve">In the two weeks since the relocation, David’s excavation teams had been clearing rock for shelter foundations and uncovering more of the network that ran beneath the settlement. What had looked like drainage cuts on the surface turned out to be the top layer of a system that extended at least twelve meters into the bedrock. Cole stood at the edge of the deepest excavation trench on Month 11, Day 4, looking at walls of carved stone filled with a substance that caught the light like smoky quartz.</w:t>
+      </w:r>
+    </w:p>
+    <w:p>
+      <w:pPr>
+        <w:pStyle w:val="BodyText"/>
+      </w:pPr>
+      <w:r>
+        <w:t xml:space="preserve">Dana had been studying it since the discovery. She’d collected thirty-seven samples from different points in the network, mapped the mineral composition at each depth, cross-referenced the crystalline structure against her creep data. The results came back on a morning when the sky was doing its green-shift thing, the light falling through the spiral trees at an angle that made the channel walls glow faintly from within.</w:t>
+      </w:r>
+    </w:p>
+    <w:p>
+      <w:pPr>
+        <w:pStyle w:val="BodyText"/>
+      </w:pPr>
+      <w:r>
+        <w:t xml:space="preserve">“Same compound,”</w:t>
+      </w:r>
+      <w:r>
+        <w:t xml:space="preserve"> </w:t>
+      </w:r>
+      <w:r>
+        <w:t xml:space="preserve">Dana said. She was crouched at the edge of the trench, holding a sample container up to the light. Her voice had the quality it got when data confirmed something she’d suspected but hadn’t wanted to be right about.</w:t>
+      </w:r>
+      <w:r>
+        <w:t xml:space="preserve"> </w:t>
+      </w:r>
+      <w:r>
+        <w:t xml:space="preserve">“The base molecular structure is identical to the creep. Same organic-mineral hybrid. Same filament architecture at the microscopic level.”</w:t>
+      </w:r>
+    </w:p>
+    <w:p>
+      <w:pPr>
+        <w:pStyle w:val="BodyText"/>
+      </w:pPr>
+      <w:r>
+        <w:t xml:space="preserve">Cole looked at the substance in the container. Inert. Glassy. Nothing like the slow-moving biological mat that had driven them from the original settlement.</w:t>
+      </w:r>
+    </w:p>
+    <w:p>
+      <w:pPr>
+        <w:pStyle w:val="BodyText"/>
+      </w:pPr>
+      <w:r>
+        <w:t xml:space="preserve">“It’s not active,”</w:t>
+      </w:r>
+      <w:r>
+        <w:t xml:space="preserve"> </w:t>
+      </w:r>
+      <w:r>
+        <w:t xml:space="preserve">he said.</w:t>
+      </w:r>
+    </w:p>
+    <w:p>
+      <w:pPr>
+        <w:pStyle w:val="BodyText"/>
+      </w:pPr>
+      <w:r>
+        <w:t xml:space="preserve">“No. It’s ancient. Mineralized. The organic components have been replaced by mineral analogs over time — the same way petrified wood preserves structure after the original material is gone. This is what the creep becomes. Or what it was. The timeline runs in both directions.”</w:t>
+      </w:r>
+      <w:r>
+        <w:t xml:space="preserve"> </w:t>
+      </w:r>
+      <w:r>
+        <w:t xml:space="preserve">Dana set the container down carefully.</w:t>
+      </w:r>
+      <w:r>
+        <w:t xml:space="preserve"> </w:t>
+      </w:r>
+      <w:r>
+        <w:t xml:space="preserve">“Cole, the creep isn’t a disease. It’s a phase. The channels are full of the end product. The planet builds these networks the way coral builds reefs — living processes that create mineral infrastructure over deep time.”</w:t>
+      </w:r>
+    </w:p>
+    <w:p>
+      <w:pPr>
+        <w:pStyle w:val="BodyText"/>
+      </w:pPr>
+      <w:r>
+        <w:t xml:space="preserve">Cole processed that. The creep they’d fled from was the active version of the substance lining the walls beneath their feet. The ancient builders hadn’t carved channels and then filled them. They’d used the creep — or something like it — to build.</w:t>
+      </w:r>
+    </w:p>
+    <w:p>
+      <w:pPr>
+        <w:pStyle w:val="BodyText"/>
+      </w:pPr>
+      <w:r>
+        <w:t xml:space="preserve">“How old?”</w:t>
+      </w:r>
+      <w:r>
+        <w:t xml:space="preserve"> </w:t>
+      </w:r>
+      <w:r>
+        <w:t xml:space="preserve">he asked.</w:t>
+      </w:r>
+    </w:p>
+    <w:p>
+      <w:pPr>
+        <w:pStyle w:val="BodyText"/>
+      </w:pPr>
+      <w:r>
+        <w:t xml:space="preserve">“I can’t tell precisely. David’s geological estimates put it at tens of thousands of years minimum. The mineralization is complete. Whatever was alive in these walls hasn’t been alive for a very long time.”</w:t>
+      </w:r>
+    </w:p>
+    <w:p>
+      <w:pPr>
+        <w:pStyle w:val="BodyText"/>
+      </w:pPr>
+      <w:r>
+        <w:t xml:space="preserve">“But the builders were alive. Something lived here that understood how to use this.”</w:t>
+      </w:r>
+    </w:p>
+    <w:p>
+      <w:pPr>
+        <w:pStyle w:val="BodyText"/>
+      </w:pPr>
+      <w:r>
+        <w:t xml:space="preserve">Dana stood. Brushed the rock dust from her knees.</w:t>
+      </w:r>
+      <w:r>
+        <w:t xml:space="preserve"> </w:t>
+      </w:r>
+      <w:r>
+        <w:t xml:space="preserve">“Something lived here that built infrastructure on a planetary scale. The channels aren’t local. They branch. Every time David’s team clears a new section, they find more connections. This isn’t a settlement. It’s a network. Drainage, nutrient transport, maybe communication. Maybe something we don’t have a word for.”</w:t>
+      </w:r>
+    </w:p>
+    <w:p>
+      <w:pPr>
+        <w:pStyle w:val="BodyText"/>
+      </w:pPr>
+      <w:r>
+        <w:t xml:space="preserve">Cole looked at the trench. The carved walls. The mineralized substance that had been deposited with geometric precision into rock that was older than human civilization. He felt the weight of it — not reverence, not awe. Something more practical. The recognition that every assumption the colony had made about this planet was built on a surface reading. Below the surface, the planet had a history, and they were standing on it without knowing the first chapter.</w:t>
       </w:r>
     </w:p>
     <w:p>
@@ -9421,281 +9783,103 @@
         <w:pStyle w:val="FirstParagraph"/>
       </w:pPr>
       <w:r>
-        <w:rPr>
-          <w:b/>
-          <w:bCs/>
-        </w:rPr>
-        <w:t xml:space="preserve">Author Notes — Chapter 12</w:t>
-      </w:r>
-    </w:p>
-    <w:p>
-      <w:pPr>
-        <w:pStyle w:val="BodyText"/>
-      </w:pPr>
-      <w:r>
-        <w:rPr>
-          <w:b/>
-          <w:bCs/>
-        </w:rPr>
-        <w:t xml:space="preserve">Voice Decisions:</w:t>
-      </w:r>
-      <w:r>
-        <w:t xml:space="preserve"> </w:t>
-      </w:r>
-      <w:r>
-        <w:t xml:space="preserve">Ren’s POV provides the external perspective that Cole’s interiority lacks. She sees the relocation as both necessary and fragile — the work is brutally practical, but it’s also preparation for a failure Cole already knows is coming. The chapter’s tone is darker than 11 because Ren’s observational precision catches the death count without Cole’s calculation shield. Thomas Chen, Noor, and James’s injuries come without warning because exhaustion and stress don’t announce themselves — they just happen. Noor’s death — one of the seventeen who voted against relocation — adds political weight to the body count: she died doing the thing she’d voted against.</w:t>
-      </w:r>
-    </w:p>
-    <w:p>
-      <w:pPr>
-        <w:pStyle w:val="BodyText"/>
-      </w:pPr>
-      <w:r>
-        <w:rPr>
-          <w:b/>
-          <w:bCs/>
-        </w:rPr>
-        <w:t xml:space="preserve">Structural Notes:</w:t>
-      </w:r>
-      <w:r>
-        <w:t xml:space="preserve"> </w:t>
-      </w:r>
-      <w:r>
-        <w:t xml:space="preserve">The relocation spans Days 1–6 as a compressed sequence (summary with scene punctuation rather than full scene detail). The chapter moves from action → death → discovery → implication, ending with Ren and Cole recognizing that the architecture changes the problem without changing its fundamental pressure. The vote isn’t re-dramatized because Chapter 11 already delivered it; Chapter 12 is about the cost of execution. The creep’s failure to follow onto rock substrate provides relief without resolution.</w:t>
-      </w:r>
-    </w:p>
-    <w:p>
-      <w:pPr>
-        <w:pStyle w:val="BodyText"/>
-      </w:pPr>
-      <w:r>
-        <w:rPr>
-          <w:b/>
-          <w:bCs/>
-        </w:rPr>
-        <w:t xml:space="preserve">Continuity:</w:t>
-      </w:r>
-      <w:r>
-        <w:t xml:space="preserve"> </w:t>
-      </w:r>
-      <w:r>
-        <w:t xml:space="preserve">Vote was 21-17 (close, per outline), carried forward from Ch 11. Count moves 38 → 37 (Thomas Chen, cardiac event, Day 1) → 36 (Noor, exposure/hypothermia, Night 3). James’s compound fracture and infection risk established (Day 5). Patricia’s cough introduced as a future complication (will develop in Ch 16). The ancient channels are now identified as deliberately built, not natural. Creep confirmed as not following to rock substrate. The new site is operational by chapter’s end.</w:t>
-      </w:r>
-    </w:p>
-    <w:p>
-      <w:pPr>
-        <w:pStyle w:val="BodyText"/>
-      </w:pPr>
-      <w:r>
-        <w:rPr>
-          <w:b/>
-          <w:bCs/>
-        </w:rPr>
-        <w:t xml:space="preserve">Off-Voice Flags:</w:t>
-      </w:r>
-      <w:r>
-        <w:t xml:space="preserve"> </w:t>
-      </w:r>
-      <w:r>
-        <w:t xml:space="preserve">Cole’s dialogue about the channel builders tightened from earlier draft — removed the enumeration (</w:t>
-      </w:r>
-      <w:r>
-        <w:t xml:space="preserve">“consumed them or they left or they failed”</w:t>
-      </w:r>
-      <w:r>
-        <w:t xml:space="preserve">) in favor of a more direct, characteristically terse dismissal (</w:t>
-      </w:r>
-      <w:r>
-        <w:t xml:space="preserve">“Channels are interesting. They’re not food, shelter, or medicine.”</w:t>
-      </w:r>
-      <w:r>
-        <w:t xml:space="preserve">). The pragmatic-dreamer tone holds throughout.</w:t>
-      </w:r>
-    </w:p>
-    <w:p>
-      <w:pPr>
-        <w:pStyle w:val="BodyText"/>
-      </w:pPr>
-      <w:r>
-        <w:rPr>
-          <w:b/>
-          <w:bCs/>
-        </w:rPr>
-        <w:t xml:space="preserve">Word count:</w:t>
-      </w:r>
-      <w:r>
-        <w:t xml:space="preserve"> </w:t>
-      </w:r>
-      <w:r>
-        <w:t xml:space="preserve">~3,200 words</w:t>
-      </w:r>
-    </w:p>
-    <w:p>
-      <w:r>
-        <w:br w:type="page"/>
-      </w:r>
-    </w:p>
-    <w:p>
-      <w:pPr>
-        <w:pStyle w:val="BodyText"/>
-      </w:pPr>
-      <w:bookmarkStart w:id="30" w:name="chapter-13-the-structure"/>
-      <w:bookmarkEnd w:id="30"/>
-    </w:p>
-    <w:bookmarkEnd w:id="31"/>
-    <w:bookmarkStart w:id="33" w:name="chapter-13-the-structure"/>
-    <w:p>
-      <w:pPr>
-        <w:pStyle w:val="Heading1"/>
-      </w:pPr>
-      <w:r>
-        <w:t xml:space="preserve">Chapter 13 — The Structure</w:t>
-      </w:r>
-    </w:p>
-    <w:p>
-      <w:pPr>
-        <w:pStyle w:val="FirstParagraph"/>
-      </w:pPr>
-      <w:r>
-        <w:t xml:space="preserve">The channels went deeper than anyone had expected.</w:t>
-      </w:r>
-    </w:p>
-    <w:p>
-      <w:pPr>
-        <w:pStyle w:val="BodyText"/>
-      </w:pPr>
-      <w:r>
-        <w:t xml:space="preserve">In the two weeks since the relocation, David’s excavation teams had been clearing rock for shelter foundations and uncovering more of the network that ran beneath the settlement. What had looked like drainage cuts on the surface turned out to be the top layer of a system that extended at least twelve meters into the bedrock. Cole stood at the edge of the deepest excavation trench on Month 11, Day 4, looking at walls of carved stone filled with a substance that caught the light like smoky quartz.</w:t>
-      </w:r>
-    </w:p>
-    <w:p>
-      <w:pPr>
-        <w:pStyle w:val="BodyText"/>
-      </w:pPr>
-      <w:r>
-        <w:t xml:space="preserve">Dana had been studying it since the discovery. She’d collected thirty-seven samples from different points in the network, mapped the mineral composition at each depth, cross-referenced the crystalline structure against her creep data. The results came back on a morning when the sky was doing its green-shift thing, the light falling through the spiral trees at an angle that made the channel walls glow faintly from within.</w:t>
-      </w:r>
-    </w:p>
-    <w:p>
-      <w:pPr>
-        <w:pStyle w:val="BodyText"/>
-      </w:pPr>
-      <w:r>
-        <w:t xml:space="preserve">“Same compound,”</w:t>
-      </w:r>
-      <w:r>
-        <w:t xml:space="preserve"> </w:t>
-      </w:r>
-      <w:r>
-        <w:t xml:space="preserve">Dana said. She was crouched at the edge of the trench, holding a sample container up to the light. Her voice had the quality it got when data confirmed something she’d suspected but hadn’t wanted to be right about.</w:t>
-      </w:r>
-      <w:r>
-        <w:t xml:space="preserve"> </w:t>
-      </w:r>
-      <w:r>
-        <w:t xml:space="preserve">“The base molecular structure is identical to the creep. Same organic-mineral hybrid. Same filament architecture at the microscopic level.”</w:t>
-      </w:r>
-    </w:p>
-    <w:p>
-      <w:pPr>
-        <w:pStyle w:val="BodyText"/>
-      </w:pPr>
-      <w:r>
-        <w:t xml:space="preserve">Cole looked at the substance in the container. Inert. Glassy. Nothing like the slow-moving biological mat that had driven them from the original settlement.</w:t>
-      </w:r>
-    </w:p>
-    <w:p>
-      <w:pPr>
-        <w:pStyle w:val="BodyText"/>
-      </w:pPr>
-      <w:r>
-        <w:t xml:space="preserve">“It’s not active,”</w:t>
-      </w:r>
-      <w:r>
-        <w:t xml:space="preserve"> </w:t>
-      </w:r>
-      <w:r>
-        <w:t xml:space="preserve">he said.</w:t>
-      </w:r>
-    </w:p>
-    <w:p>
-      <w:pPr>
-        <w:pStyle w:val="BodyText"/>
-      </w:pPr>
-      <w:r>
-        <w:t xml:space="preserve">“No. It’s ancient. Mineralized. The organic components have been replaced by mineral analogs over time — the same way petrified wood preserves structure after the original material is gone. This is what the creep becomes. Or what it was. The timeline runs in both directions.”</w:t>
-      </w:r>
-      <w:r>
-        <w:t xml:space="preserve"> </w:t>
-      </w:r>
-      <w:r>
-        <w:t xml:space="preserve">Dana set the container down carefully.</w:t>
-      </w:r>
-      <w:r>
-        <w:t xml:space="preserve"> </w:t>
-      </w:r>
-      <w:r>
-        <w:t xml:space="preserve">“Cole, the creep isn’t a disease. It’s a phase. The channels are full of the end product. The planet builds these networks the way coral builds reefs — living processes that create mineral infrastructure over deep time.”</w:t>
-      </w:r>
-    </w:p>
-    <w:p>
-      <w:pPr>
-        <w:pStyle w:val="BodyText"/>
-      </w:pPr>
-      <w:r>
-        <w:t xml:space="preserve">Cole processed that. The creep they’d fled from was the active version of the substance lining the walls beneath their feet. The ancient builders hadn’t carved channels and then filled them. They’d used the creep — or something like it — to build.</w:t>
-      </w:r>
-    </w:p>
-    <w:p>
-      <w:pPr>
-        <w:pStyle w:val="BodyText"/>
-      </w:pPr>
-      <w:r>
-        <w:t xml:space="preserve">“How old?”</w:t>
-      </w:r>
-      <w:r>
-        <w:t xml:space="preserve"> </w:t>
-      </w:r>
-      <w:r>
-        <w:t xml:space="preserve">he asked.</w:t>
-      </w:r>
-    </w:p>
-    <w:p>
-      <w:pPr>
-        <w:pStyle w:val="BodyText"/>
-      </w:pPr>
-      <w:r>
-        <w:t xml:space="preserve">“I can’t tell precisely. David’s geological estimates put it at tens of thousands of years minimum. The mineralization is complete. Whatever was alive in these walls hasn’t been alive for a very long time.”</w:t>
-      </w:r>
-    </w:p>
-    <w:p>
-      <w:pPr>
-        <w:pStyle w:val="BodyText"/>
-      </w:pPr>
-      <w:r>
-        <w:t xml:space="preserve">“But the builders were alive. Something lived here that understood how to use this.”</w:t>
-      </w:r>
-    </w:p>
-    <w:p>
-      <w:pPr>
-        <w:pStyle w:val="BodyText"/>
-      </w:pPr>
-      <w:r>
-        <w:t xml:space="preserve">Dana stood. Brushed the rock dust from her knees.</w:t>
-      </w:r>
-      <w:r>
-        <w:t xml:space="preserve"> </w:t>
-      </w:r>
-      <w:r>
-        <w:t xml:space="preserve">“Something lived here that built infrastructure on a planetary scale. The channels aren’t local. They branch. Every time David’s team clears a new section, they find more connections. This isn’t a settlement. It’s a network. Drainage, nutrient transport, maybe communication. Maybe something we don’t have a word for.”</w:t>
-      </w:r>
-    </w:p>
-    <w:p>
-      <w:pPr>
-        <w:pStyle w:val="BodyText"/>
-      </w:pPr>
-      <w:r>
-        <w:t xml:space="preserve">Cole looked at the trench. The carved walls. The mineralized substance that had been deposited with geometric precision into rock that was older than human civilization. He felt the weight of it — not reverence, not awe. Something more practical. The recognition that every assumption the colony had made about this planet was built on a surface reading. Below the surface, the planet had a history, and they were standing on it without knowing the first chapter.</w:t>
+        <w:t xml:space="preserve">The colony took the news in pieces.</w:t>
+      </w:r>
+    </w:p>
+    <w:p>
+      <w:pPr>
+        <w:pStyle w:val="BodyText"/>
+      </w:pPr>
+      <w:r>
+        <w:t xml:space="preserve">Ren organized a presentation. Dana delivered the scientific data. David showed the excavation maps, the branching network, the depth measurements. Cole stood in the back and watched thirty-five faces absorb the information that the ground beneath their shelters was architecture.</w:t>
+      </w:r>
+    </w:p>
+    <w:p>
+      <w:pPr>
+        <w:pStyle w:val="BodyText"/>
+      </w:pPr>
+      <w:r>
+        <w:t xml:space="preserve">The reactions split along lines Cole had learned to predict. The practical contingent — the builders, the water engineers, the people whose survival instincts ran toward the tangible — wanted to know if the channels could be used. Water management. Drainage. Storage. If the ancient builders had solved the problems the colony was still fighting, maybe their infrastructure was the answer.</w:t>
+      </w:r>
+    </w:p>
+    <w:p>
+      <w:pPr>
+        <w:pStyle w:val="BodyText"/>
+      </w:pPr>
+      <w:r>
+        <w:t xml:space="preserve">The philosophical contingent — smaller, quieter, harder to identify until they spoke — wanted to know what this meant. Who had been here. What had happened to them. Whether the colony had any right to build on top of something they didn’t understand.</w:t>
+      </w:r>
+    </w:p>
+    <w:p>
+      <w:pPr>
+        <w:pStyle w:val="BodyText"/>
+      </w:pPr>
+      <w:r>
+        <w:t xml:space="preserve">Garrett Polk, characteristically, occupied both camps at once.</w:t>
+      </w:r>
+      <w:r>
+        <w:t xml:space="preserve"> </w:t>
+      </w:r>
+      <w:r>
+        <w:t xml:space="preserve">“Can we drink from the channels?”</w:t>
+      </w:r>
+      <w:r>
+        <w:t xml:space="preserve"> </w:t>
+      </w:r>
+      <w:r>
+        <w:t xml:space="preserve">he asked. Then, before Dana could answer:</w:t>
+      </w:r>
+      <w:r>
+        <w:t xml:space="preserve"> </w:t>
+      </w:r>
+      <w:r>
+        <w:t xml:space="preserve">“And what killed the things that dug them?”</w:t>
+      </w:r>
+    </w:p>
+    <w:p>
+      <w:pPr>
+        <w:pStyle w:val="BodyText"/>
+      </w:pPr>
+      <w:r>
+        <w:t xml:space="preserve">Dana answered the first question.</w:t>
+      </w:r>
+      <w:r>
+        <w:t xml:space="preserve"> </w:t>
+      </w:r>
+      <w:r>
+        <w:t xml:space="preserve">“The water flow through the upper channels is clean. Mineral-rich but potable. We’ve been using it already — the drainage features David identified are part of this system. So yes. We’ve been drinking from the channels since we arrived.”</w:t>
+      </w:r>
+    </w:p>
+    <w:p>
+      <w:pPr>
+        <w:pStyle w:val="BodyText"/>
+      </w:pPr>
+      <w:r>
+        <w:t xml:space="preserve">She didn’t answer the second question. Nobody could.</w:t>
+      </w:r>
+    </w:p>
+    <w:p>
+      <w:pPr>
+        <w:pStyle w:val="BodyText"/>
+      </w:pPr>
+      <w:r>
+        <w:t xml:space="preserve">Cole’s interiority during the presentation was simpler than anyone watching him would have guessed. He ran the math. The channels existed. The channels carried water. The channels provided defensible infrastructure on rock substrate the creep couldn’t colonize. Did the channels change the survival math? No. The colony was at thirty-six, the same thirty-six it had been since Noor died on Night Three of the relocation. The channels didn’t add people. They didn’t subtract threats. They provided resources the colony was already using without knowing what they were.</w:t>
+      </w:r>
+    </w:p>
+    <w:p>
+      <w:pPr>
+        <w:pStyle w:val="BodyText"/>
+      </w:pPr>
+      <w:r>
+        <w:t xml:space="preserve">Did the channels change the moral math? Cole didn’t let himself answer that. The moral math was Ren’s territory. She’d fight it out in council, argue about inheritance and obligation, push for research teams to study the builders’ legacy. Cole would let her. Not because he agreed or disagreed, but because the moral questions didn’t change the number. Thirty-six. Twenty-four needed. Forty-eight months remaining.</w:t>
+      </w:r>
+    </w:p>
+    <w:p>
+      <w:pPr>
+        <w:pStyle w:val="BodyText"/>
+      </w:pPr>
+      <w:r>
+        <w:t xml:space="preserve">Elena’s logs never mentioned this. Her colony had built twelve kilometers west, on different terrain. She’d found the same creep, the same orbital cycles, the same slow death. But she’d never stood over a trench cut into bedrock and realized the planet had been inhabited before. That absence in her data was its own kind of information. The planet was large enough to contain different stories. Elena’s and Cole’s were parallel but not identical. The channels were his alone.</w:t>
       </w:r>
     </w:p>
     <w:p>
@@ -9710,103 +9894,241 @@
         <w:pStyle w:val="FirstParagraph"/>
       </w:pPr>
       <w:r>
-        <w:t xml:space="preserve">The colony took the news in pieces.</w:t>
-      </w:r>
-    </w:p>
-    <w:p>
-      <w:pPr>
-        <w:pStyle w:val="BodyText"/>
-      </w:pPr>
-      <w:r>
-        <w:t xml:space="preserve">Ren organized a presentation. Dana delivered the scientific data. David showed the excavation maps, the branching network, the depth measurements. Cole stood in the back and watched thirty-five faces absorb the information that the ground beneath their shelters was architecture.</w:t>
-      </w:r>
-    </w:p>
-    <w:p>
-      <w:pPr>
-        <w:pStyle w:val="BodyText"/>
-      </w:pPr>
-      <w:r>
-        <w:t xml:space="preserve">The reactions split along lines Cole had learned to predict. The practical contingent — the builders, the water engineers, the people whose survival instincts ran toward the tangible — wanted to know if the channels could be used. Water management. Drainage. Storage. If the ancient builders had solved the problems the colony was still fighting, maybe their infrastructure was the answer.</w:t>
-      </w:r>
-    </w:p>
-    <w:p>
-      <w:pPr>
-        <w:pStyle w:val="BodyText"/>
-      </w:pPr>
-      <w:r>
-        <w:t xml:space="preserve">The philosophical contingent — smaller, quieter, harder to identify until they spoke — wanted to know what this meant. Who had been here. What had happened to them. Whether the colony had any right to build on top of something they didn’t understand.</w:t>
-      </w:r>
-    </w:p>
-    <w:p>
-      <w:pPr>
-        <w:pStyle w:val="BodyText"/>
-      </w:pPr>
-      <w:r>
-        <w:t xml:space="preserve">Garrett Polk, characteristically, occupied both camps at once.</w:t>
-      </w:r>
-      <w:r>
-        <w:t xml:space="preserve"> </w:t>
-      </w:r>
-      <w:r>
-        <w:t xml:space="preserve">“Can we drink from the channels?”</w:t>
-      </w:r>
-      <w:r>
-        <w:t xml:space="preserve"> </w:t>
-      </w:r>
-      <w:r>
-        <w:t xml:space="preserve">he asked. Then, before Dana could answer:</w:t>
-      </w:r>
-      <w:r>
-        <w:t xml:space="preserve"> </w:t>
-      </w:r>
-      <w:r>
-        <w:t xml:space="preserve">“And what killed the things that dug them?”</w:t>
-      </w:r>
-    </w:p>
-    <w:p>
-      <w:pPr>
-        <w:pStyle w:val="BodyText"/>
-      </w:pPr>
-      <w:r>
-        <w:t xml:space="preserve">Dana answered the first question.</w:t>
-      </w:r>
-      <w:r>
-        <w:t xml:space="preserve"> </w:t>
-      </w:r>
-      <w:r>
-        <w:t xml:space="preserve">“The water flow through the upper channels is clean. Mineral-rich but potable. We’ve been using it already — the drainage features David identified are part of this system. So yes. We’ve been drinking from the channels since we arrived.”</w:t>
-      </w:r>
-    </w:p>
-    <w:p>
-      <w:pPr>
-        <w:pStyle w:val="BodyText"/>
-      </w:pPr>
-      <w:r>
-        <w:t xml:space="preserve">She didn’t answer the second question. Nobody could.</w:t>
-      </w:r>
-    </w:p>
-    <w:p>
-      <w:pPr>
-        <w:pStyle w:val="BodyText"/>
-      </w:pPr>
-      <w:r>
-        <w:t xml:space="preserve">Cole’s interiority during the presentation was simpler than anyone watching him would have guessed. He ran the math. The channels existed. The channels carried water. The channels provided defensible infrastructure on rock substrate the creep couldn’t colonize. Did the channels change the survival math? No. The colony was at thirty-six, the same thirty-six it had been since Noor died on Night Three of the relocation. The channels didn’t add people. They didn’t subtract threats. They provided resources the colony was already using without knowing what they were.</w:t>
-      </w:r>
-    </w:p>
-    <w:p>
-      <w:pPr>
-        <w:pStyle w:val="BodyText"/>
-      </w:pPr>
-      <w:r>
-        <w:t xml:space="preserve">Did the channels change the moral math? Cole didn’t let himself answer that. The moral math was Ren’s territory. She’d fight it out in council, argue about inheritance and obligation, push for research teams to study the builders’ legacy. Cole would let her. Not because he agreed or disagreed, but because the moral questions didn’t change the number. Thirty-six. Twenty-four needed. Forty-eight months remaining.</w:t>
-      </w:r>
-    </w:p>
-    <w:p>
-      <w:pPr>
-        <w:pStyle w:val="BodyText"/>
-      </w:pPr>
-      <w:r>
-        <w:t xml:space="preserve">Elena’s logs never mentioned this. Her colony had built twelve kilometers west, on different terrain. She’d found the same creep, the same orbital cycles, the same slow death. But she’d never stood over a trench cut into bedrock and realized the planet had been inhabited before. That absence in her data was its own kind of information. The planet was large enough to contain different stories. Elena’s and Cole’s were parallel but not identical. The channels were his alone.</w:t>
+        <w:t xml:space="preserve">Ren pushed for research teams. Cole allocated three people: Dana for the biological analysis, David for the geological survey, and a rotating fourth position for general assistance. He kept the teams small because every person studying channels was a person not building shelters, not tending the dormancy-phase crops, not maintaining the systems that kept thirty-six people breathing.</w:t>
+      </w:r>
+    </w:p>
+    <w:p>
+      <w:pPr>
+        <w:pStyle w:val="BodyText"/>
+      </w:pPr>
+      <w:r>
+        <w:t xml:space="preserve">Suri Park volunteered for the fourth position on the first day.</w:t>
+      </w:r>
+    </w:p>
+    <w:p>
+      <w:pPr>
+        <w:pStyle w:val="BodyText"/>
+      </w:pPr>
+      <w:r>
+        <w:t xml:space="preserve">Cole almost said no. Not because Suri was unqualified — she’d been working as Dana’s field assistant since the fruit incident in Month One, when she’d eaten the native berries that nearly killed her and then come back the next week asking Dana to teach her how to test samples properly. Suri had the curiosity that made people useful and the eagerness that made them careless, but eight months of working with Dana had filed the carelessness down to something closer to controlled intensity. She asked questions before she touched things now. She waited for data before she acted.</w:t>
+      </w:r>
+    </w:p>
+    <w:p>
+      <w:pPr>
+        <w:pStyle w:val="BodyText"/>
+      </w:pPr>
+      <w:r>
+        <w:t xml:space="preserve">Cole said yes because Suri had earned it. She’d survived the thing that should have taught her to be afraid, and instead it had taught her to be precise. He respected that more than he respected caution.</w:t>
+      </w:r>
+    </w:p>
+    <w:p>
+      <w:pPr>
+        <w:pStyle w:val="BodyText"/>
+      </w:pPr>
+      <w:r>
+        <w:t xml:space="preserve">The research moved quickly. Over six weeks, the team mapped the channel network beneath the settlement and extending two hundred meters in each direction. The branches were systematic — main arteries splitting into secondary channels, secondary channels splitting into capillary networks so fine they could only be detected with Dana’s ground-penetrating analysis. The geometry was consistent. The mineralized compound filled every channel to a uniform depth, as though the entire network had been activated simultaneously and then gone inert at the same moment.</w:t>
+      </w:r>
+    </w:p>
+    <w:p>
+      <w:pPr>
+        <w:pStyle w:val="BodyText"/>
+      </w:pPr>
+      <w:r>
+        <w:t xml:space="preserve">Dana’s working theory: the channels were a planetary circulatory system. During active orbital phases, living creep — the biological mat — would flow through the network, transporting nutrients, breaking down dead matter, redistributing minerals. During dormant phases, the compound would mineralize, preserving the infrastructure for the next cycle. The builders hadn’t fought the planet’s cycles. They’d built with them. Used the creep as a construction material, a transport medium, a living tool.</w:t>
+      </w:r>
+    </w:p>
+    <w:p>
+      <w:pPr>
+        <w:pStyle w:val="BodyText"/>
+      </w:pPr>
+      <w:r>
+        <w:t xml:space="preserve">“It’s elegant,”</w:t>
+      </w:r>
+      <w:r>
+        <w:t xml:space="preserve"> </w:t>
+      </w:r>
+      <w:r>
+        <w:t xml:space="preserve">Dana said one evening, spreading her maps across the research shelter’s table. Cole, Ren, and Suri were there. The light outside was fading, the green-shifted sky darkening toward something that wasn’t quite night.</w:t>
+      </w:r>
+      <w:r>
+        <w:t xml:space="preserve"> </w:t>
+      </w:r>
+      <w:r>
+        <w:t xml:space="preserve">“The planet has a circulatory system. The builders understood it. They didn’t try to stop the cycles or survive them — they integrated. The channels are infrastructure that works with the planet instead of against it.”</w:t>
+      </w:r>
+    </w:p>
+    <w:p>
+      <w:pPr>
+        <w:pStyle w:val="BodyText"/>
+      </w:pPr>
+      <w:r>
+        <w:t xml:space="preserve">“Infrastructure that’s been dead for tens of thousands of years,”</w:t>
+      </w:r>
+      <w:r>
+        <w:t xml:space="preserve"> </w:t>
+      </w:r>
+      <w:r>
+        <w:t xml:space="preserve">Cole said.</w:t>
+      </w:r>
+    </w:p>
+    <w:p>
+      <w:pPr>
+        <w:pStyle w:val="BodyText"/>
+      </w:pPr>
+      <w:r>
+        <w:t xml:space="preserve">“Dormant,”</w:t>
+      </w:r>
+      <w:r>
+        <w:t xml:space="preserve"> </w:t>
+      </w:r>
+      <w:r>
+        <w:t xml:space="preserve">Dana corrected.</w:t>
+      </w:r>
+      <w:r>
+        <w:t xml:space="preserve"> </w:t>
+      </w:r>
+      <w:r>
+        <w:t xml:space="preserve">“The compound mineralizes during dormancy. That doesn’t mean the system is permanently inactive. It means it’s waiting.”</w:t>
+      </w:r>
+    </w:p>
+    <w:p>
+      <w:pPr>
+        <w:pStyle w:val="BodyText"/>
+      </w:pPr>
+      <w:r>
+        <w:t xml:space="preserve">Cole heard the word and filed it. Waiting. The channels were waiting. The compound that had killed Marcus Reeves, that had driven them from the original settlement, that had consumed Elena’s colony centimeter by centimeter — that substance, in its ancient form, was sitting in the walls beneath their shelters. Dormant. Mineralized. Waiting.</w:t>
+      </w:r>
+    </w:p>
+    <w:p>
+      <w:pPr>
+        <w:pStyle w:val="BodyText"/>
+      </w:pPr>
+      <w:r>
+        <w:t xml:space="preserve">“Waiting for what?”</w:t>
+      </w:r>
+      <w:r>
+        <w:t xml:space="preserve"> </w:t>
+      </w:r>
+      <w:r>
+        <w:t xml:space="preserve">Ren asked.</w:t>
+      </w:r>
+    </w:p>
+    <w:p>
+      <w:pPr>
+        <w:pStyle w:val="BodyText"/>
+      </w:pPr>
+      <w:r>
+        <w:t xml:space="preserve">“For the cycle to deepen enough to reactivate it. The surface creep is the active phase. What’s in the channels is the stored phase. If the orbital mechanics produce a deep enough cycle — one that goes past what we’ve already seen — the stored compound could theoretically reactivate.”</w:t>
+      </w:r>
+    </w:p>
+    <w:p>
+      <w:pPr>
+        <w:pStyle w:val="BodyText"/>
+      </w:pPr>
+      <w:r>
+        <w:t xml:space="preserve">“Theoretically,”</w:t>
+      </w:r>
+      <w:r>
+        <w:t xml:space="preserve"> </w:t>
+      </w:r>
+      <w:r>
+        <w:t xml:space="preserve">Cole said.</w:t>
+      </w:r>
+    </w:p>
+    <w:p>
+      <w:pPr>
+        <w:pStyle w:val="BodyText"/>
+      </w:pPr>
+      <w:r>
+        <w:t xml:space="preserve">“Based on the data I have. The mineralization in the deepest channels is complete. Those sections haven’t been active in geological time. But the shallower channels — the secondary and capillary networks closer to the surface — the mineralization is less complete. Younger deposits. More recent cycles.”</w:t>
+      </w:r>
+    </w:p>
+    <w:p>
+      <w:pPr>
+        <w:pStyle w:val="BodyText"/>
+      </w:pPr>
+      <w:r>
+        <w:t xml:space="preserve">Cole looked at the map. The deep channels, fully mineralized, ran like bones beneath the settlement. The shallower ones branched upward, closer to the surface, the compound less glassy, more granular. Transitional. The deeper you went, the older and more inert the material. The shallower you went, the closer it was to the thing that still moved through the forest.</w:t>
+      </w:r>
+    </w:p>
+    <w:p>
+      <w:pPr>
+        <w:pStyle w:val="BodyText"/>
+      </w:pPr>
+      <w:r>
+        <w:t xml:space="preserve">“We need to map the activation thresholds,”</w:t>
+      </w:r>
+      <w:r>
+        <w:t xml:space="preserve"> </w:t>
+      </w:r>
+      <w:r>
+        <w:t xml:space="preserve">Suri said. She was leaning over the table, tracing a capillary branch with her finger.</w:t>
+      </w:r>
+      <w:r>
+        <w:t xml:space="preserve"> </w:t>
+      </w:r>
+      <w:r>
+        <w:t xml:space="preserve">“If we can determine what conditions trigger reactivation in the shallow channels, we can predict when sections become dangerous.”</w:t>
+      </w:r>
+    </w:p>
+    <w:p>
+      <w:pPr>
+        <w:pStyle w:val="BodyText"/>
+      </w:pPr>
+      <w:r>
+        <w:t xml:space="preserve">It was a good question. Cole recognized it as the kind of question that came from someone who’d learned to think in systems — not just what is happening, but what would cause it to happen differently.</w:t>
+      </w:r>
+    </w:p>
+    <w:p>
+      <w:pPr>
+        <w:pStyle w:val="BodyText"/>
+      </w:pPr>
+      <w:r>
+        <w:t xml:space="preserve">“Agreed,”</w:t>
+      </w:r>
+      <w:r>
+        <w:t xml:space="preserve"> </w:t>
+      </w:r>
+      <w:r>
+        <w:t xml:space="preserve">Dana said.</w:t>
+      </w:r>
+      <w:r>
+        <w:t xml:space="preserve"> </w:t>
+      </w:r>
+      <w:r>
+        <w:t xml:space="preserve">“I’ll design the testing protocol. We’ll need ground temperature data, mineral composition at various depths, and samples from the transitional zones — the sections where full mineralization hasn’t occurred.”</w:t>
+      </w:r>
+    </w:p>
+    <w:p>
+      <w:pPr>
+        <w:pStyle w:val="BodyText"/>
+      </w:pPr>
+      <w:r>
+        <w:t xml:space="preserve">Cole approved the expanded research. Allocated one additional day per week for deep-channel exploration. The colony could afford it. The dormancy-phase crops were established, the water systems were running through the channels’ own drainage, and the creep hadn’t followed them to the rock substrate. For the first time in months, Cole felt something that wasn’t dread. Not optimism — he didn’t trust optimism. Something more structural. The sense that the problem had a shape he could see, and the shape had edges he could work with.</w:t>
+      </w:r>
+    </w:p>
+    <w:p>
+      <w:pPr>
+        <w:pStyle w:val="BodyText"/>
+      </w:pPr>
+      <w:r>
+        <w:t xml:space="preserve">The channels were a system. The creep was a phase of that system. The planet operated on cycles that could be mapped, predicted, integrated. Dana had cracked the soil. She was close to cracking the creep. The builders had already solved this problem, thousands of years ago. Their solution was carved into the bedrock. All the colony had to do was read it.</w:t>
+      </w:r>
+    </w:p>
+    <w:p>
+      <w:pPr>
+        <w:pStyle w:val="BodyText"/>
+      </w:pPr>
+      <w:r>
+        <w:t xml:space="preserve">Cole believed that. Standing over the maps, looking at the elegant branching network, listening to Dana explain the circulatory logic, watching Suri trace the capillary paths with her finger — he believed they were close to understanding. The planet wasn’t hostile. It was a system. Systems could be learned.</w:t>
+      </w:r>
+    </w:p>
+    <w:p>
+      <w:pPr>
+        <w:pStyle w:val="BodyText"/>
+      </w:pPr>
+      <w:r>
+        <w:t xml:space="preserve">That belief was the most dangerous thing Cole had carried since landing.</w:t>
       </w:r>
     </w:p>
     <w:p>
@@ -9821,75 +10143,89 @@
         <w:pStyle w:val="FirstParagraph"/>
       </w:pPr>
       <w:r>
-        <w:t xml:space="preserve">Ren pushed for research teams. Cole allocated three people: Dana for the biological analysis, David for the geological survey, and a rotating fourth position for general assistance. He kept the teams small because every person studying channels was a person not building shelters, not tending the dormancy-phase crops, not maintaining the systems that kept thirty-six people breathing.</w:t>
-      </w:r>
-    </w:p>
-    <w:p>
-      <w:pPr>
-        <w:pStyle w:val="BodyText"/>
-      </w:pPr>
-      <w:r>
-        <w:t xml:space="preserve">Suri Park volunteered for the fourth position on the first day.</w:t>
-      </w:r>
-    </w:p>
-    <w:p>
-      <w:pPr>
-        <w:pStyle w:val="BodyText"/>
-      </w:pPr>
-      <w:r>
-        <w:t xml:space="preserve">Cole almost said no. Not because Suri was unqualified — she’d been working as Dana’s field assistant since the fruit incident in Month One, when she’d eaten the native berries that nearly killed her and then come back the next week asking Dana to teach her how to test samples properly. Suri had the curiosity that made people useful and the eagerness that made them careless, but eight months of working with Dana had filed the carelessness down to something closer to controlled intensity. She asked questions before she touched things now. She waited for data before she acted.</w:t>
-      </w:r>
-    </w:p>
-    <w:p>
-      <w:pPr>
-        <w:pStyle w:val="BodyText"/>
-      </w:pPr>
-      <w:r>
-        <w:t xml:space="preserve">Cole said yes because Suri had earned it. She’d survived the thing that should have taught her to be afraid, and instead it had taught her to be precise. He respected that more than he respected caution.</w:t>
-      </w:r>
-    </w:p>
-    <w:p>
-      <w:pPr>
-        <w:pStyle w:val="BodyText"/>
-      </w:pPr>
-      <w:r>
-        <w:t xml:space="preserve">The research moved quickly. Over six weeks, the team mapped the channel network beneath the settlement and extending two hundred meters in each direction. The branches were systematic — main arteries splitting into secondary channels, secondary channels splitting into capillary networks so fine they could only be detected with Dana’s ground-penetrating analysis. The geometry was consistent. The mineralized compound filled every channel to a uniform depth, as though the entire network had been activated simultaneously and then gone inert at the same moment.</w:t>
-      </w:r>
-    </w:p>
-    <w:p>
-      <w:pPr>
-        <w:pStyle w:val="BodyText"/>
-      </w:pPr>
-      <w:r>
-        <w:t xml:space="preserve">Dana’s working theory: the channels were a planetary circulatory system. During active orbital phases, living creep — the biological mat — would flow through the network, transporting nutrients, breaking down dead matter, redistributing minerals. During dormant phases, the compound would mineralize, preserving the infrastructure for the next cycle. The builders hadn’t fought the planet’s cycles. They’d built with them. Used the creep as a construction material, a transport medium, a living tool.</w:t>
-      </w:r>
-    </w:p>
-    <w:p>
-      <w:pPr>
-        <w:pStyle w:val="BodyText"/>
-      </w:pPr>
-      <w:r>
-        <w:t xml:space="preserve">“It’s elegant,”</w:t>
-      </w:r>
-      <w:r>
-        <w:t xml:space="preserve"> </w:t>
-      </w:r>
-      <w:r>
-        <w:t xml:space="preserve">Dana said one evening, spreading her maps across the research shelter’s table. Cole, Ren, and Suri were there. The light outside was fading, the green-shifted sky darkening toward something that wasn’t quite night.</w:t>
-      </w:r>
-      <w:r>
-        <w:t xml:space="preserve"> </w:t>
-      </w:r>
-      <w:r>
-        <w:t xml:space="preserve">“The planet has a circulatory system. The builders understood it. They didn’t try to stop the cycles or survive them — they integrated. The channels are infrastructure that works with the planet instead of against it.”</w:t>
-      </w:r>
-    </w:p>
-    <w:p>
-      <w:pPr>
-        <w:pStyle w:val="BodyText"/>
-      </w:pPr>
-      <w:r>
-        <w:t xml:space="preserve">“Infrastructure that’s been dead for tens of thousands of years,”</w:t>
+        <w:t xml:space="preserve">Month 12, Day 8. Cole, Dana, Suri, and Ren descended into the deepest accessible section of the channel network.</w:t>
+      </w:r>
+    </w:p>
+    <w:p>
+      <w:pPr>
+        <w:pStyle w:val="BodyText"/>
+      </w:pPr>
+      <w:r>
+        <w:t xml:space="preserve">The excavation team had opened a shaft two weeks earlier — a natural fracture in the bedrock that intersected one of the primary channels. The channel was wide enough to walk through at the upper levels, narrowing as it descended. The walls were lined with the mineralized compound, the surface catching their lamplight in slow ripples of smoky translucence. The air was cool. Dry. It smelled like stone and something faintly metallic, the same trace mineral scent that lived in the water they’d been drinking.</w:t>
+      </w:r>
+    </w:p>
+    <w:p>
+      <w:pPr>
+        <w:pStyle w:val="BodyText"/>
+      </w:pPr>
+      <w:r>
+        <w:t xml:space="preserve">They’d explored this section three times before. Each time, the compound had been inert. Glassy. Cold to the touch. Dana had taken samples from the walls at every depth, tested conductivity, moisture content, thermal response. Dead material. Museum-quality preservation of something that had once been alive, now serving only as infrastructure.</w:t>
+      </w:r>
+    </w:p>
+    <w:p>
+      <w:pPr>
+        <w:pStyle w:val="BodyText"/>
+      </w:pPr>
+      <w:r>
+        <w:t xml:space="preserve">Cole led. Ren followed with the mapping equipment. Dana stopped at intervals to sample the wall composition, noting changes in the mineralization gradient. Suri moved between them, documenting, asking questions, pressing her palm flat against the channel walls the way she’d started doing on the second expedition — feeling for temperature variations, moisture, anything the instruments might miss.</w:t>
+      </w:r>
+    </w:p>
+    <w:p>
+      <w:pPr>
+        <w:pStyle w:val="BodyText"/>
+      </w:pPr>
+      <w:r>
+        <w:t xml:space="preserve">“The gradient is shifting,”</w:t>
+      </w:r>
+      <w:r>
+        <w:t xml:space="preserve"> </w:t>
+      </w:r>
+      <w:r>
+        <w:t xml:space="preserve">Dana said at the seven-meter depth mark. She was studying a sample under portable magnification, the light from her headlamp pooling on the container.</w:t>
+      </w:r>
+      <w:r>
+        <w:t xml:space="preserve"> </w:t>
+      </w:r>
+      <w:r>
+        <w:t xml:space="preserve">“The mineralization is less complete here. See the granular structure? This section is younger. Deposited during a more recent cycle.”</w:t>
+      </w:r>
+    </w:p>
+    <w:p>
+      <w:pPr>
+        <w:pStyle w:val="BodyText"/>
+      </w:pPr>
+      <w:r>
+        <w:t xml:space="preserve">Cole looked. The compound in the walls did look different — less glassy, more textite. The surface had a faint roughness, like sugar that hadn’t fully dissolved.</w:t>
+      </w:r>
+    </w:p>
+    <w:p>
+      <w:pPr>
+        <w:pStyle w:val="BodyText"/>
+      </w:pPr>
+      <w:r>
+        <w:t xml:space="preserve">“Recent meaning what?”</w:t>
+      </w:r>
+      <w:r>
+        <w:t xml:space="preserve"> </w:t>
+      </w:r>
+      <w:r>
+        <w:t xml:space="preserve">he asked.</w:t>
+      </w:r>
+    </w:p>
+    <w:p>
+      <w:pPr>
+        <w:pStyle w:val="BodyText"/>
+      </w:pPr>
+      <w:r>
+        <w:t xml:space="preserve">“Hundreds of years instead of thousands. Maybe less. The transition between full mineralization and partial is gradual. We’re moving down through time layers — the deepest channels are the oldest, the shallower ones are newer.”</w:t>
+      </w:r>
+    </w:p>
+    <w:p>
+      <w:pPr>
+        <w:pStyle w:val="BodyText"/>
+      </w:pPr>
+      <w:r>
+        <w:t xml:space="preserve">“We’re going deeper,”</w:t>
       </w:r>
       <w:r>
         <w:t xml:space="preserve"> </w:t>
@@ -9897,63 +10233,93 @@
       <w:r>
         <w:t xml:space="preserve">Cole said.</w:t>
       </w:r>
-    </w:p>
-    <w:p>
-      <w:pPr>
-        <w:pStyle w:val="BodyText"/>
-      </w:pPr>
-      <w:r>
-        <w:t xml:space="preserve">“Dormant,”</w:t>
-      </w:r>
-      <w:r>
-        <w:t xml:space="preserve"> </w:t>
-      </w:r>
-      <w:r>
-        <w:t xml:space="preserve">Dana corrected.</w:t>
-      </w:r>
-      <w:r>
-        <w:t xml:space="preserve"> </w:t>
-      </w:r>
-      <w:r>
-        <w:t xml:space="preserve">“The compound mineralizes during dormancy. That doesn’t mean the system is permanently inactive. It means it’s waiting.”</w:t>
-      </w:r>
-    </w:p>
-    <w:p>
-      <w:pPr>
-        <w:pStyle w:val="BodyText"/>
-      </w:pPr>
-      <w:r>
-        <w:t xml:space="preserve">Cole heard the word and filed it. Waiting. The channels were waiting. The compound that had killed Marcus Reeves, that had driven them from the original settlement, that had consumed Elena’s colony centimeter by centimeter — that substance, in its ancient form, was sitting in the walls beneath their shelters. Dormant. Mineralized. Waiting.</w:t>
-      </w:r>
-    </w:p>
-    <w:p>
-      <w:pPr>
-        <w:pStyle w:val="BodyText"/>
-      </w:pPr>
-      <w:r>
-        <w:t xml:space="preserve">“Waiting for what?”</w:t>
-      </w:r>
-      <w:r>
-        <w:t xml:space="preserve"> </w:t>
-      </w:r>
-      <w:r>
-        <w:t xml:space="preserve">Ren asked.</w:t>
-      </w:r>
-    </w:p>
-    <w:p>
-      <w:pPr>
-        <w:pStyle w:val="BodyText"/>
-      </w:pPr>
-      <w:r>
-        <w:t xml:space="preserve">“For the cycle to deepen enough to reactivate it. The surface creep is the active phase. What’s in the channels is the stored phase. If the orbital mechanics produce a deep enough cycle — one that goes past what we’ve already seen — the stored compound could theoretically reactivate.”</w:t>
-      </w:r>
-    </w:p>
-    <w:p>
-      <w:pPr>
-        <w:pStyle w:val="BodyText"/>
-      </w:pPr>
-      <w:r>
-        <w:t xml:space="preserve">“Theoretically,”</w:t>
+      <w:r>
+        <w:t xml:space="preserve"> </w:t>
+      </w:r>
+      <w:r>
+        <w:t xml:space="preserve">“So we’re going older.”</w:t>
+      </w:r>
+    </w:p>
+    <w:p>
+      <w:pPr>
+        <w:pStyle w:val="BodyText"/>
+      </w:pPr>
+      <w:r>
+        <w:t xml:space="preserve">“In the main channels, yes. But the capillary branches that intersect the primaries can be any age. Some were deposited recently — within the current set of orbital cycles. The planet keeps building.”</w:t>
+      </w:r>
+    </w:p>
+    <w:p>
+      <w:pPr>
+        <w:pStyle w:val="BodyText"/>
+      </w:pPr>
+      <w:r>
+        <w:t xml:space="preserve">They continued down. The channel narrowed at the nine-meter mark. Cole had to turn sideways to pass a rock shelf that jutted into the passage. Beyond it, the channel widened again into a junction — two primary channels meeting at an angle, the walls thicker with the mineralized compound, the geometric precision of the carved stone visible where the coating had cracked and fallen away.</w:t>
+      </w:r>
+    </w:p>
+    <w:p>
+      <w:pPr>
+        <w:pStyle w:val="BodyText"/>
+      </w:pPr>
+      <w:r>
+        <w:t xml:space="preserve">Suri moved ahead of Cole into the junction. She did that — moved toward the interesting thing, the next data point, the question that was forming in her head. Dana had trained the recklessness out of her, but the curiosity remained. It was why she was useful. It was the thing Cole valued.</w:t>
+      </w:r>
+    </w:p>
+    <w:p>
+      <w:pPr>
+        <w:pStyle w:val="BodyText"/>
+      </w:pPr>
+      <w:r>
+        <w:t xml:space="preserve">“The walls are different here,”</w:t>
+      </w:r>
+      <w:r>
+        <w:t xml:space="preserve"> </w:t>
+      </w:r>
+      <w:r>
+        <w:t xml:space="preserve">Suri said. She was pressing her palm against the junction wall, the way she always did.</w:t>
+      </w:r>
+      <w:r>
+        <w:t xml:space="preserve"> </w:t>
+      </w:r>
+      <w:r>
+        <w:t xml:space="preserve">“Warmer. Not warm, but warmer than the upper sections. Can you feel it?”</w:t>
+      </w:r>
+    </w:p>
+    <w:p>
+      <w:pPr>
+        <w:pStyle w:val="BodyText"/>
+      </w:pPr>
+      <w:r>
+        <w:t xml:space="preserve">Cole placed his hand on the wall. She was right. A few degrees above the ambient rock temperature. Not alarming. Consistent with geothermal activity at depth. He noted it.</w:t>
+      </w:r>
+    </w:p>
+    <w:p>
+      <w:pPr>
+        <w:pStyle w:val="BodyText"/>
+      </w:pPr>
+      <w:r>
+        <w:t xml:space="preserve">Dana was ten meters back, still sampling at the gradient transition. Ren was between them, recording the junction’s dimensions.</w:t>
+      </w:r>
+    </w:p>
+    <w:p>
+      <w:pPr>
+        <w:pStyle w:val="BodyText"/>
+      </w:pPr>
+      <w:r>
+        <w:t xml:space="preserve">“I want to check the capillary branch,”</w:t>
+      </w:r>
+      <w:r>
+        <w:t xml:space="preserve"> </w:t>
+      </w:r>
+      <w:r>
+        <w:t xml:space="preserve">Suri said, pointing at a narrow channel that split off from the junction at a downward angle. It was barely wide enough for a person. The mineralized compound on its walls was visibly different — more granular, less glassy, the surface rough under the lamplight. A younger deposit. Closer to active.</w:t>
+      </w:r>
+    </w:p>
+    <w:p>
+      <w:pPr>
+        <w:pStyle w:val="BodyText"/>
+      </w:pPr>
+      <w:r>
+        <w:t xml:space="preserve">“Take a temperature reading first,”</w:t>
       </w:r>
       <w:r>
         <w:t xml:space="preserve"> </w:t>
@@ -9967,95 +10333,323 @@
         <w:pStyle w:val="BodyText"/>
       </w:pPr>
       <w:r>
-        <w:t xml:space="preserve">“Based on the data I have. The mineralization in the deepest channels is complete. Those sections haven’t been active in geological time. But the shallower channels — the secondary and capillary networks closer to the surface — the mineralization is less complete. Younger deposits. More recent cycles.”</w:t>
-      </w:r>
-    </w:p>
-    <w:p>
-      <w:pPr>
-        <w:pStyle w:val="BodyText"/>
-      </w:pPr>
-      <w:r>
-        <w:t xml:space="preserve">Cole looked at the map. The deep channels, fully mineralized, ran like bones beneath the settlement. The shallower ones branched upward, closer to the surface, the compound less glassy, more granular. Transitional. The deeper you went, the older and more inert the material. The shallower you went, the closer it was to the thing that still moved through the forest.</w:t>
-      </w:r>
-    </w:p>
-    <w:p>
-      <w:pPr>
-        <w:pStyle w:val="BodyText"/>
-      </w:pPr>
-      <w:r>
-        <w:t xml:space="preserve">“We need to map the activation thresholds,”</w:t>
-      </w:r>
-      <w:r>
-        <w:t xml:space="preserve"> </w:t>
-      </w:r>
-      <w:r>
-        <w:t xml:space="preserve">Suri said. She was leaning over the table, tracing a capillary branch with her finger.</w:t>
-      </w:r>
-      <w:r>
-        <w:t xml:space="preserve"> </w:t>
-      </w:r>
-      <w:r>
-        <w:t xml:space="preserve">“If we can determine what conditions trigger reactivation in the shallow channels, we can predict when sections become dangerous.”</w:t>
-      </w:r>
-    </w:p>
-    <w:p>
-      <w:pPr>
-        <w:pStyle w:val="BodyText"/>
-      </w:pPr>
-      <w:r>
-        <w:t xml:space="preserve">It was a good question. Cole recognized it as the kind of question that came from someone who’d learned to think in systems — not just what is happening, but what would cause it to happen differently.</w:t>
-      </w:r>
-    </w:p>
-    <w:p>
-      <w:pPr>
-        <w:pStyle w:val="BodyText"/>
-      </w:pPr>
-      <w:r>
-        <w:t xml:space="preserve">“Agreed,”</w:t>
-      </w:r>
-      <w:r>
-        <w:t xml:space="preserve"> </w:t>
-      </w:r>
-      <w:r>
-        <w:t xml:space="preserve">Dana said.</w:t>
-      </w:r>
-      <w:r>
-        <w:t xml:space="preserve"> </w:t>
-      </w:r>
-      <w:r>
-        <w:t xml:space="preserve">“I’ll design the testing protocol. We’ll need ground temperature data, mineral composition at various depths, and samples from the transitional zones — the sections where full mineralization hasn’t occurred.”</w:t>
-      </w:r>
-    </w:p>
-    <w:p>
-      <w:pPr>
-        <w:pStyle w:val="BodyText"/>
-      </w:pPr>
-      <w:r>
-        <w:t xml:space="preserve">Cole approved the expanded research. Allocated one additional day per week for deep-channel exploration. The colony could afford it. The dormancy-phase crops were established, the water systems were running through the channels’ own drainage, and the creep hadn’t followed them to the rock substrate. For the first time in months, Cole felt something that wasn’t dread. Not optimism — he didn’t trust optimism. Something more structural. The sense that the problem had a shape he could see, and the shape had edges he could work with.</w:t>
-      </w:r>
-    </w:p>
-    <w:p>
-      <w:pPr>
-        <w:pStyle w:val="BodyText"/>
-      </w:pPr>
-      <w:r>
-        <w:t xml:space="preserve">The channels were a system. The creep was a phase of that system. The planet operated on cycles that could be mapped, predicted, integrated. Dana had cracked the soil. She was close to cracking the creep. The builders had already solved this problem, thousands of years ago. Their solution was carved into the bedrock. All the colony had to do was read it.</w:t>
-      </w:r>
-    </w:p>
-    <w:p>
-      <w:pPr>
-        <w:pStyle w:val="BodyText"/>
-      </w:pPr>
-      <w:r>
-        <w:t xml:space="preserve">Cole believed that. Standing over the maps, looking at the elegant branching network, listening to Dana explain the circulatory logic, watching Suri trace the capillary paths with her finger — he believed they were close to understanding. The planet wasn’t hostile. It was a system. Systems could be learned.</w:t>
-      </w:r>
-    </w:p>
-    <w:p>
-      <w:pPr>
-        <w:pStyle w:val="BodyText"/>
-      </w:pPr>
-      <w:r>
-        <w:t xml:space="preserve">That belief was the most dangerous thing Cole had carried since landing.</w:t>
+        <w:t xml:space="preserve">Suri pulled the thermal probe from her kit. Held it against the capillary wall.</w:t>
+      </w:r>
+      <w:r>
+        <w:t xml:space="preserve"> </w:t>
+      </w:r>
+      <w:r>
+        <w:t xml:space="preserve">“Four degrees above ambient. Consistent with what we’ve been seeing. No anomalies.”</w:t>
+      </w:r>
+    </w:p>
+    <w:p>
+      <w:pPr>
+        <w:pStyle w:val="BodyText"/>
+      </w:pPr>
+      <w:r>
+        <w:t xml:space="preserve">“Go ahead. Stay within voice range.”</w:t>
+      </w:r>
+    </w:p>
+    <w:p>
+      <w:pPr>
+        <w:pStyle w:val="BodyText"/>
+      </w:pPr>
+      <w:r>
+        <w:t xml:space="preserve">Suri entered the capillary branch. Cole watched her lamplight shrink as she moved down the narrow passage, her shoulders brushing the walls, the light catching the granular compound on either side of her. She was taking samples as she went — scraping the wall surface into collection vials, labeling them, methodical.</w:t>
+      </w:r>
+    </w:p>
+    <w:p>
+      <w:pPr>
+        <w:pStyle w:val="BodyText"/>
+      </w:pPr>
+      <w:r>
+        <w:t xml:space="preserve">Cole turned back to the junction. He was examining the geometric patterns in the carved stone — the precision of the angles, the uniformity of the channel width — when the air changed.</w:t>
+      </w:r>
+    </w:p>
+    <w:p>
+      <w:pPr>
+        <w:pStyle w:val="BodyText"/>
+      </w:pPr>
+      <w:r>
+        <w:t xml:space="preserve">Not temperature. Not smell. Something more fundamental. A vibration, subsonic, the same frequency range as the humming trees but concentrated, directional. It came through the rock. Through his hands where they rested on the junction wall. Through the soles of his boots. The channel was resonating.</w:t>
+      </w:r>
+    </w:p>
+    <w:p>
+      <w:pPr>
+        <w:pStyle w:val="BodyText"/>
+      </w:pPr>
+      <w:r>
+        <w:t xml:space="preserve">Dana felt it too. She was on her feet, moving toward him, her face carrying the expression she wore when data reorganized itself faster than she could process.</w:t>
+      </w:r>
+    </w:p>
+    <w:p>
+      <w:pPr>
+        <w:pStyle w:val="BodyText"/>
+      </w:pPr>
+      <w:r>
+        <w:t xml:space="preserve">“Cole,”</w:t>
+      </w:r>
+      <w:r>
+        <w:t xml:space="preserve"> </w:t>
+      </w:r>
+      <w:r>
+        <w:t xml:space="preserve">she said.</w:t>
+      </w:r>
+      <w:r>
+        <w:t xml:space="preserve"> </w:t>
+      </w:r>
+      <w:r>
+        <w:t xml:space="preserve">“The thermal readings just spiked. The capillary networks. All of them. Simultaneously.”</w:t>
+      </w:r>
+    </w:p>
+    <w:p>
+      <w:pPr>
+        <w:pStyle w:val="BodyText"/>
+      </w:pPr>
+      <w:r>
+        <w:t xml:space="preserve">He turned toward the capillary branch where Suri had gone. The lamplight was still visible, thirty meters down the narrow passage. Suri’s voice came back:</w:t>
+      </w:r>
+      <w:r>
+        <w:t xml:space="preserve"> </w:t>
+      </w:r>
+      <w:r>
+        <w:t xml:space="preserve">“The walls are changing. The surface — it’s getting soft. Like the mineralization is reversing.”</w:t>
+      </w:r>
+    </w:p>
+    <w:p>
+      <w:pPr>
+        <w:pStyle w:val="BodyText"/>
+      </w:pPr>
+      <w:r>
+        <w:t xml:space="preserve">Cole was already moving. The passage was tight. His shoulders scraped the walls. The compound on either side of him — the glassy, inert, ancient material — was warm now. Not geothermal warm. Active warm. The surface had developed a sheen, a faint moisture that hadn’t been there ten minutes ago. The mineralization was reversing. The stored phase was waking up.</w:t>
+      </w:r>
+    </w:p>
+    <w:p>
+      <w:pPr>
+        <w:pStyle w:val="BodyText"/>
+      </w:pPr>
+      <w:r>
+        <w:t xml:space="preserve">“Suri, come back. Now.”</w:t>
+      </w:r>
+    </w:p>
+    <w:p>
+      <w:pPr>
+        <w:pStyle w:val="BodyText"/>
+      </w:pPr>
+      <w:r>
+        <w:t xml:space="preserve">“I’m coming. The floor is — Cole, the floor is moving. There’s flow. It’s thin but it’s moving.”</w:t>
+      </w:r>
+    </w:p>
+    <w:p>
+      <w:pPr>
+        <w:pStyle w:val="BodyText"/>
+      </w:pPr>
+      <w:r>
+        <w:t xml:space="preserve">He could see her lamplight bouncing as she turned. Twenty meters between them. The capillary channel was too narrow for him to pass her. She had to come to him.</w:t>
+      </w:r>
+    </w:p>
+    <w:p>
+      <w:pPr>
+        <w:pStyle w:val="BodyText"/>
+      </w:pPr>
+      <w:r>
+        <w:t xml:space="preserve">Then the vibration deepened. The walls pulsed — not metaphorically, not in his imagination. The compound expanded. The channel narrowed by centimeters. The floor, which had been solid rock coated with mineralized compound, was now coated with something that had the consistency of wet calcium. Flowing. Slowly. The dormant channels reactivating in response to the deepening cycle, the same way the surface creep had activated months ago, but down here the compound was concentrated, old, and dense.</w:t>
+      </w:r>
+    </w:p>
+    <w:p>
+      <w:pPr>
+        <w:pStyle w:val="BodyText"/>
+      </w:pPr>
+      <w:r>
+        <w:t xml:space="preserve">Suri was moving toward him. Fifteen meters. She was fast. She was precise. She was doing everything right.</w:t>
+      </w:r>
+    </w:p>
+    <w:p>
+      <w:pPr>
+        <w:pStyle w:val="BodyText"/>
+      </w:pPr>
+      <w:r>
+        <w:t xml:space="preserve">The compound on the floor was rising. Not like water — like something growing. The filaments emerging from the mineralized base, the same lace-like structures Dana had documented in the surface creep, but denser. Older. Fed by whatever reserves the ancient network had stored during its long dormancy.</w:t>
+      </w:r>
+    </w:p>
+    <w:p>
+      <w:pPr>
+        <w:pStyle w:val="BodyText"/>
+      </w:pPr>
+      <w:r>
+        <w:t xml:space="preserve">“Cole.”</w:t>
+      </w:r>
+      <w:r>
+        <w:t xml:space="preserve"> </w:t>
+      </w:r>
+      <w:r>
+        <w:t xml:space="preserve">Suri’s voice wasn’t a scream. It was confusion. The tone of someone encountering a variable that didn’t match the model.</w:t>
+      </w:r>
+      <w:r>
+        <w:t xml:space="preserve"> </w:t>
+      </w:r>
+      <w:r>
+        <w:t xml:space="preserve">“It’s on my boots. I can’t — it’s dissolving the soles.”</w:t>
+      </w:r>
+    </w:p>
+    <w:p>
+      <w:pPr>
+        <w:pStyle w:val="BodyText"/>
+      </w:pPr>
+      <w:r>
+        <w:t xml:space="preserve">He could see her now. Twelve meters. She was walking, not running, because running in a narrow channel with dissolving footing was how you fell, and falling was how you died. She was being precise. She was thinking.</w:t>
+      </w:r>
+    </w:p>
+    <w:p>
+      <w:pPr>
+        <w:pStyle w:val="BodyText"/>
+      </w:pPr>
+      <w:r>
+        <w:t xml:space="preserve">The compound was at her ankles.</w:t>
+      </w:r>
+    </w:p>
+    <w:p>
+      <w:pPr>
+        <w:pStyle w:val="BodyText"/>
+      </w:pPr>
+      <w:r>
+        <w:t xml:space="preserve">Cole pushed deeper into the capillary. His own boots met the flow — thin, warm, the surface of the rock slick with reactivated compound. He felt the dissolution start on the rubber soles. The filaments were indiscriminate. Marcus Reeves. The same process. Except Reeves had been asleep and this was happening in real time, in a channel barely wide enough for one person, with Suri ten meters ahead of him and the gap between them full of something that was waking up faster than either of them could move.</w:t>
+      </w:r>
+    </w:p>
+    <w:p>
+      <w:pPr>
+        <w:pStyle w:val="BodyText"/>
+      </w:pPr>
+      <w:r>
+        <w:t xml:space="preserve">“Suri. Keep coming.”</w:t>
+      </w:r>
+    </w:p>
+    <w:p>
+      <w:pPr>
+        <w:pStyle w:val="BodyText"/>
+      </w:pPr>
+      <w:r>
+        <w:t xml:space="preserve">“I am.”</w:t>
+      </w:r>
+      <w:r>
+        <w:t xml:space="preserve"> </w:t>
+      </w:r>
+      <w:r>
+        <w:t xml:space="preserve">Her voice was controlled. Tight. She was looking down at her feet, at the compound climbing her boot shafts. She took another step. Another. Eight meters.</w:t>
+      </w:r>
+    </w:p>
+    <w:p>
+      <w:pPr>
+        <w:pStyle w:val="BodyText"/>
+      </w:pPr>
+      <w:r>
+        <w:t xml:space="preserve">Cole reached for her. The channel was too narrow. He couldn’t get past the rock shelf that jutted into the passage. His arm extended into the space, his hand open, and Suri’s hand reaching back, and between them the compound flowing, rising, the ancient system cycling into its active phase in a section that had been dormant every time they’d walked through it.</w:t>
+      </w:r>
+    </w:p>
+    <w:p>
+      <w:pPr>
+        <w:pStyle w:val="BodyText"/>
+      </w:pPr>
+      <w:r>
+        <w:t xml:space="preserve">Suri’s feet stopped moving. The compound had reached her shins. She looked down. Looked at Cole. Her face held the expression of someone doing a calculation that didn’t produce a survivable answer.</w:t>
+      </w:r>
+    </w:p>
+    <w:p>
+      <w:pPr>
+        <w:pStyle w:val="BodyText"/>
+      </w:pPr>
+      <w:r>
+        <w:t xml:space="preserve">“I can’t feel my feet,”</w:t>
+      </w:r>
+      <w:r>
+        <w:t xml:space="preserve"> </w:t>
+      </w:r>
+      <w:r>
+        <w:t xml:space="preserve">she said.</w:t>
+      </w:r>
+    </w:p>
+    <w:p>
+      <w:pPr>
+        <w:pStyle w:val="BodyText"/>
+      </w:pPr>
+      <w:r>
+        <w:t xml:space="preserve">“Suri.”</w:t>
+      </w:r>
+    </w:p>
+    <w:p>
+      <w:pPr>
+        <w:pStyle w:val="BodyText"/>
+      </w:pPr>
+      <w:r>
+        <w:t xml:space="preserve">“I know.”</w:t>
+      </w:r>
+      <w:r>
+        <w:t xml:space="preserve"> </w:t>
+      </w:r>
+      <w:r>
+        <w:t xml:space="preserve">Two syllables that held everything — the understanding, the mathematics, the impossibility of her position. She reached her hand forward. Cole stretched until his shoulder ground against the rock shelf. Their fingers touched. The compound was at her knees.</w:t>
+      </w:r>
+    </w:p>
+    <w:p>
+      <w:pPr>
+        <w:pStyle w:val="BodyText"/>
+      </w:pPr>
+      <w:r>
+        <w:t xml:space="preserve">The dissolution was fast. Faster than the surface creep. Concentrated. The ancient compound, reactivated after centuries or millennia of dormancy, had reserves the surface version didn’t. It moved through Suri’s lower body with the efficiency of a system resuming function after a long pause — not aggressive, not hostile. Just operational. Doing what it was designed to do: break down organic material, cycle nutrients, build infrastructure. Suri was organic material. The compound didn’t distinguish.</w:t>
+      </w:r>
+    </w:p>
+    <w:p>
+      <w:pPr>
+        <w:pStyle w:val="BodyText"/>
+      </w:pPr>
+      <w:r>
+        <w:t xml:space="preserve">Ren was behind Cole, pulling at his shoulder.</w:t>
+      </w:r>
+      <w:r>
+        <w:t xml:space="preserve"> </w:t>
+      </w:r>
+      <w:r>
+        <w:t xml:space="preserve">“Cole. Come back.”</w:t>
+      </w:r>
+    </w:p>
+    <w:p>
+      <w:pPr>
+        <w:pStyle w:val="BodyText"/>
+      </w:pPr>
+      <w:r>
+        <w:t xml:space="preserve">“No.”</w:t>
+      </w:r>
+    </w:p>
+    <w:p>
+      <w:pPr>
+        <w:pStyle w:val="BodyText"/>
+      </w:pPr>
+      <w:r>
+        <w:t xml:space="preserve">“You can’t reach her. Cole. You can’t.”</w:t>
+      </w:r>
+    </w:p>
+    <w:p>
+      <w:pPr>
+        <w:pStyle w:val="BodyText"/>
+      </w:pPr>
+      <w:r>
+        <w:t xml:space="preserve">Suri’s hand went slack. Her eyes were open but the focus was gone — shock, neural disruption, the same unconsciousness that had been Haruki’s single mercy for Marcus Reeves. She was unconscious before the significant dissolution. That was the only comfort available, and it wasn’t enough.</w:t>
+      </w:r>
+    </w:p>
+    <w:p>
+      <w:pPr>
+        <w:pStyle w:val="BodyText"/>
+      </w:pPr>
+      <w:r>
+        <w:t xml:space="preserve">Cole let Ren pull him back. They retreated up the channel, boots dissolving, the compound following them at the pace of something patient, and reached the junction as the capillary branch behind them filled with active compound. The main channels — the deep, fully mineralized arteries — remained inert. The activation was localized. A capillary response. A shallow branch waking up because the cycle had deepened past the threshold the younger deposits needed.</w:t>
+      </w:r>
+    </w:p>
+    <w:p>
+      <w:pPr>
+        <w:pStyle w:val="BodyText"/>
+      </w:pPr>
+      <w:r>
+        <w:t xml:space="preserve">Dana was at the shaft entrance, pulling them up. Cole’s hands were bleeding where the rock shelf had scraped them. He didn’t feel it.</w:t>
       </w:r>
     </w:p>
     <w:p>
@@ -10070,513 +10664,31 @@
         <w:pStyle w:val="FirstParagraph"/>
       </w:pPr>
       <w:r>
-        <w:t xml:space="preserve">Month 12, Day 8. Cole, Dana, Suri, and Ren descended into the deepest accessible section of the channel network.</w:t>
-      </w:r>
-    </w:p>
-    <w:p>
-      <w:pPr>
-        <w:pStyle w:val="BodyText"/>
-      </w:pPr>
-      <w:r>
-        <w:t xml:space="preserve">The excavation team had opened a shaft two weeks earlier — a natural fracture in the bedrock that intersected one of the primary channels. The channel was wide enough to walk through at the upper levels, narrowing as it descended. The walls were lined with the mineralized compound, the surface catching their lamplight in slow ripples of smoky translucence. The air was cool. Dry. It smelled like stone and something faintly metallic, the same trace mineral scent that lived in the water they’d been drinking.</w:t>
-      </w:r>
-    </w:p>
-    <w:p>
-      <w:pPr>
-        <w:pStyle w:val="BodyText"/>
-      </w:pPr>
-      <w:r>
-        <w:t xml:space="preserve">They’d explored this section three times before. Each time, the compound had been inert. Glassy. Cold to the touch. Dana had taken samples from the walls at every depth, tested conductivity, moisture content, thermal response. Dead material. Museum-quality preservation of something that had once been alive, now serving only as infrastructure.</w:t>
-      </w:r>
-    </w:p>
-    <w:p>
-      <w:pPr>
-        <w:pStyle w:val="BodyText"/>
-      </w:pPr>
-      <w:r>
-        <w:t xml:space="preserve">Cole led. Ren followed with the mapping equipment. Dana stopped at intervals to sample the wall composition, noting changes in the mineralization gradient. Suri moved between them, documenting, asking questions, pressing her palm flat against the channel walls the way she’d started doing on the second expedition — feeling for temperature variations, moisture, anything the instruments might miss.</w:t>
-      </w:r>
-    </w:p>
-    <w:p>
-      <w:pPr>
-        <w:pStyle w:val="BodyText"/>
-      </w:pPr>
-      <w:r>
-        <w:t xml:space="preserve">“The gradient is shifting,”</w:t>
-      </w:r>
-      <w:r>
-        <w:t xml:space="preserve"> </w:t>
-      </w:r>
-      <w:r>
-        <w:t xml:space="preserve">Dana said at the seven-meter depth mark. She was studying a sample under portable magnification, the light from her headlamp pooling on the container.</w:t>
-      </w:r>
-      <w:r>
-        <w:t xml:space="preserve"> </w:t>
-      </w:r>
-      <w:r>
-        <w:t xml:space="preserve">“The mineralization is less complete here. See the granular structure? This section is younger. Deposited during a more recent cycle.”</w:t>
-      </w:r>
-    </w:p>
-    <w:p>
-      <w:pPr>
-        <w:pStyle w:val="BodyText"/>
-      </w:pPr>
-      <w:r>
-        <w:t xml:space="preserve">Cole looked. The compound in the walls did look different — less glassy, more textite. The surface had a faint roughness, like sugar that hadn’t fully dissolved.</w:t>
-      </w:r>
-    </w:p>
-    <w:p>
-      <w:pPr>
-        <w:pStyle w:val="BodyText"/>
-      </w:pPr>
-      <w:r>
-        <w:t xml:space="preserve">“Recent meaning what?”</w:t>
-      </w:r>
-      <w:r>
-        <w:t xml:space="preserve"> </w:t>
-      </w:r>
-      <w:r>
-        <w:t xml:space="preserve">he asked.</w:t>
-      </w:r>
-    </w:p>
-    <w:p>
-      <w:pPr>
-        <w:pStyle w:val="BodyText"/>
-      </w:pPr>
-      <w:r>
-        <w:t xml:space="preserve">“Hundreds of years instead of thousands. Maybe less. The transition between full mineralization and partial is gradual. We’re moving down through time layers — the deepest channels are the oldest, the shallower ones are newer.”</w:t>
-      </w:r>
-    </w:p>
-    <w:p>
-      <w:pPr>
-        <w:pStyle w:val="BodyText"/>
-      </w:pPr>
-      <w:r>
-        <w:t xml:space="preserve">“We’re going deeper,”</w:t>
-      </w:r>
-      <w:r>
-        <w:t xml:space="preserve"> </w:t>
-      </w:r>
-      <w:r>
-        <w:t xml:space="preserve">Cole said.</w:t>
-      </w:r>
-      <w:r>
-        <w:t xml:space="preserve"> </w:t>
-      </w:r>
-      <w:r>
-        <w:t xml:space="preserve">“So we’re going older.”</w:t>
-      </w:r>
-    </w:p>
-    <w:p>
-      <w:pPr>
-        <w:pStyle w:val="BodyText"/>
-      </w:pPr>
-      <w:r>
-        <w:t xml:space="preserve">“In the main channels, yes. But the capillary branches that intersect the primaries can be any age. Some were deposited recently — within the current set of orbital cycles. The planet keeps building.”</w:t>
-      </w:r>
-    </w:p>
-    <w:p>
-      <w:pPr>
-        <w:pStyle w:val="BodyText"/>
-      </w:pPr>
-      <w:r>
-        <w:t xml:space="preserve">They continued down. The channel narrowed at the nine-meter mark. Cole had to turn sideways to pass a rock shelf that jutted into the passage. Beyond it, the channel widened again into a junction — two primary channels meeting at an angle, the walls thicker with the mineralized compound, the geometric precision of the carved stone visible where the coating had cracked and fallen away.</w:t>
-      </w:r>
-    </w:p>
-    <w:p>
-      <w:pPr>
-        <w:pStyle w:val="BodyText"/>
-      </w:pPr>
-      <w:r>
-        <w:t xml:space="preserve">Suri moved ahead of Cole into the junction. She did that — moved toward the interesting thing, the next data point, the question that was forming in her head. Dana had trained the recklessness out of her, but the curiosity remained. It was why she was useful. It was the thing Cole valued.</w:t>
-      </w:r>
-    </w:p>
-    <w:p>
-      <w:pPr>
-        <w:pStyle w:val="BodyText"/>
-      </w:pPr>
-      <w:r>
-        <w:t xml:space="preserve">“The walls are different here,”</w:t>
-      </w:r>
-      <w:r>
-        <w:t xml:space="preserve"> </w:t>
-      </w:r>
-      <w:r>
-        <w:t xml:space="preserve">Suri said. She was pressing her palm against the junction wall, the way she always did.</w:t>
-      </w:r>
-      <w:r>
-        <w:t xml:space="preserve"> </w:t>
-      </w:r>
-      <w:r>
-        <w:t xml:space="preserve">“Warmer. Not warm, but warmer than the upper sections. Can you feel it?”</w:t>
-      </w:r>
-    </w:p>
-    <w:p>
-      <w:pPr>
-        <w:pStyle w:val="BodyText"/>
-      </w:pPr>
-      <w:r>
-        <w:t xml:space="preserve">Cole placed his hand on the wall. She was right. A few degrees above the ambient rock temperature. Not alarming. Consistent with geothermal activity at depth. He noted it.</w:t>
-      </w:r>
-    </w:p>
-    <w:p>
-      <w:pPr>
-        <w:pStyle w:val="BodyText"/>
-      </w:pPr>
-      <w:r>
-        <w:t xml:space="preserve">Dana was ten meters back, still sampling at the gradient transition. Ren was between them, recording the junction’s dimensions.</w:t>
-      </w:r>
-    </w:p>
-    <w:p>
-      <w:pPr>
-        <w:pStyle w:val="BodyText"/>
-      </w:pPr>
-      <w:r>
-        <w:t xml:space="preserve">“I want to check the capillary branch,”</w:t>
-      </w:r>
-      <w:r>
-        <w:t xml:space="preserve"> </w:t>
-      </w:r>
-      <w:r>
-        <w:t xml:space="preserve">Suri said, pointing at a narrow channel that split off from the junction at a downward angle. It was barely wide enough for a person. The mineralized compound on its walls was visibly different — more granular, less glassy, the surface rough under the lamplight. A younger deposit. Closer to active.</w:t>
-      </w:r>
-    </w:p>
-    <w:p>
-      <w:pPr>
-        <w:pStyle w:val="BodyText"/>
-      </w:pPr>
-      <w:r>
-        <w:t xml:space="preserve">“Take a temperature reading first,”</w:t>
-      </w:r>
-      <w:r>
-        <w:t xml:space="preserve"> </w:t>
-      </w:r>
-      <w:r>
-        <w:t xml:space="preserve">Cole said.</w:t>
-      </w:r>
-    </w:p>
-    <w:p>
-      <w:pPr>
-        <w:pStyle w:val="BodyText"/>
-      </w:pPr>
-      <w:r>
-        <w:t xml:space="preserve">Suri pulled the thermal probe from her kit. Held it against the capillary wall.</w:t>
-      </w:r>
-      <w:r>
-        <w:t xml:space="preserve"> </w:t>
-      </w:r>
-      <w:r>
-        <w:t xml:space="preserve">“Four degrees above ambient. Consistent with what we’ve been seeing. No anomalies.”</w:t>
-      </w:r>
-    </w:p>
-    <w:p>
-      <w:pPr>
-        <w:pStyle w:val="BodyText"/>
-      </w:pPr>
-      <w:r>
-        <w:t xml:space="preserve">“Go ahead. Stay within voice range.”</w:t>
-      </w:r>
-    </w:p>
-    <w:p>
-      <w:pPr>
-        <w:pStyle w:val="BodyText"/>
-      </w:pPr>
-      <w:r>
-        <w:t xml:space="preserve">Suri entered the capillary branch. Cole watched her lamplight shrink as she moved down the narrow passage, her shoulders brushing the walls, the light catching the granular compound on either side of her. She was taking samples as she went — scraping the wall surface into collection vials, labeling them, methodical.</w:t>
-      </w:r>
-    </w:p>
-    <w:p>
-      <w:pPr>
-        <w:pStyle w:val="BodyText"/>
-      </w:pPr>
-      <w:r>
-        <w:t xml:space="preserve">Cole turned back to the junction. He was examining the geometric patterns in the carved stone — the precision of the angles, the uniformity of the channel width — when the air changed.</w:t>
-      </w:r>
-    </w:p>
-    <w:p>
-      <w:pPr>
-        <w:pStyle w:val="BodyText"/>
-      </w:pPr>
-      <w:r>
-        <w:t xml:space="preserve">Not temperature. Not smell. Something more fundamental. A vibration, subsonic, the same frequency range as the humming trees but concentrated, directional. It came through the rock. Through his hands where they rested on the junction wall. Through the soles of his boots. The channel was resonating.</w:t>
-      </w:r>
-    </w:p>
-    <w:p>
-      <w:pPr>
-        <w:pStyle w:val="BodyText"/>
-      </w:pPr>
-      <w:r>
-        <w:t xml:space="preserve">Dana felt it too. She was on her feet, moving toward him, her face carrying the expression she wore when data reorganized itself faster than she could process.</w:t>
-      </w:r>
-    </w:p>
-    <w:p>
-      <w:pPr>
-        <w:pStyle w:val="BodyText"/>
-      </w:pPr>
-      <w:r>
-        <w:t xml:space="preserve">“Cole,”</w:t>
-      </w:r>
-      <w:r>
-        <w:t xml:space="preserve"> </w:t>
-      </w:r>
-      <w:r>
-        <w:t xml:space="preserve">she said.</w:t>
-      </w:r>
-      <w:r>
-        <w:t xml:space="preserve"> </w:t>
-      </w:r>
-      <w:r>
-        <w:t xml:space="preserve">“The thermal readings just spiked. The capillary networks. All of them. Simultaneously.”</w:t>
-      </w:r>
-    </w:p>
-    <w:p>
-      <w:pPr>
-        <w:pStyle w:val="BodyText"/>
-      </w:pPr>
-      <w:r>
-        <w:t xml:space="preserve">He turned toward the capillary branch where Suri had gone. The lamplight was still visible, thirty meters down the narrow passage. Suri’s voice came back:</w:t>
-      </w:r>
-      <w:r>
-        <w:t xml:space="preserve"> </w:t>
-      </w:r>
-      <w:r>
-        <w:t xml:space="preserve">“The walls are changing. The surface — it’s getting soft. Like the mineralization is reversing.”</w:t>
-      </w:r>
-    </w:p>
-    <w:p>
-      <w:pPr>
-        <w:pStyle w:val="BodyText"/>
-      </w:pPr>
-      <w:r>
-        <w:t xml:space="preserve">Cole was already moving. The passage was tight. His shoulders scraped the walls. The compound on either side of him — the glassy, inert, ancient material — was warm now. Not geothermal warm. Active warm. The surface had developed a sheen, a faint moisture that hadn’t been there ten minutes ago. The mineralization was reversing. The stored phase was waking up.</w:t>
-      </w:r>
-    </w:p>
-    <w:p>
-      <w:pPr>
-        <w:pStyle w:val="BodyText"/>
-      </w:pPr>
-      <w:r>
-        <w:t xml:space="preserve">“Suri, come back. Now.”</w:t>
-      </w:r>
-    </w:p>
-    <w:p>
-      <w:pPr>
-        <w:pStyle w:val="BodyText"/>
-      </w:pPr>
-      <w:r>
-        <w:t xml:space="preserve">“I’m coming. The floor is — Cole, the floor is moving. There’s flow. It’s thin but it’s moving.”</w:t>
-      </w:r>
-    </w:p>
-    <w:p>
-      <w:pPr>
-        <w:pStyle w:val="BodyText"/>
-      </w:pPr>
-      <w:r>
-        <w:t xml:space="preserve">He could see her lamplight bouncing as she turned. Twenty meters between them. The capillary channel was too narrow for him to pass her. She had to come to him.</w:t>
-      </w:r>
-    </w:p>
-    <w:p>
-      <w:pPr>
-        <w:pStyle w:val="BodyText"/>
-      </w:pPr>
-      <w:r>
-        <w:t xml:space="preserve">Then the vibration deepened. The walls pulsed — not metaphorically, not in his imagination. The compound expanded. The channel narrowed by centimeters. The floor, which had been solid rock coated with mineralized compound, was now coated with something that had the consistency of wet calcium. Flowing. Slowly. The dormant channels reactivating in response to the deepening cycle, the same way the surface creep had activated months ago, but down here the compound was concentrated, old, and dense.</w:t>
-      </w:r>
-    </w:p>
-    <w:p>
-      <w:pPr>
-        <w:pStyle w:val="BodyText"/>
-      </w:pPr>
-      <w:r>
-        <w:t xml:space="preserve">Suri was moving toward him. Fifteen meters. She was fast. She was precise. She was doing everything right.</w:t>
-      </w:r>
-    </w:p>
-    <w:p>
-      <w:pPr>
-        <w:pStyle w:val="BodyText"/>
-      </w:pPr>
-      <w:r>
-        <w:t xml:space="preserve">The compound on the floor was rising. Not like water — like something growing. The filaments emerging from the mineralized base, the same lace-like structures Dana had documented in the surface creep, but denser. Older. Fed by whatever reserves the ancient network had stored during its long dormancy.</w:t>
-      </w:r>
-    </w:p>
-    <w:p>
-      <w:pPr>
-        <w:pStyle w:val="BodyText"/>
-      </w:pPr>
-      <w:r>
-        <w:t xml:space="preserve">“Cole.”</w:t>
-      </w:r>
-      <w:r>
-        <w:t xml:space="preserve"> </w:t>
-      </w:r>
-      <w:r>
-        <w:t xml:space="preserve">Suri’s voice wasn’t a scream. It was confusion. The tone of someone encountering a variable that didn’t match the model.</w:t>
-      </w:r>
-      <w:r>
-        <w:t xml:space="preserve"> </w:t>
-      </w:r>
-      <w:r>
-        <w:t xml:space="preserve">“It’s on my boots. I can’t — it’s dissolving the soles.”</w:t>
-      </w:r>
-    </w:p>
-    <w:p>
-      <w:pPr>
-        <w:pStyle w:val="BodyText"/>
-      </w:pPr>
-      <w:r>
-        <w:t xml:space="preserve">He could see her now. Twelve meters. She was walking, not running, because running in a narrow channel with dissolving footing was how you fell, and falling was how you died. She was being precise. She was thinking.</w:t>
-      </w:r>
-    </w:p>
-    <w:p>
-      <w:pPr>
-        <w:pStyle w:val="BodyText"/>
-      </w:pPr>
-      <w:r>
-        <w:t xml:space="preserve">The compound was at her ankles.</w:t>
-      </w:r>
-    </w:p>
-    <w:p>
-      <w:pPr>
-        <w:pStyle w:val="BodyText"/>
-      </w:pPr>
-      <w:r>
-        <w:t xml:space="preserve">Cole pushed deeper into the capillary. His own boots met the flow — thin, warm, the surface of the rock slick with reactivated compound. He felt the dissolution start on the rubber soles. The filaments were indiscriminate. Marcus Reeves. The same process. Except Reeves had been asleep and this was happening in real time, in a channel barely wide enough for one person, with Suri ten meters ahead of him and the gap between them full of something that was waking up faster than either of them could move.</w:t>
-      </w:r>
-    </w:p>
-    <w:p>
-      <w:pPr>
-        <w:pStyle w:val="BodyText"/>
-      </w:pPr>
-      <w:r>
-        <w:t xml:space="preserve">“Suri. Keep coming.”</w:t>
-      </w:r>
-    </w:p>
-    <w:p>
-      <w:pPr>
-        <w:pStyle w:val="BodyText"/>
-      </w:pPr>
-      <w:r>
-        <w:t xml:space="preserve">“I am.”</w:t>
-      </w:r>
-      <w:r>
-        <w:t xml:space="preserve"> </w:t>
-      </w:r>
-      <w:r>
-        <w:t xml:space="preserve">Her voice was controlled. Tight. She was looking down at her feet, at the compound climbing her boot shafts. She took another step. Another. Eight meters.</w:t>
-      </w:r>
-    </w:p>
-    <w:p>
-      <w:pPr>
-        <w:pStyle w:val="BodyText"/>
-      </w:pPr>
-      <w:r>
-        <w:t xml:space="preserve">Cole reached for her. The channel was too narrow. He couldn’t get past the rock shelf that jutted into the passage. His arm extended into the space, his hand open, and Suri’s hand reaching back, and between them the compound flowing, rising, the ancient system cycling into its active phase in a section that had been dormant every time they’d walked through it.</w:t>
-      </w:r>
-    </w:p>
-    <w:p>
-      <w:pPr>
-        <w:pStyle w:val="BodyText"/>
-      </w:pPr>
-      <w:r>
-        <w:t xml:space="preserve">Suri’s feet stopped moving. The compound had reached her shins. She looked down. Looked at Cole. Her face held the expression of someone doing a calculation that didn’t produce a survivable answer.</w:t>
-      </w:r>
-    </w:p>
-    <w:p>
-      <w:pPr>
-        <w:pStyle w:val="BodyText"/>
-      </w:pPr>
-      <w:r>
-        <w:t xml:space="preserve">“I can’t feel my feet,”</w:t>
-      </w:r>
-      <w:r>
-        <w:t xml:space="preserve"> </w:t>
-      </w:r>
-      <w:r>
-        <w:t xml:space="preserve">she said.</w:t>
-      </w:r>
-    </w:p>
-    <w:p>
-      <w:pPr>
-        <w:pStyle w:val="BodyText"/>
-      </w:pPr>
-      <w:r>
-        <w:t xml:space="preserve">“Suri.”</w:t>
-      </w:r>
-    </w:p>
-    <w:p>
-      <w:pPr>
-        <w:pStyle w:val="BodyText"/>
-      </w:pPr>
-      <w:r>
-        <w:t xml:space="preserve">“I know.”</w:t>
-      </w:r>
-      <w:r>
-        <w:t xml:space="preserve"> </w:t>
-      </w:r>
-      <w:r>
-        <w:t xml:space="preserve">Two syllables that held everything — the understanding, the mathematics, the impossibility of her position. She reached her hand forward. Cole stretched until his shoulder ground against the rock shelf. Their fingers touched. The compound was at her knees.</w:t>
-      </w:r>
-    </w:p>
-    <w:p>
-      <w:pPr>
-        <w:pStyle w:val="BodyText"/>
-      </w:pPr>
-      <w:r>
-        <w:t xml:space="preserve">The dissolution was fast. Faster than the surface creep. Concentrated. The ancient compound, reactivated after centuries or millennia of dormancy, had reserves the surface version didn’t. It moved through Suri’s lower body with the efficiency of a system resuming function after a long pause — not aggressive, not hostile. Just operational. Doing what it was designed to do: break down organic material, cycle nutrients, build infrastructure. Suri was organic material. The compound didn’t distinguish.</w:t>
-      </w:r>
-    </w:p>
-    <w:p>
-      <w:pPr>
-        <w:pStyle w:val="BodyText"/>
-      </w:pPr>
-      <w:r>
-        <w:t xml:space="preserve">Ren was behind Cole, pulling at his shoulder.</w:t>
-      </w:r>
-      <w:r>
-        <w:t xml:space="preserve"> </w:t>
-      </w:r>
-      <w:r>
-        <w:t xml:space="preserve">“Cole. Come back.”</w:t>
-      </w:r>
-    </w:p>
-    <w:p>
-      <w:pPr>
-        <w:pStyle w:val="BodyText"/>
-      </w:pPr>
-      <w:r>
-        <w:t xml:space="preserve">“No.”</w:t>
-      </w:r>
-    </w:p>
-    <w:p>
-      <w:pPr>
-        <w:pStyle w:val="BodyText"/>
-      </w:pPr>
-      <w:r>
-        <w:t xml:space="preserve">“You can’t reach her. Cole. You can’t.”</w:t>
-      </w:r>
-    </w:p>
-    <w:p>
-      <w:pPr>
-        <w:pStyle w:val="BodyText"/>
-      </w:pPr>
-      <w:r>
-        <w:t xml:space="preserve">Suri’s hand went slack. Her eyes were open but the focus was gone — shock, neural disruption, the same unconsciousness that had been Haruki’s single mercy for Marcus Reeves. She was unconscious before the significant dissolution. That was the only comfort available, and it wasn’t enough.</w:t>
-      </w:r>
-    </w:p>
-    <w:p>
-      <w:pPr>
-        <w:pStyle w:val="BodyText"/>
-      </w:pPr>
-      <w:r>
-        <w:t xml:space="preserve">Cole let Ren pull him back. They retreated up the channel, boots dissolving, the compound following them at the pace of something patient, and reached the junction as the capillary branch behind them filled with active compound. The main channels — the deep, fully mineralized arteries — remained inert. The activation was localized. A capillary response. A shallow branch waking up because the cycle had deepened past the threshold the younger deposits needed.</w:t>
-      </w:r>
-    </w:p>
-    <w:p>
-      <w:pPr>
-        <w:pStyle w:val="BodyText"/>
-      </w:pPr>
-      <w:r>
-        <w:t xml:space="preserve">Dana was at the shaft entrance, pulling them up. Cole’s hands were bleeding where the rock shelf had scraped them. He didn’t feel it.</w:t>
+        <w:t xml:space="preserve">Haruki went down with a sealed suit and a thermal probe six hours later, after the activation subsided. The compound had re-mineralized. The capillary branch was inert again, the walls glassy, the floor solid. As though nothing had happened.</w:t>
+      </w:r>
+    </w:p>
+    <w:p>
+      <w:pPr>
+        <w:pStyle w:val="BodyText"/>
+      </w:pPr>
+      <w:r>
+        <w:t xml:space="preserve">There was nothing left to recover.</w:t>
+      </w:r>
+    </w:p>
+    <w:p>
+      <w:pPr>
+        <w:pStyle w:val="BodyText"/>
+      </w:pPr>
+      <w:r>
+        <w:t xml:space="preserve">Haruki’s report was brief. Same dissolution pattern as Marcus Reeves. Accelerated by concentration and confinement. The compound had consumed everything organic and deposited the minerals into the channel walls. Suri Park was part of the infrastructure now. Built into the system she’d been studying.</w:t>
+      </w:r>
+    </w:p>
+    <w:p>
+      <w:pPr>
+        <w:pStyle w:val="BodyText"/>
+      </w:pPr>
+      <w:r>
+        <w:t xml:space="preserve">Thirty-five.</w:t>
       </w:r>
     </w:p>
     <w:p>
@@ -10591,45 +10703,6 @@
         <w:pStyle w:val="FirstParagraph"/>
       </w:pPr>
       <w:r>
-        <w:t xml:space="preserve">Haruki went down with a sealed suit and a thermal probe six hours later, after the activation subsided. The compound had re-mineralized. The capillary branch was inert again, the walls glassy, the floor solid. As though nothing had happened.</w:t>
-      </w:r>
-    </w:p>
-    <w:p>
-      <w:pPr>
-        <w:pStyle w:val="BodyText"/>
-      </w:pPr>
-      <w:r>
-        <w:t xml:space="preserve">There was nothing left to recover.</w:t>
-      </w:r>
-    </w:p>
-    <w:p>
-      <w:pPr>
-        <w:pStyle w:val="BodyText"/>
-      </w:pPr>
-      <w:r>
-        <w:t xml:space="preserve">Haruki’s report was brief. Same dissolution pattern as Marcus Reeves. Accelerated by concentration and confinement. The compound had consumed everything organic and deposited the minerals into the channel walls. Suri Park was part of the infrastructure now. Built into the system she’d been studying.</w:t>
-      </w:r>
-    </w:p>
-    <w:p>
-      <w:pPr>
-        <w:pStyle w:val="BodyText"/>
-      </w:pPr>
-      <w:r>
-        <w:t xml:space="preserve">Thirty-five.</w:t>
-      </w:r>
-    </w:p>
-    <w:p>
-      <w:r>
-        <w:pict>
-          <v:rect style="width:0;height:1.5pt" o:hralign="center" o:hrstd="t" o:hr="t"/>
-        </w:pict>
-      </w:r>
-    </w:p>
-    <w:p>
-      <w:pPr>
-        <w:pStyle w:val="FirstParagraph"/>
-      </w:pPr>
-      <w:r>
         <w:t xml:space="preserve">Cole sat in his shelter that night with the thermal data from the capillary branch. The readings were clear. The shallow channels — the younger deposits, the sections where mineralization was incomplete — had reactivated when the second orbital cycle deepened past a threshold Dana’s models hadn’t predicted. The deep channels, fully mineralized, remained inert. The activation was a gradient: the younger the deposit, the lower the threshold needed to reactivate it.</w:t>
       </w:r>
     </w:p>
@@ -10730,11 +10803,11 @@
       <w:pPr>
         <w:pStyle w:val="BodyText"/>
       </w:pPr>
-      <w:bookmarkStart w:id="32" w:name="chapter-14-signal"/>
-      <w:bookmarkEnd w:id="32"/>
-    </w:p>
-    <w:bookmarkEnd w:id="33"/>
-    <w:bookmarkStart w:id="35" w:name="chapter-14-signal"/>
+      <w:bookmarkStart w:id="36" w:name="chapter-14-signal"/>
+      <w:bookmarkEnd w:id="36"/>
+    </w:p>
+    <w:bookmarkEnd w:id="37"/>
+    <w:bookmarkStart w:id="39" w:name="chapter-14-signal"/>
     <w:p>
       <w:pPr>
         <w:pStyle w:val="Heading1"/>
@@ -11519,17 +11592,23 @@
       <w:pPr>
         <w:pStyle w:val="BodyText"/>
       </w:pPr>
-      <w:bookmarkStart w:id="34" w:name="chapter-15-supply-lines"/>
-      <w:bookmarkEnd w:id="34"/>
-    </w:p>
-    <w:bookmarkEnd w:id="35"/>
-    <w:bookmarkStart w:id="37" w:name="chapter-15-supply-lines"/>
+      <w:bookmarkStart w:id="38" w:name="chapter-15-supply-lines"/>
+      <w:bookmarkEnd w:id="38"/>
+    </w:p>
+    <w:bookmarkEnd w:id="39"/>
+    <w:bookmarkStart w:id="41" w:name="chapter-15-supply-lines"/>
     <w:p>
       <w:pPr>
         <w:pStyle w:val="Heading1"/>
       </w:pPr>
       <w:r>
-        <w:t xml:space="preserve">Chapter 15 — Supply Lines</w:t>
+        <w:t xml:space="preserve">Chapter 15 —</w:t>
+      </w:r>
+      <w:r>
+        <w:t xml:space="preserve"> </w:t>
+      </w:r>
+      <w:r>
+        <w:t xml:space="preserve">“Supply Lines”</w:t>
       </w:r>
     </w:p>
     <w:p>
@@ -13111,17 +13190,23 @@
       <w:pPr>
         <w:pStyle w:val="BodyText"/>
       </w:pPr>
-      <w:bookmarkStart w:id="36" w:name="chapter-16-fever"/>
-      <w:bookmarkEnd w:id="36"/>
-    </w:p>
-    <w:bookmarkEnd w:id="37"/>
-    <w:bookmarkStart w:id="39" w:name="chapter-16-fever"/>
+      <w:bookmarkStart w:id="40" w:name="chapter-16-fever"/>
+      <w:bookmarkEnd w:id="40"/>
+    </w:p>
+    <w:bookmarkEnd w:id="41"/>
+    <w:bookmarkStart w:id="43" w:name="chapter-16-fever"/>
     <w:p>
       <w:pPr>
         <w:pStyle w:val="Heading1"/>
       </w:pPr>
       <w:r>
-        <w:t xml:space="preserve">Chapter 16 — Fever</w:t>
+        <w:t xml:space="preserve">Chapter 16 —</w:t>
+      </w:r>
+      <w:r>
+        <w:t xml:space="preserve"> </w:t>
+      </w:r>
+      <w:r>
+        <w:t xml:space="preserve">“Fever”</w:t>
       </w:r>
     </w:p>
     <w:p>
@@ -13435,23 +13520,23 @@
         <w:pStyle w:val="FirstParagraph"/>
       </w:pPr>
       <w:r>
-        <w:t xml:space="preserve">Patricia died on Day 11.</w:t>
-      </w:r>
-    </w:p>
-    <w:p>
-      <w:pPr>
-        <w:pStyle w:val="BodyText"/>
-      </w:pPr>
-      <w:r>
-        <w:t xml:space="preserve">The cough that had started during the relocation — that persistent, low-grade rasp that Haruki had treated and managed and never quite silenced — had weakened her lungs over eight months of continuous inflammation. The tissue was scarred. The virus found the scarring the way water finds a crack in a foundation. It settled there, replicated, built pressure. Dana’s compound reached her on Day 6, within the treatment window, at full concentration. It wasn’t enough.</w:t>
-      </w:r>
-    </w:p>
-    <w:p>
-      <w:pPr>
-        <w:pStyle w:val="BodyText"/>
-      </w:pPr>
-      <w:r>
-        <w:t xml:space="preserve">Haruki sat with her through the last hours. Cole was there at the end — standing in the doorway of the medical shelter, watching Haruki hold Patricia’s hand while her breathing went from shallow to intermittent to still. She was forty-seven. Former high school teacher from a district that had been defunded twice before she signed the charter. She’d taught the younger colonists basic mathematics during the transit. She’d helped Ren design the council’s voting procedures. She had a laugh that carried across the settlement, a bright, startling sound that didn’t match her quiet face, and Cole realized he’d stopped hearing it weeks ago without noticing.</w:t>
+        <w:t xml:space="preserve">Hana died on Day 11.</w:t>
+      </w:r>
+    </w:p>
+    <w:p>
+      <w:pPr>
+        <w:pStyle w:val="BodyText"/>
+      </w:pPr>
+      <w:r>
+        <w:t xml:space="preserve">She wasn’t in the priority group. Not compromised, not infrastructure-critical, not on Haruki’s high-risk list. Cole’s triage had placed her in the tier that received the compound if supply allowed. Supply hadn’t allowed. She’d been working double agricultural shifts since Month 12, splitting her rations with a younger colonist who needed the calories more, sleeping in four-hour intervals in a shelter she kept under-insulated because others needed the material. Nine months of quiet subtraction. The virus found a body that had been running on less than minimum, and a body running on deficit fought the way anything fought when the reserves were gone — briefly, and then not at all.</w:t>
+      </w:r>
+    </w:p>
+    <w:p>
+      <w:pPr>
+        <w:pStyle w:val="BodyText"/>
+      </w:pPr>
+      <w:r>
+        <w:t xml:space="preserve">Haruki sat with her through the last hours. Cole was there at the end — standing in the doorway of the medical shelter, watching Haruki hold Hana’s hand while her breathing went from shallow to intermittent to still. She was forty-one. Former agricultural researcher who’d signed the charter when her university’s funding collapsed. She’d volunteered for Dana’s experimental planting rotations before anyone else. She carried soil samples in her pockets the way other people carried worry stones, rubbing them between her fingers during council meetings, her mind already in the next growing cycle. Cole had seen her do it a hundred times without understanding it was her version of counting.</w:t>
       </w:r>
     </w:p>
     <w:p>
@@ -13534,7 +13619,7 @@
         <w:pStyle w:val="BodyText"/>
       </w:pPr>
       <w:r>
-        <w:t xml:space="preserve">The fever climbed. 38.5 on Day 9. 39.1 on Day 10. 39.8 on Day 11, the day Patricia died across the shelter, separated from Joss by three cots and a curtain that didn’t block sound. Joss heard Patricia’s breathing stop. He didn’t say anything. His eyes were open, glassy, fixed on the shelter ceiling, and Cole, sitting on an equipment crate next to the cot, watched the knowledge pass across Joss’s face like weather.</w:t>
+        <w:t xml:space="preserve">The fever climbed. 38.5 on Day 9. 39.1 on Day 10. 39.8 on Day 11, the day Hana died across the shelter, separated from Joss by three cots and a curtain that didn’t block sound. Joss heard Hana’s breathing stop. He didn’t say anything. His eyes were open, glassy, fixed on the shelter ceiling, and Cole, sitting on an equipment crate next to the cot, watched the knowledge pass across Joss’s face like weather.</w:t>
       </w:r>
     </w:p>
     <w:p>
@@ -13753,7 +13838,7 @@
         <w:pStyle w:val="BodyText"/>
       </w:pPr>
       <w:r>
-        <w:t xml:space="preserve">“She’s nine. She likes drawing horses. She thinks I’m on a work trip.”</w:t>
+        <w:t xml:space="preserve">“She’s ten. She likes drawing horses. She thinks I’m on a work trip.”</w:t>
       </w:r>
     </w:p>
     <w:p>
@@ -13791,7 +13876,7 @@
         <w:pStyle w:val="BodyText"/>
       </w:pPr>
       <w:r>
-        <w:t xml:space="preserve">Cole looked at the kid — twenty-three, burning with fever, dehydrated, possibly dying, and asking whether a nine-year-old girl on a planet he’d never see resembled the man sitting on an equipment crate holding a damp cloth. The question was generous in a way that Cole didn’t deserve and couldn’t deflect.</w:t>
+        <w:t xml:space="preserve">Cole looked at the kid — twenty-three, burning with fever, dehydrated, possibly dying, and asking whether a ten-year-old girl on a planet he’d never see resembled the man sitting on an equipment crate holding a damp cloth. The question was generous in a way that Cole didn’t deserve and couldn’t deflect.</w:t>
       </w:r>
     </w:p>
     <w:p>
@@ -14076,7 +14161,7 @@
         <w:pStyle w:val="BodyText"/>
       </w:pPr>
       <w:r>
-        <w:t xml:space="preserve">Not thirty-two units of a survival equation. Not the margin between here and clause 9.4.2. Thirty-two people whose names he knew, whose habits he’d memorized, whose losses he’d carried from the signing room to here. Patricia, who laughed in a way that didn’t match her face. James, who complained about everything except the thing that killed him. Webb, who’d done everything right. Lev and Priya and Vogel and Osei and Farin and Sarah and Lin and Thomas and Marcus and Thomas Chen and Noor and Suri. Fifteen names. Fifteen subtractions from a number that had started at forty-seven and now sat at thirty-two and would keep subtracting because the planet didn’t care about arithmetic and neither did disease and neither did the slow erosion of people who ran out of reasons before they ran out of breath.</w:t>
+        <w:t xml:space="preserve">Not thirty-two units of a survival equation. Not the margin between here and clause 9.4.2. Thirty-two people whose names he knew, whose habits he’d memorized, whose losses he’d carried from the signing room to here. Hana, who carried soil in her pockets. James, who complained about everything except the thing that killed him. Webb, who’d done everything right. Lev and Priya and Vogel and Osei and Farin and Sarah and Lin and Thomas and Marcus and Thomas Chen and Noor and Suri. Fifteen names. Fifteen subtractions from a number that had started at forty-seven and now sat at thirty-two and would keep subtracting because the planet didn’t care about arithmetic and neither did disease and neither did the slow erosion of people who ran out of reasons before they ran out of breath.</w:t>
       </w:r>
     </w:p>
     <w:p>
@@ -14112,17 +14197,23 @@
       <w:pPr>
         <w:pStyle w:val="BodyText"/>
       </w:pPr>
-      <w:bookmarkStart w:id="38" w:name="chapter-17-elena-year-two"/>
-      <w:bookmarkEnd w:id="38"/>
-    </w:p>
-    <w:bookmarkEnd w:id="39"/>
-    <w:bookmarkStart w:id="41" w:name="chapter-17-elena-year-two"/>
+      <w:bookmarkStart w:id="42" w:name="chapter-17-elena-year-two"/>
+      <w:bookmarkEnd w:id="42"/>
+    </w:p>
+    <w:bookmarkEnd w:id="43"/>
+    <w:bookmarkStart w:id="45" w:name="chapter-17-elena-year-two"/>
     <w:p>
       <w:pPr>
         <w:pStyle w:val="Heading1"/>
       </w:pPr>
       <w:r>
-        <w:t xml:space="preserve">Chapter 17 — Elena, Year Two</w:t>
+        <w:t xml:space="preserve">Chapter 17 —</w:t>
+      </w:r>
+      <w:r>
+        <w:t xml:space="preserve"> </w:t>
+      </w:r>
+      <w:r>
+        <w:t xml:space="preserve">“Elena, Year Two”</w:t>
       </w:r>
     </w:p>
     <w:p>
@@ -14205,7 +14296,7 @@
         <w:pStyle w:val="BodyText"/>
       </w:pPr>
       <w:r>
-        <w:t xml:space="preserve">He’d seen it in his own colony. After the fever. After Patricia and James. The thirty-two who remained had pulled closer in some ways — shared meals continued, the council met, Ren’s systems held. But the texture had changed. People talked less. Laughed less. The jokes that had emerged during the middle months, the ones Cole didn’t always understand, had gone quiet. The colony wasn’t fracturing. It was dimming.</w:t>
+        <w:t xml:space="preserve">He’d seen it in his own colony. After the fever. After Hana and James. The thirty-two who remained had pulled closer in some ways — shared meals continued, the council met, Ren’s systems held. But the texture had changed. People talked less. Laughed less. The jokes that had emerged during the middle months, the ones Cole didn’t always understand, had gone quiet. The colony wasn’t fracturing. It was dimming.</w:t>
       </w:r>
     </w:p>
     <w:p>
@@ -15382,11 +15473,11 @@
       <w:pPr>
         <w:pStyle w:val="BodyText"/>
       </w:pPr>
-      <w:bookmarkStart w:id="40" w:name="chapter-18-the-creep-solution"/>
-      <w:bookmarkEnd w:id="40"/>
-    </w:p>
-    <w:bookmarkEnd w:id="41"/>
-    <w:bookmarkStart w:id="43" w:name="chapter-18-the-creep-solution"/>
+      <w:bookmarkStart w:id="44" w:name="chapter-18-the-creep-solution"/>
+      <w:bookmarkEnd w:id="44"/>
+    </w:p>
+    <w:bookmarkEnd w:id="45"/>
+    <w:bookmarkStart w:id="47" w:name="chapter-18-the-creep-solution"/>
     <w:p>
       <w:pPr>
         <w:pStyle w:val="Heading1"/>
@@ -16606,11 +16697,11 @@
       <w:pPr>
         <w:pStyle w:val="BodyText"/>
       </w:pPr>
-      <w:bookmarkStart w:id="42" w:name="chapter-19-narrowing"/>
-      <w:bookmarkEnd w:id="42"/>
-    </w:p>
-    <w:bookmarkEnd w:id="43"/>
-    <w:bookmarkStart w:id="45" w:name="chapter-19-narrowing"/>
+      <w:bookmarkStart w:id="46" w:name="chapter-19-narrowing"/>
+      <w:bookmarkEnd w:id="46"/>
+    </w:p>
+    <w:bookmarkEnd w:id="47"/>
+    <w:bookmarkStart w:id="49" w:name="chapter-19-narrowing"/>
     <w:p>
       <w:pPr>
         <w:pStyle w:val="Heading1"/>
@@ -16654,7 +16745,7 @@
         <w:pStyle w:val="BodyText"/>
       </w:pPr>
       <w:r>
-        <w:t xml:space="preserve">Cole attended every meeting. He sat in the back and listened and watched the council function without him at the center, and he felt something he couldn’t identify. Not relief. Not loss. Something in between — the specific sensation of a man who had built a machine and was watching it run, and the running was the point, and the running meant he wasn’t the point anymore.</w:t>
+        <w:t xml:space="preserve">Cole attended every meeting. He sat in the back and listened and watched the council function without him at the center, and he felt something he couldn’t identify. Not relief. Not loss. Something in between — the specific sensation of a man who had built a machine and was watching it run. That was the point. The machine didn’t need him anymore.</w:t>
       </w:r>
     </w:p>
     <w:p>
@@ -16916,7 +17007,7 @@
         <w:pStyle w:val="BodyText"/>
       </w:pPr>
       <w:r>
-        <w:t xml:space="preserve">Lev. Priya. Vogel. Osei. Farin. Sarah. Lin. Thomas. Marcus Reeves. Thomas Chen. Noor. Suri Park. The one who walked into the forest. Patricia. James. Okafor.</w:t>
+        <w:t xml:space="preserve">Lev. Priya. Vogel. Osei. Farin. Sarah. Lin. Thomas. Marcus Reeves. Thomas Chen. Noor. Suri Park. The one who walked into the forest. Hana. James. Okafor.</w:t>
       </w:r>
     </w:p>
     <w:p>
@@ -17562,11 +17653,11 @@
       <w:pPr>
         <w:pStyle w:val="BodyText"/>
       </w:pPr>
-      <w:bookmarkStart w:id="44" w:name="chapter-20-silence"/>
-      <w:bookmarkEnd w:id="44"/>
-    </w:p>
-    <w:bookmarkEnd w:id="45"/>
-    <w:bookmarkStart w:id="47" w:name="chapter-20-silence"/>
+      <w:bookmarkStart w:id="48" w:name="chapter-20-silence"/>
+      <w:bookmarkEnd w:id="48"/>
+    </w:p>
+    <w:bookmarkEnd w:id="49"/>
+    <w:bookmarkStart w:id="51" w:name="chapter-20-silence"/>
     <w:p>
       <w:pPr>
         <w:pStyle w:val="Heading1"/>
@@ -17841,7 +17932,7 @@
         <w:pStyle w:val="BodyText"/>
       </w:pPr>
       <w:r>
-        <w:t xml:space="preserve">Month 8: she’d stood in the equipment shelter and told Cole that freedom imposed by one man’s arithmetic wasn’t freedom. She’d meant it. He was a logistics machine running a survival calculation, and the calculation was correct, and the correctness was the problem. You couldn’t build a colony on correct. You built it on chosen.</w:t>
+        <w:t xml:space="preserve">Month 8: she’d stood in the equipment shelter and told Cole that freedom imposed by one man’s arithmetic wasn’t freedom. She’d meant it. He was a logistics machine running a survival calculation, and the calculation was correct. That was the problem. You couldn’t build a colony on correct. You built it on chosen.</w:t>
       </w:r>
     </w:p>
     <w:p>
@@ -18829,11 +18920,11 @@
       <w:pPr>
         <w:pStyle w:val="BodyText"/>
       </w:pPr>
-      <w:bookmarkStart w:id="46" w:name="chapter-21-confession"/>
-      <w:bookmarkEnd w:id="46"/>
-    </w:p>
-    <w:bookmarkEnd w:id="47"/>
-    <w:bookmarkStart w:id="49" w:name="chapter-21-confession"/>
+      <w:bookmarkStart w:id="50" w:name="chapter-21-confession"/>
+      <w:bookmarkEnd w:id="50"/>
+    </w:p>
+    <w:bookmarkEnd w:id="51"/>
+    <w:bookmarkStart w:id="53" w:name="chapter-21-confession"/>
     <w:p>
       <w:pPr>
         <w:pStyle w:val="Heading1"/>
@@ -20101,11 +20192,11 @@
       <w:pPr>
         <w:pStyle w:val="BodyText"/>
       </w:pPr>
-      <w:bookmarkStart w:id="48" w:name="chapter-22-the-vote"/>
-      <w:bookmarkEnd w:id="48"/>
-    </w:p>
-    <w:bookmarkEnd w:id="49"/>
-    <w:bookmarkStart w:id="51" w:name="chapter-22-the-vote"/>
+      <w:bookmarkStart w:id="52" w:name="chapter-22-the-vote"/>
+      <w:bookmarkEnd w:id="52"/>
+    </w:p>
+    <w:bookmarkEnd w:id="53"/>
+    <w:bookmarkStart w:id="55" w:name="chapter-22-the-vote"/>
     <w:p>
       <w:pPr>
         <w:pStyle w:val="Heading1"/>
@@ -21182,7 +21273,7 @@
         <w:pStyle w:val="BodyText"/>
       </w:pPr>
       <w:r>
-        <w:t xml:space="preserve">Cole felt the number arrive in his body the way he’d felt every number since Day 1 — physical, structural, the architecture of survival settling into a new configuration. But twenty-four was different. Twenty-four was the number he’d calculated in the signing room on Earth, sitting in a corporate waiting room surrounded by forty-seven desperate people, reading a two-hundred-page charter that nobody else had read, finding the clause buried in Section 9, Subsection 4, Paragraph 2, and doing the math. Fifty-one percent of forty-seven. Twenty-four.</w:t>
+        <w:t xml:space="preserve">Cole felt the number arrive in his body the way he’d felt every number since Day 1 — physical, structural, the architecture of survival settling into a new configuration. But twenty-four was different. Twenty-four was the number he’d calculated in the signing room on Earth, sitting in a corporate waiting room surrounded by forty-seven desperate people, reading a two-hundred-and-forty-seven-page charter that nobody else had read, finding the clause buried in Section 9, Subsection 4, Paragraph 2, and doing the math. Fifty-one percent of forty-seven. Twenty-four.</w:t>
       </w:r>
     </w:p>
     <w:p>
@@ -21242,11 +21333,11 @@
       <w:pPr>
         <w:pStyle w:val="BodyText"/>
       </w:pPr>
-      <w:bookmarkStart w:id="50" w:name="chapter-23-no-margin"/>
-      <w:bookmarkEnd w:id="50"/>
-    </w:p>
-    <w:bookmarkEnd w:id="51"/>
-    <w:bookmarkStart w:id="53" w:name="chapter-23-no-margin"/>
+      <w:bookmarkStart w:id="54" w:name="chapter-23-no-margin"/>
+      <w:bookmarkEnd w:id="54"/>
+    </w:p>
+    <w:bookmarkEnd w:id="55"/>
+    <w:bookmarkStart w:id="57" w:name="chapter-23-no-margin"/>
     <w:p>
       <w:pPr>
         <w:pStyle w:val="Heading1"/>
@@ -21274,7 +21365,7 @@
         <w:pStyle w:val="BodyText"/>
       </w:pPr>
       <w:r>
-        <w:t xml:space="preserve">Cole had carried every number since forty-seven. Carried them the way the channel network carried water — structurally, without choice, because the architecture existed and the flow was the architecture’s purpose. Forty-seven had been abstract. Forty-four had been alarming. Thirty-nine had been the first number that felt like weight instead of data. Thirty-one had matched his model and the matching had taught him that accuracy was not the same as comfort. Twenty-six had been the margin of two, the feedback loop, the colony killing the colony.</w:t>
+        <w:t xml:space="preserve">Cole had carried every number since forty-seven. Carried them the way the channel network carried water — structurally, without choice, because the architecture existed and flow was what architecture did. Forty-seven had been abstract. Forty-four had been alarming. Thirty-nine had been the first number that felt like weight instead of data. Thirty-one had matched his model and the matching had taught him that accuracy was not the same as comfort. Twenty-six had been the margin of two, the feedback loop, the colony killing the colony.</w:t>
       </w:r>
     </w:p>
     <w:p>
@@ -21612,7 +21703,7 @@
         <w:pStyle w:val="BodyText"/>
       </w:pPr>
       <w:r>
-        <w:t xml:space="preserve">Elena’s last three months were written in a voice Cole recognized. Not the clinical scientist. Not the colony leader running systems and counting bodies. A person. Alone. Writing because writing was the last act of someone who still believed the words would be read, and the belief was the last act of someone who still believed in a future that contained other people.</w:t>
+        <w:t xml:space="preserve">Elena’s last three months were written in a voice Cole recognized. Not the clinical scientist. Not the colony leader running systems and counting bodies. A person. Alone. Writing because writing was the last act of someone who still believed the words would be read. Someone who still believed in a future that contained other people.</w:t>
       </w:r>
     </w:p>
     <w:p>
@@ -22281,7 +22372,7 @@
         <w:pStyle w:val="BodyText"/>
       </w:pPr>
       <w:r>
-        <w:t xml:space="preserve">Cole raised his hand. Last. Not because he was undecided — because he was watching. Twenty-three hands in the air, twenty-three people choosing a name for the place they’d built, and the choosing was the thing he’d been watching for three years without knowing what to call it. The colony becoming something that wasn’t his to make. The emergent property of people who’d survived together long enough that the surviving had produced something the survival couldn’t explain.</w:t>
+        <w:t xml:space="preserve">Cole raised his hand. Last. Not because he was undecided — because he was watching. Twenty-three hands in the air, twenty-three people choosing a name for the place they’d built. He’d been watching for this. Three years, without knowing what to call it. The colony becoming something that wasn’t his to make. The emergent property of people who’d survived together long enough that the surviving had produced something the survival couldn’t explain.</w:t>
       </w:r>
     </w:p>
     <w:p>
@@ -22399,11 +22490,11 @@
       <w:pPr>
         <w:pStyle w:val="BodyText"/>
       </w:pPr>
-      <w:bookmarkStart w:id="52" w:name="chapter-24-the-shuttle"/>
-      <w:bookmarkEnd w:id="52"/>
-    </w:p>
-    <w:bookmarkEnd w:id="53"/>
-    <w:bookmarkStart w:id="55" w:name="chapter-24-the-shuttle"/>
+      <w:bookmarkStart w:id="56" w:name="chapter-24-the-shuttle"/>
+      <w:bookmarkEnd w:id="56"/>
+    </w:p>
+    <w:bookmarkEnd w:id="57"/>
+    <w:bookmarkStart w:id="59" w:name="chapter-24-the-shuttle"/>
     <w:p>
       <w:pPr>
         <w:pStyle w:val="Heading1"/>
@@ -22845,7 +22936,7 @@
         <w:pStyle w:val="BodyText"/>
       </w:pPr>
       <w:r>
-        <w:t xml:space="preserve">The face above the suit was professional. Mid-forties. A smile calibrated for reassurance — wide enough to communicate warmth, controlled enough to maintain authority. The kind of smile Cole had seen in the onboarding center on Earth, on the faces of the facilitators who’d walked forty-seven desperate people through a two-hundred-page contract designed to be unread. Corporate warmth. Manufactured empathy. The specific expression of a company whose human resources department had determined that sincerity was a productivity metric.</w:t>
+        <w:t xml:space="preserve">The face above the suit was professional. Mid-forties. A smile calibrated for reassurance — wide enough to communicate warmth, controlled enough to maintain authority. The kind of smile Cole had seen in the onboarding center on Earth, on the faces of the facilitators who’d walked forty-seven desperate people through a two-hundred-and-forty-seven-page contract designed to be unread. Corporate warmth. Manufactured empathy. The specific expression of a company whose human resources department had determined that sincerity was a productivity metric.</w:t>
       </w:r>
     </w:p>
     <w:p>
@@ -23567,7 +23658,7 @@
         <w:pStyle w:val="BodyText"/>
       </w:pPr>
       <w:r>
-        <w:t xml:space="preserve">Cole looked at Holdfast and felt the shuttle behind him and the eleven months ahead of him and the twenty-four lives inside the margin, and the margin was a razor, and the razor was the next eleven months, and the next eleven months were a choice.</w:t>
+        <w:t xml:space="preserve">Cole looked at Holdfast and felt the shuttle behind him and the eleven months ahead of him and the twenty-four lives inside the margin, and the margin was a razor. Eleven months. A choice that would hold or wouldn’t.</w:t>
       </w:r>
     </w:p>
     <w:p>
@@ -23695,11 +23786,11 @@
       <w:pPr>
         <w:pStyle w:val="BodyText"/>
       </w:pPr>
-      <w:bookmarkStart w:id="54" w:name="chapter-25-the-math"/>
-      <w:bookmarkEnd w:id="54"/>
-    </w:p>
-    <w:bookmarkEnd w:id="55"/>
-    <w:bookmarkStart w:id="57" w:name="chapter-25-the-math"/>
+      <w:bookmarkStart w:id="58" w:name="chapter-25-the-math"/>
+      <w:bookmarkEnd w:id="58"/>
+    </w:p>
+    <w:bookmarkEnd w:id="59"/>
+    <w:bookmarkStart w:id="61" w:name="chapter-25-the-math"/>
     <w:p>
       <w:pPr>
         <w:pStyle w:val="Heading1"/>
@@ -23862,7 +23953,7 @@
         <w:pStyle w:val="BodyText"/>
       </w:pPr>
       <w:r>
-        <w:t xml:space="preserve">Haruki sat near Dana. His hands folded in his lap. Steady. The doctor who’d saved Joss during the fever and Patricia during the cough’s early months and dozens of others with botanical compounds and field surgery and the calm, diagnostic attention that made people believe their bodies would hold because the man examining them believed it first. Haruki was fifty-six. His face showed it more than his hands did. The face carried four years of alien sun and insufficient sleep and the specific exhaustion of a man who’d treated every wound and buried every body and maintained the same measured calm through all of it because the calm was the treatment and the treatment was the man.</w:t>
+        <w:t xml:space="preserve">Haruki sat near Dana. His hands folded in his lap. Steady. The doctor who’d saved Joss during the fever and Patricia during the cough’s early months and dozens of others with botanical compounds and field surgery and the calm, diagnostic attention that made people believe their bodies would hold because the man examining them believed it first. Haruki was fifty-six. His face showed it more than his hands did. The face carried four years of alien sun and insufficient sleep and the specific exhaustion of a man who’d treated every wound and buried every body and maintained the same measured calm through all of it because Haruki’s calm was the only instrument he had, and he’d never once set it down.</w:t>
       </w:r>
     </w:p>
     <w:p>
@@ -24577,7 +24668,7 @@
         <w:pStyle w:val="BodyText"/>
       </w:pPr>
       <w:r>
-        <w:t xml:space="preserve">He didn’t speak. The setting was the speaking. Cole read it the way he read membrane percentages — the specific tension that meant the material had reached its final configuration and the configuration was going to hold. Polk was choosing against himself. Choosing Holdfast over the daughter he’d left on Earth, the debt forgiveness that could have reopened the custody door, the chance to see a girl who was fifteen now and might want to see him or might not and the not-knowing was the thing that made the choice impossible and the choice was being made anyway.</w:t>
+        <w:t xml:space="preserve">He didn’t speak. The setting was the speaking. Cole read it the way he read membrane percentages — the specific tension that meant the material had reached its final configuration and the configuration was going to hold. Polk was choosing against himself. Choosing Holdfast over the daughter he’d left on Earth, the debt forgiveness that could have reopened the custody door, the chance to see a girl who was fifteen now and might want to see him or might not and the uncertainty made the choice impossible. The choice was being made anyway.</w:t>
       </w:r>
     </w:p>
     <w:p>
@@ -24828,7 +24919,7 @@
         <w:pStyle w:val="BodyText"/>
       </w:pPr>
       <w:r>
-        <w:t xml:space="preserve">Underneath the calm, Cole heard the fear. Not for herself. For the system. For the architecture she’d spent three years building — the democratic process, the council, the governance that had given the colony a structure beyond survival. The architecture assumed the colonists were the colony. If children were born on Holdfast and the charter’s language didn’t cover them, then the architecture had a gap at its foundation, and the gap was the kind that widened under load.</w:t>
+        <w:t xml:space="preserve">Underneath the calm, Cole heard the fear. Not for herself. For the system. For the architecture she’d spent three years building — the democratic process, the council, the governance that had given the colony a structure beyond survival. The architecture assumed the colonists were the colony. If children were born on Holdfast and the charter’s language didn’t cover them, then the architecture had a gap at its foundation, and the gap would widen under load.</w:t>
       </w:r>
     </w:p>
     <w:p>
@@ -24933,7 +25024,7 @@
         <w:pStyle w:val="BodyText"/>
       </w:pPr>
       <w:r>
-        <w:t xml:space="preserve">Ren counted. She didn’t need to. The count was visible. But she counted because the count was the protocol and the protocol was the architecture and the architecture was what made the decision legitimate rather than accidental. Twenty-four hands. Twenty-four votes. Unanimous.</w:t>
+        <w:t xml:space="preserve">Ren counted. She didn’t need to. The count was visible. But she counted because the count was protocol, and protocol was what made the decision legitimate rather than accidental. Twenty-four hands. Twenty-four votes. Unanimous.</w:t>
       </w:r>
     </w:p>
     <w:p>
@@ -25194,11 +25285,11 @@
       <w:pPr>
         <w:pStyle w:val="BodyText"/>
       </w:pPr>
-      <w:bookmarkStart w:id="56" w:name="chapter-26-eleven-months"/>
-      <w:bookmarkEnd w:id="56"/>
-    </w:p>
-    <w:bookmarkEnd w:id="57"/>
-    <w:bookmarkStart w:id="59" w:name="chapter-26-eleven-months"/>
+      <w:bookmarkStart w:id="60" w:name="chapter-26-eleven-months"/>
+      <w:bookmarkEnd w:id="60"/>
+    </w:p>
+    <w:bookmarkEnd w:id="61"/>
+    <w:bookmarkStart w:id="63" w:name="chapter-26-eleven-months"/>
     <w:p>
       <w:pPr>
         <w:pStyle w:val="Heading1"/>
@@ -25226,7 +25317,7 @@
         <w:pStyle w:val="BodyText"/>
       </w:pPr>
       <w:r>
-        <w:t xml:space="preserve">Ren understood this the way she understood load distribution — not as a metaphor but as a physical fact. The colony’s systems were maintained. The water ran clean through the junctions she’d rebuilt. The agricultural terraces produced on Dana’s phase-three schedule. The shelters held. The creep solution circulated through the ancient channels with the reliability of infrastructure that had been designed by something patient and maintained by something desperate. Everything worked. The colony was a machine operating within tolerances, and Ren’s job was to keep it there, and the keeping was the hardest thing she’d ever done because the threat wasn’t mechanical. The threat was time.</w:t>
+        <w:t xml:space="preserve">Ren understood this the way she understood load distribution — not as a metaphor but as a physical fact. The colony’s systems were maintained. The water ran clean through the junctions she’d rebuilt. The agricultural terraces produced on Dana’s phase-three schedule. The shelters held. The creep solution circulated through the ancient channels with the reliability of infrastructure that had been designed by something patient and maintained by something desperate. Everything worked. The colony was a machine operating within tolerances, and Ren’s job was to keep it there. That should have been enough. But the threat wasn’t mechanical. The threat was time.</w:t>
       </w:r>
     </w:p>
     <w:p>
@@ -25321,15 +25412,15 @@
         <w:pStyle w:val="BodyText"/>
       </w:pPr>
       <w:r>
-        <w:t xml:space="preserve">The child was born at dawn. A girl. Healthy by every measure Haruki could apply, which were the measures of Earth medicine operating inside an alien biosphere, which meant the measures were incomplete and the incompleteness was the specific kind of uncertainty that had defined every medical assessment for five years. Healthy. Probably. The confidence interval hiding inside the word, the way it always hid.</w:t>
-      </w:r>
-    </w:p>
-    <w:p>
-      <w:pPr>
-        <w:pStyle w:val="BodyText"/>
-      </w:pPr>
-      <w:r>
-        <w:t xml:space="preserve">Ren went to see the child in the evening. The medical shelter was warm — Haruki kept it at a temperature that approximated Earth standard, burning fuel the colony rationed carefully because the fuel was finite and the cold was not. Mika held the girl against her chest. The child was small and red and her face was compressed into the specific expression of a newborn who had arrived into conditions that were, by every conceivable standard, inadequate. The child didn’t know this. The child knew warmth and contact and the sound of a heartbeat and the hum of the spiral trees filtering through the shelter walls, and the hum was the first sound she’d hear that wasn’t human, and she’d grow up thinking it was normal, and the normalcy would be the most alien thing about her.</w:t>
+        <w:t xml:space="preserve">The child was born at dawn. A girl. Healthy by every measure Haruki could apply, which were the measures of Earth medicine operating inside an alien biosphere, which meant the measures were incomplete — the same uncertainty that had defined every medical assessment for five years. Healthy. Probably. The confidence interval hiding inside the word, the way it always hid.</w:t>
+      </w:r>
+    </w:p>
+    <w:p>
+      <w:pPr>
+        <w:pStyle w:val="BodyText"/>
+      </w:pPr>
+      <w:r>
+        <w:t xml:space="preserve">Ren went to see the child in the evening. The medical shelter was warm — Haruki kept it at a temperature that approximated Earth standard, burning fuel the colony rationed carefully because the fuel was finite and the cold was not. Mika held the girl against her chest. The child was small and red and her face was compressed into the specific expression of a newborn who had arrived into conditions that were, by every conceivable standard, inadequate. The child didn’t know this. The child knew warmth and contact and the sound of a heartbeat and the hum of the spiral trees filtering through the shelter walls. That hum would be the first sound she’d hear that wasn’t human. She’d grow up thinking it was normal. A child who heard an alien planet the way other children heard traffic — that normalcy would be the most alien thing about her.</w:t>
       </w:r>
     </w:p>
     <w:p>
@@ -25768,7 +25859,7 @@
         <w:pStyle w:val="BodyText"/>
       </w:pPr>
       <w:r>
-        <w:t xml:space="preserve">Cole stood at the entrance. Ren saw his hands. They were at his sides and they were still and the stillness was the most violent thing she’d ever seen Cole’s body do — the active restraint of a man who wanted to be inside the building and was standing outside it because a woman had said twenty-three and the number had been enough to hold him in place while someone else carried the risk.</w:t>
+        <w:t xml:space="preserve">Cole stood at the entrance. Ren saw his hands. They were at his sides, held still. The most violent thing she’d ever seen Cole’s body do — the active restraint of a man who wanted to be inside the building and was standing outside it because a woman had said twenty-three and the number had been enough to hold him in place while someone else carried the risk.</w:t>
       </w:r>
     </w:p>
     <w:p>
@@ -26062,7 +26153,7 @@
         <w:pStyle w:val="BodyText"/>
       </w:pPr>
       <w:r>
-        <w:t xml:space="preserve">Ren didn’t say anything. She stood in the dirt and watched Cole hold Joss and knew that the eleven months of waiting had found their crisis, and the crisis wasn’t the tremor or the shelter or the broken bones. The crisis was a man discovering that the system he’d built to save everyone had required him to sacrifice someone, and the someone was the person the system was supposed to make the sacrifice worth it for.</w:t>
+        <w:t xml:space="preserve">Ren didn’t say anything. She stood in the dirt and watched Cole hold Joss and knew that the eleven months of waiting had found their crisis, and the crisis wasn’t the tremor or the shelter or the broken bones. The crisis was a man discovering that the system he’d built to save everyone had required him to sacrifice someone — the one person the system was supposed to make the sacrifice worth it for.</w:t>
       </w:r>
     </w:p>
     <w:p>
@@ -26213,7 +26304,7 @@
         <w:pStyle w:val="BodyText"/>
       </w:pPr>
       <w:r>
-        <w:t xml:space="preserve">Ren felt the relief and distrusted it. Relief was a structural risk. Relief was the moment you stopped checking the seal because the seal had held, and the not-checking was the gap that the next failure entered through.</w:t>
+        <w:t xml:space="preserve">Ren felt the relief and distrusted it. Relief was a structural risk. Relief was the moment you stopped checking the seal because the seal had held, and the moment you stopped checking was the gap the next failure entered through.</w:t>
       </w:r>
     </w:p>
     <w:p>
@@ -26820,7 +26911,7 @@
         <w:pStyle w:val="BodyText"/>
       </w:pPr>
       <w:r>
-        <w:t xml:space="preserve">Cole nodded. The small nod. The one that meant the number had entered the framework and the framework had accepted it and the acceptance was the closest thing to faith that Cole Maren’s architecture could produce.</w:t>
+        <w:t xml:space="preserve">Cole nodded. The small nod. The one that meant the number had entered the framework and the framework had accepted it. The closest thing to faith Cole Maren’s architecture could produce.</w:t>
       </w:r>
     </w:p>
     <w:p>
@@ -26860,7 +26951,7 @@
         <w:pStyle w:val="BodyText"/>
       </w:pPr>
       <w:r>
-        <w:t xml:space="preserve">Ren closed the hub door behind her and walked to her shelter through the settlement she’d helped build, and the walking was the same walking she’d done every night for three years, and the sameness was the thing she was fighting for, and the fighting was the walking, and the walking was enough.</w:t>
+        <w:t xml:space="preserve">Ren closed the hub door behind her and walked to her shelter through the settlement she’d helped build, the same walk she’d done every night for three years. The sameness was what she was fighting for. The fighting looked like walking. It was enough.</w:t>
       </w:r>
     </w:p>
     <w:p>
@@ -26872,11 +26963,11 @@
       <w:pPr>
         <w:pStyle w:val="BodyText"/>
       </w:pPr>
-      <w:bookmarkStart w:id="58" w:name="chapter-27-tuesday"/>
-      <w:bookmarkEnd w:id="58"/>
-    </w:p>
-    <w:bookmarkEnd w:id="59"/>
-    <w:bookmarkStart w:id="60" w:name="chapter-27-tuesday"/>
+      <w:bookmarkStart w:id="62" w:name="chapter-27-tuesday"/>
+      <w:bookmarkEnd w:id="62"/>
+    </w:p>
+    <w:bookmarkEnd w:id="63"/>
+    <w:bookmarkStart w:id="64" w:name="chapter-27-tuesday"/>
     <w:p>
       <w:pPr>
         <w:pStyle w:val="Heading1"/>
@@ -26976,7 +27067,7 @@
         <w:pStyle w:val="BodyText"/>
       </w:pPr>
       <w:r>
-        <w:t xml:space="preserve">Cole walked the perimeter. The morning count. He didn’t count shelters anymore — he’d stopped that in Year Four, when the number held at twenty-four and the holding made the counting feel different. Not unnecessary. Different. He walked the perimeter because the walking was the ritual and the ritual was the structure and the structure was what held him in the hours before the colony woke, when the planet was quiet and his mind was loud and the framework ran without input.</w:t>
+        <w:t xml:space="preserve">Cole walked the perimeter. The morning count. He didn’t count shelters anymore — he’d stopped that in Year Four, when the number held at twenty-four and the holding made the counting feel different. Not unnecessary. Different. He walked the perimeter because the walking had become ritual, had become structure — the thing that held him in the hours before the colony woke, when the planet was quiet and his mind was loud and the framework ran without input.</w:t>
       </w:r>
     </w:p>
     <w:p>
@@ -27044,7 +27135,7 @@
         <w:pStyle w:val="BodyText"/>
       </w:pPr>
       <w:r>
-        <w:t xml:space="preserve">The trees hummed. The sky shifted from green-dark to green-pale. The planet turned the way it had been turning for millions of years, indifferent, the rotation carrying Holdfast from dark into light, and the light this morning was the same light as every other morning, and the sameness was the point.</w:t>
+        <w:t xml:space="preserve">The trees hummed. The sky shifted from green-dark to green-pale. The planet turned the way it had been turning for millions of years, indifferent, the rotation carrying Holdfast from dark into light, and the light this morning was the same light as every other morning. That was the point.</w:t>
       </w:r>
     </w:p>
     <w:p>
@@ -27083,7 +27174,7 @@
         <w:pStyle w:val="BodyText"/>
       </w:pPr>
       <w:r>
-        <w:t xml:space="preserve">She came around the filtration shed and stopped. Cole was sitting on the housing cover with the inspection kit open beside him, running the secondary seal check that didn’t need running because he’d already run it at 0514 and the results hadn’t changed. He was running it because his hands needed the work the way his lungs needed air, and the work was the thing that kept the framework from processing the date into something the framework wasn’t built to hold.</w:t>
+        <w:t xml:space="preserve">She came around the filtration shed and stopped. Cole was sitting on the housing cover with the inspection kit open beside him, running the secondary seal check that didn’t need running because he’d already run it at 0514 and the results hadn’t changed. He was running it because his hands needed the work the way his lungs needed air — the work kept the framework from processing the date into something it wasn’t built to hold.</w:t>
       </w:r>
     </w:p>
     <w:p>
@@ -27129,7 +27220,7 @@
         <w:pStyle w:val="BodyText"/>
       </w:pPr>
       <w:r>
-        <w:t xml:space="preserve">She said it without ceremony. The democratic architect delivering a result the way she delivered every result — factual, verified, entered into the record. She’d counted. Cole knew she’d counted because counting was the protocol and the protocol was the architecture. She’d walked the settlement before coming to him. She’d verified the number the way she verified seal integrity, by putting her attention on every junction and confirming that the junction held.</w:t>
+        <w:t xml:space="preserve">She said it without ceremony. The democratic architect delivering a result the way she delivered every result — factual, verified, entered into the record. She’d counted. Cole knew she’d counted because the count was protocol. She’d walked the settlement before coming to him. She’d verified the number the way she verified seal integrity, by putting her attention on every junction and confirming that the junction held.</w:t>
       </w:r>
     </w:p>
     <w:p>
@@ -27185,7 +27276,7 @@
         <w:pStyle w:val="BodyText"/>
       </w:pPr>
       <w:r>
-        <w:t xml:space="preserve">He felt all of it through his hands, the way he’d felt the adhesive bond on the patch, the way he’d felt every system he’d maintained for 1,826 days. Not as data. Not as inventory. As contact. His hands on the ground of a place he’d been touching for five years, and the touching was the knowing, and the knowing was not relief but recognition. He was here. He’d built this. They’d built this. The building was finished in the way that charters finished — a date on a contract, a legal threshold, a number that crossed a line. And the building was not finished in the way that building was never finished because the junction would need patching again and the membranes would need replacing and the crops would need planting and the water would need cleaning and the children would need raising.</w:t>
+        <w:t xml:space="preserve">He felt all of it through his hands, the way he’d felt the adhesive bond on the patch, the way he’d felt every system he’d maintained for 1,826 days. Not as data. Not as inventory. As contact. His hands on the ground of a place he’d been touching for five years, and the contact told him everything. Not relief. Recognition. He was here. He’d built this. They’d built this. The building was finished in the way that charters finished — a date on a contract, a legal threshold, a number that crossed a line. And the building was not finished in the way that building was never finished because the junction would need patching again and the membranes would need replacing and the crops would need planting and the water would need cleaning and the children would need raising.</w:t>
       </w:r>
     </w:p>
     <w:p>
@@ -27984,7 +28075,7 @@
         <w:pStyle w:val="BodyText"/>
       </w:pPr>
       <w:r>
-        <w:t xml:space="preserve">Polk was at the back. Always at the back. Standing with his arms crossed and his jaw set and his sunburned face carrying the particular expression Cole had learned to read as the settled configuration — the final position of a man who’d been calculating for five years and had arrived at an answer that didn’t convert into the variables he’d started with. His daughter was on Earth. Five years older. The debt forgiveness the shuttle had offered was gone with the shuttle. Polk had chosen Holdfast over the daughter and the choosing was the thing he’d live with, the specific weight that wouldn’t lift, the cost of a decision made with the jaw instead of the math.</w:t>
+        <w:t xml:space="preserve">Polk was at the back. Always at the back. Standing with his arms crossed and his jaw set and his sunburned face carrying the particular expression Cole had learned to read as the settled configuration — the final position of a man who’d been calculating for five years and had arrived at an answer that didn’t convert into the variables he’d started with. His daughter was on Earth. Five years older. The debt forgiveness the shuttle had offered was gone with the shuttle. Polk had chosen Holdfast over the daughter. He’d live with it. The specific weight that wouldn’t lift, the cost of a decision made with the jaw instead of the math.</w:t>
       </w:r>
     </w:p>
     <w:p>
@@ -28000,7 +28091,7 @@
         <w:pStyle w:val="BodyText"/>
       </w:pPr>
       <w:r>
-        <w:t xml:space="preserve">Mika’s daughter slept in a shelter nearby. Two children at Holdfast. Two people who hadn’t signed anything, hadn’t been in the waiting room, hadn’t survived the transit or the landing or the creep or the fever. Two people who existed because other people had survived long enough to make them, and the making was the thing the charter hadn’t anticipated, the variable that broke the model the way the planet’s second cycle had broken the viability data — not by being hostile but by being alive.</w:t>
+        <w:t xml:space="preserve">Mika’s daughter slept in a shelter nearby. Two children at Holdfast. Two people who hadn’t signed anything, hadn’t been in the waiting room, hadn’t survived the transit or the landing or the creep or the fever. Two people who existed because other people had survived long enough to make them. The charter hadn’t anticipated that. The variable that broke the model the way the planet’s second cycle had broken the viability data — not by being hostile but by being alive.</w:t>
       </w:r>
     </w:p>
     <w:p>
@@ -28220,7 +28311,7 @@
         <w:t xml:space="preserve"> </w:t>
       </w:r>
       <w:r>
-        <w:t xml:space="preserve">Haruki said. His voice was steady. Of course his voice was steady. Haruki’s voice had been steady through every crisis for five years — through the first autopsy and the fever and the creep death and Patricia’s breathing stopping and James’s immune system surrendering and every body Haruki had treated and every body he’d failed to save. The voice was steady because the voice was the treatment and the treatment was the man and the man was not going to stop being the man because the man was dying.</w:t>
+        <w:t xml:space="preserve">Haruki said. His voice was steady. Of course his voice was steady. Haruki’s voice had been steady through every crisis for five years — through the first autopsy and the fever and the creep death and Patricia’s breathing stopping and James’s immune system surrendering and every body Haruki had treated and every body he’d failed to save. The voice was steady because Haruki’s steadiness was the treatment. It always had been. He was not going to stop being Haruki because Haruki was dying.</w:t>
       </w:r>
     </w:p>
     <w:p>
@@ -28446,7 +28537,7 @@
         <w:t xml:space="preserve"> </w:t>
       </w:r>
       <w:r>
-        <w:t xml:space="preserve">Haruki had read those words. They’d been on the Board in the common area for three years. Haruki was measuring himself against the ghost, the way Cole had measured himself against the ghost for five years, and the measurement came out in Haruki’s favor, and the favor was the thing he wanted Cole to hear.</w:t>
+        <w:t xml:space="preserve">Haruki had read those words. They’d been on the Board in the common area for three years. Haruki was measuring himself against the ghost, the way Cole had measured himself against the ghost for five years, and the measurement came out in Haruki’s favor. That was what he wanted Cole to hear.</w:t>
       </w:r>
     </w:p>
     <w:p>
@@ -28534,7 +28625,7 @@
         <w:pStyle w:val="BodyText"/>
       </w:pPr>
       <w:r>
-        <w:t xml:space="preserve">Haruki stopped. His hand went to his chest again. The pause was longer this time. Seven seconds. Cole counted and hated counting and counted anyway because the counting was the only act the framework could perform and the framework was the only thing keeping him from the other thing, the thing beneath the framework, the thing that was not arithmetic.</w:t>
+        <w:t xml:space="preserve">Haruki stopped. His hand went to his chest again. The pause was longer this time. Seven seconds. Cole counted and hated counting and counted anyway because counting was the only act the framework could perform, and the framework was the only thing between him and the other thing. The thing beneath the numbers. The thing that was not arithmetic.</w:t>
       </w:r>
     </w:p>
     <w:p>
@@ -28550,7 +28641,7 @@
         <w:pStyle w:val="BodyText"/>
       </w:pPr>
       <w:r>
-        <w:t xml:space="preserve">The grip was steady. Of course the grip was steady. Haruki’s hands had been the steadiest thing in the colony for five years — steadier than the shelters, steadier than the junction seals, steadier than the bedrock. The hands that had treated every wound and delivered a child and held Patricia’s hand while she died and splinted Joss’s legs and forced Cole to eat and performed the first autopsy and the last examination and every act of medicine between. The hands that were the treatment because the treatment was the man.</w:t>
+        <w:t xml:space="preserve">The grip was steady. Of course the grip was steady. Haruki’s hands had been the steadiest thing in the colony for five years — steadier than the shelters, steadier than the junction seals, steadier than the bedrock. The hands that had treated every wound and delivered a child and held Patricia’s hand while she died and splinted Joss’s legs and forced Cole to eat and performed the first autopsy and the last examination and every act of medicine between. The hands that had been the colony’s one irreplaceable instrument.</w:t>
       </w:r>
     </w:p>
     <w:p>
@@ -28603,7 +28694,7 @@
         <w:pStyle w:val="BodyText"/>
       </w:pPr>
       <w:r>
-        <w:t xml:space="preserve">The number entered the framework and the framework held it the way it held every number — structurally, without choice, because the architecture existed and holding was the architecture’s purpose. Twenty-three. Below threshold. Except the threshold was already met. The clause was already invoked. The date was already past. Twenty-three didn’t change the math. The math was finished. Twenty-three changed something else — something the math had never measured, something that existed in the space between the numbers where Haruki had lived for five years, the quiet space where a doctor’s calm was the treatment and the treatment was the colony’s foundation and the foundation had just been removed.</w:t>
+        <w:t xml:space="preserve">The number entered the framework and the framework held it the way it held every number — structurally, without choice, because the architecture existed and holding was the architecture’s purpose. Twenty-three. Below threshold. Except the threshold was already met. The clause was already invoked. The date was already past. Twenty-three didn’t change the math. The math was finished. Twenty-three changed something else — something the math had never measured, something that existed in the space between the numbers where Haruki had lived for five years, the quiet space where a doctor’s calm held everything together. The calm was gone.</w:t>
       </w:r>
     </w:p>
     <w:p>
@@ -28671,7 +28762,7 @@
         <w:pStyle w:val="BodyText"/>
       </w:pPr>
       <w:r>
-        <w:t xml:space="preserve">Joss closed his eyes. The tears continued. The sound from his throat continued. Cole stood between them — the dead doctor and the living boy — and the standing was the only thing available, the framework’s last output, the body vertical while everything inside it was not.</w:t>
+        <w:t xml:space="preserve">Joss closed his eyes. The tears continued. The sound from his throat continued. Cole stood between them — the dead doctor and the living boy. Standing was all that was left. The framework’s last output. The body vertical while everything inside it was not.</w:t>
       </w:r>
     </w:p>
     <w:p>
@@ -28818,7 +28909,7 @@
         <w:pStyle w:val="BodyText"/>
       </w:pPr>
       <w:r>
-        <w:t xml:space="preserve">The thought arrived and Cole received it and the receiving was the thing the framework couldn’t do. The framework held numbers. The framework held junction percentages and membrane assessments and attrition models and the count. The thought was not a number. The thought was the specific, unbearable recognition that the system he’d built — the same system that had kept twenty-four people alive, that had invoked the clause, that had turned survival into ownership — had required him to choose between the math and the boy. And he’d chosen the math. And the math was right. And the boy was dead.</w:t>
+        <w:t xml:space="preserve">The thought arrived and Cole received it. The framework couldn’t. Receiving wasn’t in the architecture. The framework held numbers. The framework held junction percentages and membrane assessments and attrition models and the count. The thought was not a number. The thought was the specific, unbearable recognition that the system he’d built — the same system that had kept twenty-four people alive, that had invoked the clause, that had turned survival into ownership — had required him to choose between the math and the boy. And he’d chosen the math. And the math was right. And the boy was dead.</w:t>
       </w:r>
     </w:p>
     <w:p>
@@ -28897,7 +28988,7 @@
         <w:pStyle w:val="BodyText"/>
       </w:pPr>
       <w:r>
-        <w:t xml:space="preserve">Ren said words. Not a speech — Ren didn’t give speeches, the same way Cole didn’t. She said Haruki’s name and Joss’s name and the names sat in the air the way names sat when they belonged to people who were gone and the saying was the only way to keep the belonging from dissolving.</w:t>
+        <w:t xml:space="preserve">Ren said words. Not a speech — Ren didn’t give speeches, the same way Cole didn’t. She said Haruki’s name and Joss’s name and the names sat in the air the way names sat when they belonged to people who were gone. The saying was all that kept the belonging from dissolving.</w:t>
       </w:r>
     </w:p>
     <w:p>
@@ -28929,7 +29020,7 @@
         <w:pStyle w:val="BodyText"/>
       </w:pPr>
       <w:r>
-        <w:t xml:space="preserve">Cole drank it. He sat on the Bench with the cup in his hands and the fire’s warmth on his face and the colony around him — the twenty-two people who’d survived the math and the planet and the corporation and the clause and the five years and the specific, relentless accumulation of days that turned desperate strangers into the population of a place called Holdfast. He drank the fermented fruit and tasted ashes and tasted something underneath the ashes that he didn’t have a name for because the conditions that produced it didn’t exist in contexts where names got made.</w:t>
+        <w:t xml:space="preserve">Cole drank it. He sat on the Bench with the cup in his hands and the fire’s warmth on his face and the colony around him — the twenty-two people who’d survived the math, the planet, the corporation, the clause, the five years — the specific, relentless accumulation of days that turned desperate strangers into the population of a place called Holdfast. He drank the fermented fruit and tasted ashes and tasted something underneath the ashes that he didn’t have a name for because the conditions that produced it didn’t exist in contexts where names got made.</w:t>
       </w:r>
     </w:p>
     <w:p>
@@ -28980,7 +29071,7 @@
         <w:t xml:space="preserve">That was something.</w:t>
       </w:r>
     </w:p>
-    <w:bookmarkEnd w:id="60"/>
+    <w:bookmarkEnd w:id="64"/>
     <w:sectPr>
       <w:footnotePr>
         <w:numRestart w:val="eachSect"/>

</xml_diff>

<commit_message>
audit - round three build - out of tokens for the day
</commit_message>
<xml_diff>
--- a/build/the-free-colony.docx
+++ b/build/the-free-colony.docx
@@ -13940,7 +13940,7 @@
         <w:pStyle w:val="BodyText"/>
       </w:pPr>
       <w:r>
-        <w:t xml:space="preserve">He put the cloth on Joss’s forehead. Joss flinched and gripped the cot’s edge. Cole didn’t take his hand. Didn’t say anything reassuring. Sat there in the dark with a twenty-three-year-old who might die before morning and a nine-year-old who existed in a message he’d sent six months ago across a distance measured in light-years, and felt the math crack.</w:t>
+        <w:t xml:space="preserve">He put the cloth on Joss’s forehead. Joss flinched and gripped the cot’s edge. Cole didn’t take his hand. Didn’t say anything reassuring. Sat there in the dark with a twenty-three-year-old who might die before morning and a ten-year-old who existed in a message he’d sent eleven months ago across a distance measured in light-years, and felt the math crack.</w:t>
       </w:r>
     </w:p>
     <w:p>
@@ -13956,7 +13956,7 @@
         <w:pStyle w:val="BodyText"/>
       </w:pPr>
       <w:r>
-        <w:t xml:space="preserve">He wasn’t counting to twenty-four because twenty-four was the number that triggered the clause. He was counting because every number was a face and every face was a person who was alive because the systems held and the compound worked and Haruki’s hands were steady and Dana’s plants grew in the right soil at the right time. Every number was someone who breathed and ate and argued and slept and woke up and did it again, not because a contract told them to but because they were still here and being here was the thing. The only thing.</w:t>
+        <w:t xml:space="preserve">He wasn’t counting to twenty-four because twenty-four was the number that triggered the clause. He was counting because every number was a face, every face a person who was alive because the systems held, the compound worked, Haruki’s hands were steady, and Dana’s plants grew in the right soil at the right time. Every number was someone who breathed and ate and argued and slept and woke up and did it again, not because a contract told them to but because they were still here and being here was the thing. The only thing.</w:t>
       </w:r>
     </w:p>
     <w:p>
@@ -20158,7 +20158,7 @@
         <w:pStyle w:val="BodyText"/>
       </w:pPr>
       <w:r>
-        <w:t xml:space="preserve">Cole had asked for thirty. Ren gave him thirty. He’d used every hour — not building alliances, not politicking, not the social architecture that came naturally to people who thought in relationships instead of systems. He’d built support structures. Redundancies. Quiet conversations with the colonists he judged most stable: Kira, whose opposition during the relocation vote had been principled and whose principles included hearing people out. James, whose compound fracture had healed into a limp that slowed his body but not his judgment. Two others who carried weight in the colony’s informal hierarchy — the hierarchy that existed underneath Ren’s democratic architecture the way bedrock existed underneath soil, unseen and load-bearing.</w:t>
+        <w:t xml:space="preserve">Cole had asked for thirty. Ren gave him thirty. He’d used every hour — not building alliances, not politicking, not the social architecture that came naturally to people who thought in relationships instead of systems. He’d built support structures. Redundancies. Quiet conversations with the colonists he judged most stable: Kira, whose opposition during the relocation vote had been principled and whose principles included hearing people out. Dara, whose fever had left a stiffness in her joints that slowed her mornings but not her judgment. Two others who carried weight in the colony’s informal hierarchy — the hierarchy that existed underneath Ren’s democratic architecture the way bedrock existed underneath soil, unseen and load-bearing.</w:t>
       </w:r>
     </w:p>
     <w:p>
@@ -20479,7 +20479,7 @@
         <w:t xml:space="preserve"> </w:t>
       </w:r>
       <w:r>
-        <w:t xml:space="preserve">James, leaning forward on his bad leg:</w:t>
+        <w:t xml:space="preserve">Dara, rubbing the stiffness from her wrist:</w:t>
       </w:r>
       <w:r>
         <w:t xml:space="preserve"> </w:t>
@@ -20752,7 +20752,7 @@
         <w:pStyle w:val="BodyText"/>
       </w:pPr>
       <w:r>
-        <w:t xml:space="preserve">The discussion ran for two hours. Voices rose and fell. Arguments circled: the betrayal, the debt, the creep solution, the count, the principle, the precedent. Kira argued for expulsion with the clarity of a woman whose convictions were load-bearing. James argued for a middle path — restricted access, supervised work, trust rebuilt through demonstrated loyalty. Joss Carver, twenty-five now and carrying himself with a stillness he hadn’t had at twenty-two, said,</w:t>
+        <w:t xml:space="preserve">The discussion ran for two hours. Voices rose and fell. Arguments circled: the betrayal, the debt, the creep solution, the count, the principle, the precedent. Kira argued for expulsion with the clarity of a woman whose convictions were load-bearing. Dara argued for a middle path — restricted access, supervised work, trust rebuilt through demonstrated loyalty. Joss Carver, twenty-five now and carrying himself with a stillness he hadn’t had at twenty-two, said,</w:t>
       </w:r>
       <w:r>
         <w:t xml:space="preserve"> </w:t>
@@ -21125,7 +21125,7 @@
         <w:pStyle w:val="FirstParagraph"/>
       </w:pPr>
       <w:r>
-        <w:t xml:space="preserve">Month 37. A cough.</w:t>
+        <w:t xml:space="preserve">Month 35. A cough.</w:t>
       </w:r>
     </w:p>
     <w:p>
@@ -23456,7 +23456,7 @@
         <w:t xml:space="preserve"> </w:t>
       </w:r>
       <w:r>
-        <w:t xml:space="preserve">Two words. The same two words from Article 5, lifted from the contract and set down in the forest air between them. Cole heard what the words carried when Polk said them — not the legal provision, not the financial instrument. A girl. Fifteen now, maybe sixteen. Old enough to understand why her father had left. Old enough to have decided whether to forgive him for it. Polk’s debt wasn’t sixty thousand credits. Polk’s debt was measured in the years he’d missed and the years he couldn’t get back and the possibility — the specific, fragile, contingent possibility — that debt erasure meant creditors stopped calling, which meant stability, which meant a court might reconsider, which meant a door might open that had been closed since before the charter.</w:t>
+        <w:t xml:space="preserve">Two words. The same two words from Article 5, lifted from the contract and set down in the forest air between them. Cole heard what the words carried when Polk said them — not the legal provision, not the financial instrument. A girl. Sixteen now, maybe seventeen. Old enough to understand why her father had left. Old enough to have decided whether to forgive him for it. Polk’s debt wasn’t sixty thousand credits. Polk’s debt was measured in the years he’d missed and the years he couldn’t get back and the possibility — the specific, fragile, contingent possibility — that debt erasure meant creditors stopped calling, which meant stability, which meant a court might reconsider, which meant a door might open that had been closed since before the charter.</w:t>
       </w:r>
     </w:p>
     <w:p>
@@ -24544,7 +24544,7 @@
         <w:pStyle w:val="BodyText"/>
       </w:pPr>
       <w:r>
-        <w:t xml:space="preserve">Daughter on Earth. Settlement on Parcel 16b. Debt erased vs. land owned. The possibility of a door reopening — custody, contact, the chance to be something other than the man who’d left — vs. the certainty of a place he’d built with people who’d watched him nearly destroy them and had voted to keep him anyway. Polk’s math didn’t have clean variables. Polk’s math had a fifteen-year-old girl whose face he hadn’t seen in five years inside one column and a colony named Holdfast inside the other, and the columns didn’t convert.</w:t>
+        <w:t xml:space="preserve">Daughter on Earth. Settlement on Parcel 16b. Debt erased vs. land owned. The possibility of a door reopening — custody, contact, the chance to be something other than the man who’d left — vs. the certainty of a place he’d built with people who’d watched him nearly destroy them and had voted to keep him anyway. Polk’s math didn’t have clean variables. Polk’s math had a sixteen-year-old girl whose face he hadn’t seen in five years inside one column and a colony named Holdfast inside the other, and the columns didn’t convert.</w:t>
       </w:r>
     </w:p>
     <w:p>
@@ -24592,7 +24592,7 @@
         <w:pStyle w:val="BodyText"/>
       </w:pPr>
       <w:r>
-        <w:t xml:space="preserve">He didn’t speak. The setting was the speaking. Cole read it the way he read membrane percentages — the specific tension that meant the material had reached its final configuration and the configuration was going to hold. Polk was choosing against himself. Choosing Holdfast over the daughter he’d left on Earth, the debt forgiveness that could have reopened the custody door, the chance to see a girl who was fifteen now and might want to see him or might not and the uncertainty made the choice impossible. The choice was being made anyway.</w:t>
+        <w:t xml:space="preserve">He didn’t speak. The setting was the speaking. Cole read it the way he read membrane percentages — the specific tension that meant the material had reached its final configuration and the configuration was going to hold. Polk was choosing against himself. Choosing Holdfast over the daughter he’d left on Earth, the debt forgiveness that could have reopened the custody door, the chance to see a girl who was sixteen now and might want to see him or might not and the uncertainty made the choice impossible. The choice was being made anyway.</w:t>
       </w:r>
     </w:p>
     <w:p>
@@ -26085,7 +26085,7 @@
         <w:pStyle w:val="BodyText"/>
       </w:pPr>
       <w:r>
-        <w:t xml:space="preserve">Haruki arrived in four minutes. He knelt beside Joss with the measured calm that was his constitution and his treatment and his gift, and his hands moved over Joss’s legs with the diagnostic attention that found fractures and assessed damage and communicated through touch that the body being examined was in the care of someone who knew what care meant. Compound fracture, left tibia. Simple fracture, right fibula. Possible internal bleeding — the rack’s weight on the abdomen for six minutes, the compression that might have ruptured something Haruki couldn’t see without equipment he didn’t have.</w:t>
+        <w:t xml:space="preserve">Haruki arrived in four minutes. He knelt beside Joss with the measured calm that was his constitution and his treatment and his gift, and his hands moved over Joss’s legs with the diagnostic attention that found fractures and assessed damage and communicated through touch that the body being examined was in the care of someone who knew what care meant. Compound fracture, left tibia. Simple fracture, right fibula. Three cracked ribs, at least. Possible internal bleeding — the rack’s weight on the abdomen for six minutes, the compression that might have ruptured something Haruki couldn’t see without equipment he didn’t have.</w:t>
       </w:r>
     </w:p>
     <w:p>

</xml_diff>